<commit_message>
Add stack trace to error messages.
</commit_message>
<xml_diff>
--- a/Documentation/DeveloperInformation.docx
+++ b/Documentation/DeveloperInformation.docx
@@ -1,6 +1,6 @@
 
 <file path=word/document.xml><?xml version="1.0" encoding="utf-8"?>
-<w:document xmlns:ve="http://schemas.openxmlformats.org/markup-compatibility/2006" xmlns:o="urn:schemas-microsoft-com:office:office" xmlns:r="http://schemas.openxmlformats.org/officeDocument/2006/relationships" xmlns:m="http://schemas.openxmlformats.org/officeDocument/2006/math" xmlns:v="urn:schemas-microsoft-com:vml" xmlns:wp="http://schemas.openxmlformats.org/drawingml/2006/wordprocessingDrawing" xmlns:w10="urn:schemas-microsoft-com:office:word" xmlns:w="http://schemas.openxmlformats.org/wordprocessingml/2006/main" xmlns:wne="http://schemas.microsoft.com/office/word/2006/wordml">
+<w:document xmlns:wpc="http://schemas.microsoft.com/office/word/2010/wordprocessingCanvas" xmlns:cx="http://schemas.microsoft.com/office/drawing/2014/chartex" xmlns:cx1="http://schemas.microsoft.com/office/drawing/2015/9/8/chartex" xmlns:cx2="http://schemas.microsoft.com/office/drawing/2015/10/21/chartex" xmlns:cx3="http://schemas.microsoft.com/office/drawing/2016/5/9/chartex" xmlns:cx4="http://schemas.microsoft.com/office/drawing/2016/5/10/chartex" xmlns:cx5="http://schemas.microsoft.com/office/drawing/2016/5/11/chartex" xmlns:cx6="http://schemas.microsoft.com/office/drawing/2016/5/12/chartex" xmlns:cx7="http://schemas.microsoft.com/office/drawing/2016/5/13/chartex" xmlns:cx8="http://schemas.microsoft.com/office/drawing/2016/5/14/chartex" xmlns:mc="http://schemas.openxmlformats.org/markup-compatibility/2006" xmlns:aink="http://schemas.microsoft.com/office/drawing/2016/ink" xmlns:am3d="http://schemas.microsoft.com/office/drawing/2017/model3d" xmlns:o="urn:schemas-microsoft-com:office:office" xmlns:oel="http://schemas.microsoft.com/office/2019/extlst" xmlns:r="http://schemas.openxmlformats.org/officeDocument/2006/relationships" xmlns:m="http://schemas.openxmlformats.org/officeDocument/2006/math" xmlns:v="urn:schemas-microsoft-com:vml" xmlns:wp14="http://schemas.microsoft.com/office/word/2010/wordprocessingDrawing" xmlns:wp="http://schemas.openxmlformats.org/drawingml/2006/wordprocessingDrawing" xmlns:w10="urn:schemas-microsoft-com:office:word" xmlns:w="http://schemas.openxmlformats.org/wordprocessingml/2006/main" xmlns:w14="http://schemas.microsoft.com/office/word/2010/wordml" xmlns:w15="http://schemas.microsoft.com/office/word/2012/wordml" xmlns:w16cex="http://schemas.microsoft.com/office/word/2018/wordml/cex" xmlns:w16cid="http://schemas.microsoft.com/office/word/2016/wordml/cid" xmlns:w16="http://schemas.microsoft.com/office/word/2018/wordml" xmlns:w16du="http://schemas.microsoft.com/office/word/2023/wordml/word16du" xmlns:w16sdtdh="http://schemas.microsoft.com/office/word/2020/wordml/sdtdatahash" xmlns:w16sdtfl="http://schemas.microsoft.com/office/word/2024/wordml/sdtformatlock" xmlns:w16se="http://schemas.microsoft.com/office/word/2015/wordml/symex" xmlns:wpg="http://schemas.microsoft.com/office/word/2010/wordprocessingGroup" xmlns:wpi="http://schemas.microsoft.com/office/word/2010/wordprocessingInk" xmlns:wne="http://schemas.microsoft.com/office/word/2006/wordml" xmlns:wps="http://schemas.microsoft.com/office/word/2010/wordprocessingShape" mc:Ignorable="w14 w15 w16se w16cid w16 w16cex w16sdtdh w16sdtfl w16du wp14">
   <w:body>
     <w:p>
       <w:pPr>
@@ -47,7 +47,7 @@
         <w:rPr>
           <w:noProof/>
         </w:rPr>
-        <w:t>August 16, 2026</w:t>
+        <w:t>August 24, 2026</w:t>
       </w:r>
       <w:r>
         <w:rPr>
@@ -4094,7 +4094,15 @@
         <w:pStyle w:val="Body-Text"/>
       </w:pPr>
       <w:r>
-        <w:t>Each step calculates the next intermediate value until the last line where the final result is determined. The steps are calculated in order from the first to the last. The a step may use values from previous steps or get values from other forms.</w:t>
+        <w:t xml:space="preserve">Each step calculates the next intermediate value until the last line where the final result is determined. The steps are calculated in order from the first to the last. </w:t>
+      </w:r>
+      <w:proofErr w:type="gramStart"/>
+      <w:r>
+        <w:t>The a</w:t>
+      </w:r>
+      <w:proofErr w:type="gramEnd"/>
+      <w:r>
+        <w:t xml:space="preserve"> step may use values from previous steps or get values from other forms.</w:t>
       </w:r>
     </w:p>
     <w:p>
@@ -4370,10 +4378,12 @@
       <w:pPr>
         <w:pStyle w:val="Heading4"/>
       </w:pPr>
+      <w:proofErr w:type="spellStart"/>
       <w:r>
         <w:lastRenderedPageBreak/>
         <w:t>isSingleton</w:t>
       </w:r>
+      <w:proofErr w:type="spellEnd"/>
       <w:r>
         <w:t xml:space="preserve"> </w:t>
       </w:r>
@@ -4392,15 +4402,34 @@
         <w:rPr>
           <w:lang w:eastAsia="ar-SA"/>
         </w:rPr>
-        <w:t>The isSingleton flag is just used for error checking to prevent multiple instances of some forms from being created.</w:t>
+        <w:t xml:space="preserve">The </w:t>
+      </w:r>
+      <w:proofErr w:type="spellStart"/>
+      <w:r>
+        <w:rPr>
+          <w:lang w:eastAsia="ar-SA"/>
+        </w:rPr>
+        <w:t>isSingleton</w:t>
+      </w:r>
+      <w:proofErr w:type="spellEnd"/>
+      <w:r>
+        <w:rPr>
+          <w:lang w:eastAsia="ar-SA"/>
+        </w:rPr>
+        <w:t xml:space="preserve"> flag is just used for error checking to prevent multiple instances of some forms from being created.</w:t>
       </w:r>
     </w:p>
     <w:p>
       <w:pPr>
         <w:pStyle w:val="Heading4"/>
       </w:pPr>
-      <w:r>
-        <w:t>add() Method</w:t>
+      <w:proofErr w:type="gramStart"/>
+      <w:r>
+        <w:t>add(</w:t>
+      </w:r>
+      <w:proofErr w:type="gramEnd"/>
+      <w:r>
+        <w:t>) Method</w:t>
       </w:r>
     </w:p>
     <w:p>
@@ -4421,8 +4450,18 @@
       <w:pPr>
         <w:pStyle w:val="Heading4"/>
       </w:pPr>
-      <w:r>
-        <w:t>isUsed() Method</w:t>
+      <w:proofErr w:type="spellStart"/>
+      <w:proofErr w:type="gramStart"/>
+      <w:r>
+        <w:t>isUsed</w:t>
+      </w:r>
+      <w:proofErr w:type="spellEnd"/>
+      <w:r>
+        <w:t>(</w:t>
+      </w:r>
+      <w:proofErr w:type="gramEnd"/>
+      <w:r>
+        <w:t>) Method</w:t>
       </w:r>
     </w:p>
     <w:p>
@@ -4443,8 +4482,13 @@
       <w:pPr>
         <w:pStyle w:val="Heading4"/>
       </w:pPr>
-      <w:r>
-        <w:t>line() Method</w:t>
+      <w:proofErr w:type="gramStart"/>
+      <w:r>
+        <w:t>line(</w:t>
+      </w:r>
+      <w:proofErr w:type="gramEnd"/>
+      <w:r>
+        <w:t>) Method</w:t>
       </w:r>
     </w:p>
     <w:p>
@@ -4465,8 +4509,13 @@
       <w:pPr>
         <w:pStyle w:val="Heading4"/>
       </w:pPr>
-      <w:r>
-        <w:t>min() Method</w:t>
+      <w:proofErr w:type="gramStart"/>
+      <w:r>
+        <w:t>min(</w:t>
+      </w:r>
+      <w:proofErr w:type="gramEnd"/>
+      <w:r>
+        <w:t>) Method</w:t>
       </w:r>
     </w:p>
     <w:p>
@@ -4482,11 +4531,19 @@
         </w:rPr>
         <w:t xml:space="preserve">This method gets the values of the specified lines from the current tax form and passes the values to the </w:t>
       </w:r>
+      <w:proofErr w:type="gramStart"/>
       <w:r>
         <w:rPr>
           <w:rStyle w:val="SourceCodechar"/>
         </w:rPr>
-        <w:t>Math.min()</w:t>
+        <w:t>Math.min(</w:t>
+      </w:r>
+      <w:proofErr w:type="gramEnd"/>
+      <w:r>
+        <w:rPr>
+          <w:rStyle w:val="SourceCodechar"/>
+        </w:rPr>
+        <w:t>)</w:t>
       </w:r>
       <w:r>
         <w:rPr>
@@ -4499,8 +4556,13 @@
       <w:pPr>
         <w:pStyle w:val="Heading4"/>
       </w:pPr>
-      <w:r>
-        <w:t>max()Method</w:t>
+      <w:proofErr w:type="gramStart"/>
+      <w:r>
+        <w:t>max(</w:t>
+      </w:r>
+      <w:proofErr w:type="gramEnd"/>
+      <w:r>
+        <w:t>)Method</w:t>
       </w:r>
     </w:p>
     <w:p>
@@ -4516,6 +4578,7 @@
         </w:rPr>
         <w:t xml:space="preserve">This method gets the values of the specified lines from the current tax form and passes the values to the </w:t>
       </w:r>
+      <w:proofErr w:type="gramStart"/>
       <w:r>
         <w:rPr>
           <w:rStyle w:val="SourceCodechar"/>
@@ -4532,6 +4595,66 @@
         <w:rPr>
           <w:rStyle w:val="SourceCodechar"/>
         </w:rPr>
+        <w:t>(</w:t>
+      </w:r>
+      <w:proofErr w:type="gramEnd"/>
+      <w:r>
+        <w:rPr>
+          <w:rStyle w:val="SourceCodechar"/>
+        </w:rPr>
+        <w:t>)</w:t>
+      </w:r>
+      <w:r>
+        <w:rPr>
+          <w:lang w:eastAsia="ar-SA"/>
+        </w:rPr>
+        <w:t xml:space="preserve"> function, and returns the result.</w:t>
+      </w:r>
+    </w:p>
+    <w:p>
+      <w:pPr>
+        <w:pStyle w:val="Heading4"/>
+      </w:pPr>
+      <w:proofErr w:type="gramStart"/>
+      <w:r>
+        <w:t>round(</w:t>
+      </w:r>
+      <w:proofErr w:type="gramEnd"/>
+      <w:r>
+        <w:t>) Method</w:t>
+      </w:r>
+    </w:p>
+    <w:p>
+      <w:pPr>
+        <w:pStyle w:val="Body-Text"/>
+        <w:rPr>
+          <w:lang w:eastAsia="ar-SA"/>
+        </w:rPr>
+      </w:pPr>
+      <w:r>
+        <w:rPr>
+          <w:lang w:eastAsia="ar-SA"/>
+        </w:rPr>
+        <w:t xml:space="preserve">This method gets the value of the specified line from the current tax form and passes it to the </w:t>
+      </w:r>
+      <w:proofErr w:type="spellStart"/>
+      <w:r>
+        <w:rPr>
+          <w:rStyle w:val="SourceCodechar"/>
+        </w:rPr>
+        <w:t>Math.</w:t>
+      </w:r>
+      <w:r>
+        <w:rPr>
+          <w:rStyle w:val="SourceCodechar"/>
+        </w:rPr>
+        <w:t>round</w:t>
+      </w:r>
+      <w:proofErr w:type="spellEnd"/>
+      <w:r>
+        <w:rPr>
+          <w:rStyle w:val="SourceCodechar"/>
+        </w:rPr>
         <w:t>()</w:t>
       </w:r>
       <w:r>
@@ -4545,54 +4668,13 @@
       <w:pPr>
         <w:pStyle w:val="Heading4"/>
       </w:pPr>
-      <w:r>
-        <w:t>round() Method</w:t>
-      </w:r>
-    </w:p>
-    <w:p>
-      <w:pPr>
-        <w:pStyle w:val="Body-Text"/>
-        <w:rPr>
-          <w:lang w:eastAsia="ar-SA"/>
-        </w:rPr>
-      </w:pPr>
-      <w:r>
-        <w:rPr>
-          <w:lang w:eastAsia="ar-SA"/>
-        </w:rPr>
-        <w:t xml:space="preserve">This method gets the value of the specified line from the current tax form and passes it to the </w:t>
-      </w:r>
-      <w:r>
-        <w:rPr>
-          <w:rStyle w:val="SourceCodechar"/>
-        </w:rPr>
-        <w:t>Math.</w:t>
-      </w:r>
-      <w:r>
-        <w:rPr>
-          <w:rStyle w:val="SourceCodechar"/>
-        </w:rPr>
-        <w:t>round</w:t>
-      </w:r>
-      <w:r>
-        <w:rPr>
-          <w:rStyle w:val="SourceCodechar"/>
-        </w:rPr>
-        <w:t>()</w:t>
-      </w:r>
-      <w:r>
-        <w:rPr>
-          <w:lang w:eastAsia="ar-SA"/>
-        </w:rPr>
-        <w:t xml:space="preserve"> function, and returns the result.</w:t>
-      </w:r>
-    </w:p>
-    <w:p>
-      <w:pPr>
-        <w:pStyle w:val="Heading4"/>
-      </w:pPr>
-      <w:r>
-        <w:t>subtract() Method</w:t>
+      <w:proofErr w:type="gramStart"/>
+      <w:r>
+        <w:t>subtract(</w:t>
+      </w:r>
+      <w:proofErr w:type="gramEnd"/>
+      <w:r>
+        <w:t>) Method</w:t>
       </w:r>
     </w:p>
     <w:p>
@@ -4646,8 +4728,16 @@
         <w:rPr>
           <w:rStyle w:val="SourceCodechar"/>
         </w:rPr>
-        <w:t>Library/TaxForms</w:t>
-      </w:r>
+        <w:t>Library/</w:t>
+      </w:r>
+      <w:proofErr w:type="spellStart"/>
+      <w:r>
+        <w:rPr>
+          <w:rStyle w:val="SourceCodechar"/>
+        </w:rPr>
+        <w:t>TaxForms</w:t>
+      </w:r>
+      <w:proofErr w:type="spellEnd"/>
       <w:r>
         <w:t xml:space="preserve">, so for example, the implementation of the class for the 1040 tax form would be in </w:t>
       </w:r>
@@ -4655,7 +4745,21 @@
         <w:rPr>
           <w:rStyle w:val="SourceCodechar"/>
         </w:rPr>
-        <w:t>Library/TaxForms/F1040.js</w:t>
+        <w:t>Library/</w:t>
+      </w:r>
+      <w:proofErr w:type="spellStart"/>
+      <w:r>
+        <w:rPr>
+          <w:rStyle w:val="SourceCodechar"/>
+        </w:rPr>
+        <w:t>TaxForms</w:t>
+      </w:r>
+      <w:proofErr w:type="spellEnd"/>
+      <w:r>
+        <w:rPr>
+          <w:rStyle w:val="SourceCodechar"/>
+        </w:rPr>
+        <w:t>/F1040.js</w:t>
       </w:r>
       <w:r>
         <w:t>.</w:t>
@@ -4666,15 +4770,28 @@
         <w:pStyle w:val="Body-Text"/>
       </w:pPr>
       <w:r>
-        <w:t>As mentioned above, each tax for is implemented as a subclass for the Form class. The Form class defined the attributes and several common methods, but there are several methods that are unuque to each tax form and need to be implemented for each tax form.</w:t>
+        <w:t xml:space="preserve">As mentioned above, each tax for is implemented as a subclass for the Form class. The Form class defined the attributes and several common methods, but there are several methods that are </w:t>
+      </w:r>
+      <w:proofErr w:type="spellStart"/>
+      <w:r>
+        <w:t>unuque</w:t>
+      </w:r>
+      <w:proofErr w:type="spellEnd"/>
+      <w:r>
+        <w:t xml:space="preserve"> to each tax form and need to be implemented for each tax form.</w:t>
       </w:r>
     </w:p>
     <w:p>
       <w:pPr>
         <w:pStyle w:val="Heading4"/>
       </w:pPr>
-      <w:r>
-        <w:t>constructor() Method</w:t>
+      <w:proofErr w:type="gramStart"/>
+      <w:r>
+        <w:t>constructor(</w:t>
+      </w:r>
+      <w:proofErr w:type="gramEnd"/>
+      <w:r>
+        <w:t>) Method</w:t>
       </w:r>
     </w:p>
     <w:p>
@@ -4690,11 +4807,27 @@
         </w:rPr>
         <w:t xml:space="preserve">The Form parent class defined an empty object of for the lines of the tax form. The constructor for each tax forms needs to provide the prototype for each line in the tax form and add a description for each line. The description is used by the </w:t>
       </w:r>
+      <w:proofErr w:type="spellStart"/>
+      <w:proofErr w:type="gramStart"/>
       <w:r>
         <w:rPr>
           <w:rStyle w:val="SourceCodechar"/>
         </w:rPr>
-        <w:t>toString()</w:t>
+        <w:t>toString</w:t>
+      </w:r>
+      <w:proofErr w:type="spellEnd"/>
+      <w:r>
+        <w:rPr>
+          <w:rStyle w:val="SourceCodechar"/>
+        </w:rPr>
+        <w:t>(</w:t>
+      </w:r>
+      <w:proofErr w:type="gramEnd"/>
+      <w:r>
+        <w:rPr>
+          <w:rStyle w:val="SourceCodechar"/>
+        </w:rPr>
+        <w:t>)</w:t>
       </w:r>
       <w:r>
         <w:rPr>
@@ -4707,9 +4840,14 @@
       <w:pPr>
         <w:pStyle w:val="Heading4"/>
       </w:pPr>
+      <w:proofErr w:type="gramStart"/>
       <w:r>
         <w:lastRenderedPageBreak/>
-        <w:t>calculate() Method</w:t>
+        <w:t>calculate(</w:t>
+      </w:r>
+      <w:proofErr w:type="gramEnd"/>
+      <w:r>
+        <w:t>) Method</w:t>
       </w:r>
     </w:p>
     <w:p>
@@ -4730,22 +4868,131 @@
       <w:pPr>
         <w:pStyle w:val="Heading4"/>
       </w:pPr>
-      <w:r>
-        <w:t>getInputHTML() and getOutputHTML() Methods</w:t>
-      </w:r>
-    </w:p>
-    <w:p>
-      <w:pPr>
-        <w:pStyle w:val="Body-Text"/>
-        <w:rPr>
-          <w:lang w:eastAsia="ar-SA"/>
-        </w:rPr>
-      </w:pPr>
-      <w:r>
-        <w:rPr>
-          <w:lang w:eastAsia="ar-SA"/>
-        </w:rPr>
-        <w:t>Currently, TaxProgram is the only tax  tool that uses tax forms for its input and output interfaces. However, since it uses them, HTML code has been developed to display  the tax forms on web pages for each of the tax forms that are supported. The HTML code is stored in a variable named HTML_FORM in the class for each tax form. The methods getInputHTML() and getOutputHTML() are used to return a string containing this code.</w:t>
+      <w:proofErr w:type="spellStart"/>
+      <w:proofErr w:type="gramStart"/>
+      <w:r>
+        <w:t>getInputHTML</w:t>
+      </w:r>
+      <w:proofErr w:type="spellEnd"/>
+      <w:r>
+        <w:t>(</w:t>
+      </w:r>
+      <w:proofErr w:type="gramEnd"/>
+      <w:r>
+        <w:t xml:space="preserve">) and </w:t>
+      </w:r>
+      <w:proofErr w:type="spellStart"/>
+      <w:proofErr w:type="gramStart"/>
+      <w:r>
+        <w:t>getOutputHTML</w:t>
+      </w:r>
+      <w:proofErr w:type="spellEnd"/>
+      <w:r>
+        <w:t>(</w:t>
+      </w:r>
+      <w:proofErr w:type="gramEnd"/>
+      <w:r>
+        <w:t>) Methods</w:t>
+      </w:r>
+    </w:p>
+    <w:p>
+      <w:pPr>
+        <w:pStyle w:val="Body-Text"/>
+        <w:rPr>
+          <w:lang w:eastAsia="ar-SA"/>
+        </w:rPr>
+      </w:pPr>
+      <w:r>
+        <w:rPr>
+          <w:lang w:eastAsia="ar-SA"/>
+        </w:rPr>
+        <w:t xml:space="preserve">Currently, </w:t>
+      </w:r>
+      <w:proofErr w:type="spellStart"/>
+      <w:r>
+        <w:rPr>
+          <w:lang w:eastAsia="ar-SA"/>
+        </w:rPr>
+        <w:t>TaxProgram</w:t>
+      </w:r>
+      <w:proofErr w:type="spellEnd"/>
+      <w:r>
+        <w:rPr>
+          <w:lang w:eastAsia="ar-SA"/>
+        </w:rPr>
+        <w:t xml:space="preserve"> is the only </w:t>
+      </w:r>
+      <w:proofErr w:type="gramStart"/>
+      <w:r>
+        <w:rPr>
+          <w:lang w:eastAsia="ar-SA"/>
+        </w:rPr>
+        <w:t>tax  tool</w:t>
+      </w:r>
+      <w:proofErr w:type="gramEnd"/>
+      <w:r>
+        <w:rPr>
+          <w:lang w:eastAsia="ar-SA"/>
+        </w:rPr>
+        <w:t xml:space="preserve"> that uses tax forms for its input and output interfaces. However, since it uses them, HTML code has been developed to </w:t>
+      </w:r>
+      <w:proofErr w:type="gramStart"/>
+      <w:r>
+        <w:rPr>
+          <w:lang w:eastAsia="ar-SA"/>
+        </w:rPr>
+        <w:t>display  the</w:t>
+      </w:r>
+      <w:proofErr w:type="gramEnd"/>
+      <w:r>
+        <w:rPr>
+          <w:lang w:eastAsia="ar-SA"/>
+        </w:rPr>
+        <w:t xml:space="preserve"> tax forms on web pages for each of the tax forms that are supported. The HTML code is stored in a variable named HTML_FORM in the class for each tax form. The methods </w:t>
+      </w:r>
+      <w:proofErr w:type="spellStart"/>
+      <w:proofErr w:type="gramStart"/>
+      <w:r>
+        <w:rPr>
+          <w:lang w:eastAsia="ar-SA"/>
+        </w:rPr>
+        <w:t>getInputHTML</w:t>
+      </w:r>
+      <w:proofErr w:type="spellEnd"/>
+      <w:r>
+        <w:rPr>
+          <w:lang w:eastAsia="ar-SA"/>
+        </w:rPr>
+        <w:t>(</w:t>
+      </w:r>
+      <w:proofErr w:type="gramEnd"/>
+      <w:r>
+        <w:rPr>
+          <w:lang w:eastAsia="ar-SA"/>
+        </w:rPr>
+        <w:t xml:space="preserve">) and </w:t>
+      </w:r>
+      <w:proofErr w:type="spellStart"/>
+      <w:proofErr w:type="gramStart"/>
+      <w:r>
+        <w:rPr>
+          <w:lang w:eastAsia="ar-SA"/>
+        </w:rPr>
+        <w:t>getOutputHTML</w:t>
+      </w:r>
+      <w:proofErr w:type="spellEnd"/>
+      <w:r>
+        <w:rPr>
+          <w:lang w:eastAsia="ar-SA"/>
+        </w:rPr>
+        <w:t>(</w:t>
+      </w:r>
+      <w:proofErr w:type="gramEnd"/>
+      <w:r>
+        <w:rPr>
+          <w:lang w:eastAsia="ar-SA"/>
+        </w:rPr>
+        <w:t>) are used to return a string containing this code.</w:t>
       </w:r>
     </w:p>
     <w:p>
@@ -4801,7 +5048,65 @@
         <w:rPr>
           <w:lang w:eastAsia="ar-SA"/>
         </w:rPr>
-        <w:t>The method getInputHTML() is a static method because when the input page is created there is not instance of the form yet. Conversely, when an tax form is created to output data, the information in the instance of the tax form needs to be copied to the tax form, thus, the getOutputHTML() method is an instance method.</w:t>
+        <w:t xml:space="preserve">The method </w:t>
+      </w:r>
+      <w:proofErr w:type="spellStart"/>
+      <w:proofErr w:type="gramStart"/>
+      <w:r>
+        <w:rPr>
+          <w:lang w:eastAsia="ar-SA"/>
+        </w:rPr>
+        <w:t>getInputHTML</w:t>
+      </w:r>
+      <w:proofErr w:type="spellEnd"/>
+      <w:r>
+        <w:rPr>
+          <w:lang w:eastAsia="ar-SA"/>
+        </w:rPr>
+        <w:t>(</w:t>
+      </w:r>
+      <w:proofErr w:type="gramEnd"/>
+      <w:r>
+        <w:rPr>
+          <w:lang w:eastAsia="ar-SA"/>
+        </w:rPr>
+        <w:t xml:space="preserve">) is a static method because when the input page is created there is not instance of the form yet. Conversely, when </w:t>
+      </w:r>
+      <w:proofErr w:type="gramStart"/>
+      <w:r>
+        <w:rPr>
+          <w:lang w:eastAsia="ar-SA"/>
+        </w:rPr>
+        <w:t>an</w:t>
+      </w:r>
+      <w:proofErr w:type="gramEnd"/>
+      <w:r>
+        <w:rPr>
+          <w:lang w:eastAsia="ar-SA"/>
+        </w:rPr>
+        <w:t xml:space="preserve"> tax form is created to output data, the information in the instance of the tax form needs to be copied to the tax form, thus, the </w:t>
+      </w:r>
+      <w:proofErr w:type="spellStart"/>
+      <w:proofErr w:type="gramStart"/>
+      <w:r>
+        <w:rPr>
+          <w:lang w:eastAsia="ar-SA"/>
+        </w:rPr>
+        <w:t>getOutputHTML</w:t>
+      </w:r>
+      <w:proofErr w:type="spellEnd"/>
+      <w:r>
+        <w:rPr>
+          <w:lang w:eastAsia="ar-SA"/>
+        </w:rPr>
+        <w:t>(</w:t>
+      </w:r>
+      <w:proofErr w:type="gramEnd"/>
+      <w:r>
+        <w:rPr>
+          <w:lang w:eastAsia="ar-SA"/>
+        </w:rPr>
+        <w:t>) method is an instance method.</w:t>
       </w:r>
     </w:p>
     <w:p>
@@ -4871,7 +5176,21 @@
         <w:rPr>
           <w:lang w:eastAsia="ar-SA"/>
         </w:rPr>
-        <w:t>The entire form will be enclosed in an HTML details element. This element will have an ID of the form  form name, the same  unique identifier used above, and the word “details” separated by hyphens (for example, f1040-1-details). The identifier will use only lowercase letters.</w:t>
+        <w:t xml:space="preserve">The entire form will be enclosed in an HTML details element. This element will have an ID of the form  </w:t>
+      </w:r>
+      <w:proofErr w:type="spellStart"/>
+      <w:r>
+        <w:rPr>
+          <w:lang w:eastAsia="ar-SA"/>
+        </w:rPr>
+        <w:t>form</w:t>
+      </w:r>
+      <w:proofErr w:type="spellEnd"/>
+      <w:r>
+        <w:rPr>
+          <w:lang w:eastAsia="ar-SA"/>
+        </w:rPr>
+        <w:t xml:space="preserve"> name, the same  unique identifier used above, and the word “details” separated by hyphens (for example, f1040-1-details). The identifier will use only lowercase letters.</w:t>
       </w:r>
     </w:p>
     <w:p>
@@ -4881,11 +5200,18 @@
       <w:r>
         <w:t xml:space="preserve">static </w:t>
       </w:r>
+      <w:proofErr w:type="spellStart"/>
+      <w:proofErr w:type="gramStart"/>
       <w:r>
         <w:t>getUserInput</w:t>
       </w:r>
-      <w:r>
-        <w:t>() Method</w:t>
+      <w:proofErr w:type="spellEnd"/>
+      <w:r>
+        <w:t>(</w:t>
+      </w:r>
+      <w:proofErr w:type="gramEnd"/>
+      <w:r>
+        <w:t>) Method</w:t>
       </w:r>
     </w:p>
     <w:p>
@@ -4907,10 +5233,18 @@
         <w:pStyle w:val="Heading4"/>
       </w:pPr>
       <w:r>
-        <w:t>put1040Information</w:t>
-      </w:r>
-      <w:r>
-        <w:t>() Method</w:t>
+        <w:t>put1040</w:t>
+      </w:r>
+      <w:proofErr w:type="gramStart"/>
+      <w:r>
+        <w:t>Information</w:t>
+      </w:r>
+      <w:r>
+        <w:t>(</w:t>
+      </w:r>
+      <w:proofErr w:type="gramEnd"/>
+      <w:r>
+        <w:t>) Method</w:t>
       </w:r>
     </w:p>
     <w:p>
@@ -4969,15 +5303,31 @@
         <w:pStyle w:val="Body-Text"/>
       </w:pPr>
       <w:r>
-        <w:t>Worksheets are associated with an immediate need for calculation, and their calculation may be specific to the form that needs the calculation. For example, there may be multiple schedule C’s and each one needs one needs its own calculation of the self-employment tax and SEHI deduction. Therefore, worksheets should be created by the form that needs the calculation. If you were to access the worksheet via Forms.getValue(), it could return a value from a worksheet created for another form.</w:t>
-      </w:r>
-    </w:p>
-    <w:p>
-      <w:pPr>
-        <w:pStyle w:val="Body-Text"/>
-      </w:pPr>
-      <w:r>
-        <w:t>Therefore, worksheet constructors should call the calculator() method directly, and the worksheet can then be accessed as follows:</w:t>
+        <w:t xml:space="preserve">Worksheets are associated with an immediate need for calculation, and their calculation may be specific to the form that needs the calculation. For example, there may be multiple schedule C’s and each one needs one needs its own calculation of the self-employment tax and SEHI deduction. Therefore, worksheets should be created by the form that needs the calculation. If you were to access the worksheet via </w:t>
+      </w:r>
+      <w:proofErr w:type="spellStart"/>
+      <w:r>
+        <w:t>Forms.getValue</w:t>
+      </w:r>
+      <w:proofErr w:type="spellEnd"/>
+      <w:r>
+        <w:t>(), it could return a value from a worksheet created for another form.</w:t>
+      </w:r>
+    </w:p>
+    <w:p>
+      <w:pPr>
+        <w:pStyle w:val="Body-Text"/>
+      </w:pPr>
+      <w:r>
+        <w:t xml:space="preserve">Therefore, worksheet constructors should call the </w:t>
+      </w:r>
+      <w:proofErr w:type="gramStart"/>
+      <w:r>
+        <w:t>calculator(</w:t>
+      </w:r>
+      <w:proofErr w:type="gramEnd"/>
+      <w:r>
+        <w:t>) method directly, and the worksheet can then be accessed as follows:</w:t>
       </w:r>
     </w:p>
     <w:p>
@@ -4985,7 +5335,31 @@
         <w:pStyle w:val="Source"/>
       </w:pPr>
       <w:r>
-        <w:t>const value = Forms.createForm(“Worksheet”).line(“lineno”);</w:t>
+        <w:t xml:space="preserve">const value = </w:t>
+      </w:r>
+      <w:proofErr w:type="spellStart"/>
+      <w:r>
+        <w:t>Forms.createForm</w:t>
+      </w:r>
+      <w:proofErr w:type="spellEnd"/>
+      <w:r>
+        <w:t>(“Worksheet”</w:t>
+      </w:r>
+      <w:proofErr w:type="gramStart"/>
+      <w:r>
+        <w:t>).line</w:t>
+      </w:r>
+      <w:proofErr w:type="gramEnd"/>
+      <w:r>
+        <w:t>(“</w:t>
+      </w:r>
+      <w:proofErr w:type="spellStart"/>
+      <w:r>
+        <w:t>lineno</w:t>
+      </w:r>
+      <w:proofErr w:type="spellEnd"/>
+      <w:r>
+        <w:t>”);</w:t>
       </w:r>
     </w:p>
     <w:p>
@@ -5001,7 +5375,15 @@
         <w:pStyle w:val="Source"/>
       </w:pPr>
       <w:r>
-        <w:t>const form  = Forms.createForm(“Worksheet”);</w:t>
+        <w:t xml:space="preserve">const form  = </w:t>
+      </w:r>
+      <w:proofErr w:type="spellStart"/>
+      <w:r>
+        <w:t>Forms.createForm</w:t>
+      </w:r>
+      <w:proofErr w:type="spellEnd"/>
+      <w:r>
+        <w:t>(“Worksheet”);</w:t>
       </w:r>
     </w:p>
     <w:p>
@@ -5009,7 +5391,23 @@
         <w:pStyle w:val="Source"/>
       </w:pPr>
       <w:r>
-        <w:t>const value = form.line(“lineno”);</w:t>
+        <w:t xml:space="preserve">const value = </w:t>
+      </w:r>
+      <w:proofErr w:type="spellStart"/>
+      <w:r>
+        <w:t>form.line</w:t>
+      </w:r>
+      <w:proofErr w:type="spellEnd"/>
+      <w:r>
+        <w:t>(“</w:t>
+      </w:r>
+      <w:proofErr w:type="spellStart"/>
+      <w:r>
+        <w:t>lineno</w:t>
+      </w:r>
+      <w:proofErr w:type="spellEnd"/>
+      <w:r>
+        <w:t>”);</w:t>
       </w:r>
     </w:p>
     <w:p>
@@ -5035,17 +5433,27 @@
         <w:rPr>
           <w:rStyle w:val="SourceCodechar"/>
         </w:rPr>
-        <w:t>Library/TaxForms</w:t>
-      </w:r>
+        <w:t>Library/</w:t>
+      </w:r>
+      <w:proofErr w:type="spellStart"/>
+      <w:r>
+        <w:rPr>
+          <w:rStyle w:val="SourceCodechar"/>
+        </w:rPr>
+        <w:t>TaxForms</w:t>
+      </w:r>
+      <w:proofErr w:type="spellEnd"/>
       <w:r>
         <w:t xml:space="preserve">. Instances of the tax form classes are the internal representation of the tax forms. The class </w:t>
       </w:r>
+      <w:proofErr w:type="spellStart"/>
       <w:r>
         <w:rPr>
           <w:rStyle w:val="SourceCodechar"/>
         </w:rPr>
         <w:t>TaxForms</w:t>
       </w:r>
+      <w:proofErr w:type="spellEnd"/>
       <w:r>
         <w:t xml:space="preserve"> (with an “s” at the end) is a separate class that manages the instances of the tax forms that have been created.</w:t>
       </w:r>
@@ -5065,14 +5473,32 @@
       <w:r>
         <w:t xml:space="preserve">The class </w:t>
       </w:r>
+      <w:proofErr w:type="spellStart"/>
       <w:r>
         <w:rPr>
           <w:rStyle w:val="SourceCodechar"/>
         </w:rPr>
         <w:t>TaxFormPages</w:t>
       </w:r>
-      <w:r>
-        <w:t xml:space="preserve"> provides utilities for creating, deleting, and managing the tax form web pages. Currently, this class and the tax form web pages are only used by the TaxProgram tool. It uses these pages because it more closely resembles a tax program using actual tax forms. Most tax forms fall into one of two catagories.</w:t>
+      <w:proofErr w:type="spellEnd"/>
+      <w:r>
+        <w:t xml:space="preserve"> provides utilities for creating, deleting, and managing the tax form web pages. Currently, this class and the tax form web pages are only used by the </w:t>
+      </w:r>
+      <w:proofErr w:type="spellStart"/>
+      <w:r>
+        <w:t>TaxProgram</w:t>
+      </w:r>
+      <w:proofErr w:type="spellEnd"/>
+      <w:r>
+        <w:t xml:space="preserve"> tool. It uses these pages because it more closely resembles a tax program using actual tax forms. Most tax forms fall into one of two </w:t>
+      </w:r>
+      <w:proofErr w:type="spellStart"/>
+      <w:r>
+        <w:t>catagories</w:t>
+      </w:r>
+      <w:proofErr w:type="spellEnd"/>
+      <w:r>
+        <w:t>.</w:t>
       </w:r>
     </w:p>
     <w:p>
@@ -5173,21 +5599,25 @@
       <w:r>
         <w:t xml:space="preserve">The </w:t>
       </w:r>
+      <w:proofErr w:type="spellStart"/>
       <w:r>
         <w:rPr>
           <w:rStyle w:val="SourceCodechar"/>
         </w:rPr>
         <w:t>TaxForm</w:t>
       </w:r>
+      <w:proofErr w:type="spellEnd"/>
       <w:r>
         <w:t xml:space="preserve">, </w:t>
       </w:r>
+      <w:proofErr w:type="spellStart"/>
       <w:r>
         <w:rPr>
           <w:rStyle w:val="SourceCodechar"/>
         </w:rPr>
         <w:t>TaxForms</w:t>
       </w:r>
+      <w:proofErr w:type="spellEnd"/>
       <w:r>
         <w:t xml:space="preserve">, and </w:t>
       </w:r>
@@ -5312,12 +5742,14 @@
       <w:r>
         <w:t xml:space="preserve"> and </w:t>
       </w:r>
+      <w:proofErr w:type="spellStart"/>
       <w:r>
         <w:rPr>
           <w:rStyle w:val="SourceCodechar"/>
         </w:rPr>
         <w:t>HTMLBuild</w:t>
       </w:r>
+      <w:proofErr w:type="spellEnd"/>
       <w:r>
         <w:t xml:space="preserve"> modules provide abstractions for working with HTML elements. The </w:t>
       </w:r>
@@ -5330,12 +5762,14 @@
       <w:r>
         <w:t xml:space="preserve"> module provides general utilities for working with HTML elements, while the </w:t>
       </w:r>
+      <w:proofErr w:type="spellStart"/>
       <w:r>
         <w:rPr>
           <w:rStyle w:val="SourceCodechar"/>
         </w:rPr>
         <w:t>HTMLBuild</w:t>
       </w:r>
+      <w:proofErr w:type="spellEnd"/>
       <w:r>
         <w:t xml:space="preserve"> modules provides methods for dynamically creating and adding content to the current web page. The primary abstraction of note is that HTML elements that are used to get information from the taxpayer or show information to the taxpayer are accessed via the “</w:t>
       </w:r>
@@ -5356,12 +5790,14 @@
       <w:r>
         <w:t xml:space="preserve">The </w:t>
       </w:r>
+      <w:proofErr w:type="spellStart"/>
       <w:r>
         <w:rPr>
           <w:rStyle w:val="SourceCodechar"/>
         </w:rPr>
         <w:t>IncludeFile</w:t>
       </w:r>
+      <w:proofErr w:type="spellEnd"/>
       <w:r>
         <w:t xml:space="preserve"> module implements an HTML syntax that allows HTML files to include other HTML files. This is not used much anymore. Most HTML files have been changed to PHP files in order to use the PHP include mechanism instead.</w:t>
       </w:r>
@@ -5382,12 +5818,14 @@
       <w:r>
         <w:t xml:space="preserve"> modules contain the definition of constant values and tables of data that are needed in tax calculations. These values change from year to year; therefore, there is a separate module for every year that is supported. The </w:t>
       </w:r>
+      <w:proofErr w:type="spellStart"/>
       <w:r>
         <w:rPr>
           <w:rStyle w:val="SourceCodechar"/>
         </w:rPr>
         <w:t>TaxTableTmpl</w:t>
       </w:r>
+      <w:proofErr w:type="spellEnd"/>
       <w:r>
         <w:t xml:space="preserve"> class is a separate module that implements the methods for accessing the tax table information. Each of the </w:t>
       </w:r>
@@ -5400,30 +5838,36 @@
       <w:r>
         <w:t xml:space="preserve"> modules is a child class of the </w:t>
       </w:r>
+      <w:proofErr w:type="spellStart"/>
       <w:r>
         <w:rPr>
           <w:rStyle w:val="SourceCodechar"/>
         </w:rPr>
         <w:t>TaxTableTmpl</w:t>
       </w:r>
+      <w:proofErr w:type="spellEnd"/>
       <w:r>
         <w:t xml:space="preserve"> module so these methods provide a common set of access methods for the information in the tax tables, regardless of the tax year. The module </w:t>
       </w:r>
+      <w:proofErr w:type="spellStart"/>
       <w:r>
         <w:rPr>
           <w:rStyle w:val="SourceCodechar"/>
         </w:rPr>
         <w:t>TaxTable</w:t>
       </w:r>
+      <w:proofErr w:type="spellEnd"/>
       <w:r>
         <w:t xml:space="preserve"> provides the static method named </w:t>
       </w:r>
+      <w:proofErr w:type="spellStart"/>
       <w:r>
         <w:rPr>
           <w:rStyle w:val="SourceCodechar"/>
         </w:rPr>
         <w:t>getTaxTable</w:t>
       </w:r>
+      <w:proofErr w:type="spellEnd"/>
       <w:r>
         <w:t>, returns a reference to the correct tax table object based on the year of the return. Since this method is a static method, it can be called from anywhere, essentially making the tax tables global data.</w:t>
       </w:r>
@@ -5435,21 +5879,25 @@
       <w:r>
         <w:t xml:space="preserve">The </w:t>
       </w:r>
+      <w:proofErr w:type="spellStart"/>
       <w:r>
         <w:rPr>
           <w:rStyle w:val="SourceCodechar"/>
         </w:rPr>
         <w:t>TaxPayer</w:t>
       </w:r>
+      <w:proofErr w:type="spellEnd"/>
       <w:r>
         <w:t xml:space="preserve"> class saves the attributes of the taxpayer. Currently, only one </w:t>
       </w:r>
+      <w:proofErr w:type="spellStart"/>
       <w:r>
         <w:rPr>
           <w:rStyle w:val="SourceCodechar"/>
         </w:rPr>
         <w:t>TaxPayer</w:t>
       </w:r>
+      <w:proofErr w:type="spellEnd"/>
       <w:r>
         <w:t xml:space="preserve"> object is supported, so I also contains information about the spouse and dependents. Together, the tax payer information, the input tax forms, and the tax tables, and you have all the information you need to complete the tax return.</w:t>
       </w:r>
@@ -5461,12 +5909,14 @@
       <w:r>
         <w:t xml:space="preserve">The directory </w:t>
       </w:r>
+      <w:proofErr w:type="spellStart"/>
       <w:r>
         <w:rPr>
           <w:rStyle w:val="SourceCodechar"/>
         </w:rPr>
         <w:t>SalesTax</w:t>
       </w:r>
+      <w:proofErr w:type="spellEnd"/>
       <w:r>
         <w:t xml:space="preserve"> is a separate subdirectory of </w:t>
       </w:r>
@@ -5623,7 +6073,23 @@
         <w:pStyle w:val="Body-Text"/>
       </w:pPr>
       <w:r>
-        <w:t>The TaxProgram tool is unlike the other tax tools. Rather than providing a simplified abstraction for part of the tax calculation, the TaxProgram uses actual tax forms for the input information and the result is similar to an actual tax return.</w:t>
+        <w:t xml:space="preserve">The </w:t>
+      </w:r>
+      <w:proofErr w:type="spellStart"/>
+      <w:r>
+        <w:t>TaxProgram</w:t>
+      </w:r>
+      <w:proofErr w:type="spellEnd"/>
+      <w:r>
+        <w:t xml:space="preserve"> tool is unlike the other tax tools. Rather than providing a simplified abstraction for part of the tax calculation, the </w:t>
+      </w:r>
+      <w:proofErr w:type="spellStart"/>
+      <w:r>
+        <w:t>TaxProgram</w:t>
+      </w:r>
+      <w:proofErr w:type="spellEnd"/>
+      <w:r>
+        <w:t xml:space="preserve"> uses actual tax forms for the input information and the result is similar to an actual tax return.</w:t>
       </w:r>
     </w:p>
     <w:p>
@@ -6016,15 +6482,184 @@
     <w:p>
       <w:pPr>
         <w:pStyle w:val="Body-Text"/>
+        <w:numPr>
+          <w:ilvl w:val="0"/>
+          <w:numId w:val="26"/>
+        </w:numPr>
+      </w:pPr>
+      <w:r>
+        <w:t xml:space="preserve">To make web page print-friendly, you can add </w:t>
+      </w:r>
+      <w:r>
+        <w:t xml:space="preserve">the following line </w:t>
+      </w:r>
+      <w:r>
+        <w:t>to your stylesheet.</w:t>
+      </w:r>
+      <w:r>
+        <w:rPr>
+          <w:lang w:eastAsia="ar-SA"/>
+        </w:rPr>
+        <w:t xml:space="preserve"> </w:t>
+      </w:r>
+      <w:r>
+        <w:t>This rule</w:t>
+      </w:r>
+      <w:r>
+        <w:t xml:space="preserve"> automatically strips extra padding and background colors when the user presses Ctrl+P / </w:t>
+      </w:r>
+      <w:proofErr w:type="spellStart"/>
+      <w:r>
+        <w:t>Cmd+P</w:t>
+      </w:r>
+      <w:proofErr w:type="spellEnd"/>
+      <w:r>
+        <w:t xml:space="preserve"> to save it as a crisp PDF.</w:t>
+      </w:r>
+    </w:p>
+    <w:p>
+      <w:pPr>
+        <w:pStyle w:val="SourceCode"/>
+        <w:ind w:firstLine="720"/>
+      </w:pPr>
+      <w:r>
+        <w:t xml:space="preserve">@media print </w:t>
+      </w:r>
+      <w:proofErr w:type="gramStart"/>
+      <w:r>
+        <w:t>{ body</w:t>
+      </w:r>
+      <w:proofErr w:type="gramEnd"/>
+      <w:r>
+        <w:t xml:space="preserve"> </w:t>
+      </w:r>
+      <w:proofErr w:type="gramStart"/>
+      <w:r>
+        <w:t>{ padding</w:t>
+      </w:r>
+      <w:proofErr w:type="gramEnd"/>
+      <w:r>
+        <w:t>: 0; background: none</w:t>
+      </w:r>
+      <w:proofErr w:type="gramStart"/>
+      <w:r>
+        <w:t>; }</w:t>
+      </w:r>
+      <w:proofErr w:type="gramEnd"/>
+      <w:r>
+        <w:t xml:space="preserve"> }</w:t>
+      </w:r>
+    </w:p>
+    <w:p>
+      <w:pPr>
+        <w:pStyle w:val="SourceCode"/>
+      </w:pPr>
+      <w:r>
+        <w:t>Or,</w:t>
+      </w:r>
+    </w:p>
+    <w:p>
+      <w:pPr>
+        <w:pStyle w:val="SourceCode"/>
+        <w:ind w:firstLine="720"/>
+      </w:pPr>
+      <w:r>
+        <w:t>@media print {</w:t>
+      </w:r>
+    </w:p>
+    <w:p>
+      <w:pPr>
+        <w:pStyle w:val="SourceCode"/>
+      </w:pPr>
+      <w:r>
+        <w:tab/>
+      </w:r>
+      <w:r>
+        <w:tab/>
+      </w:r>
+      <w:r>
+        <w:t xml:space="preserve">body </w:t>
+      </w:r>
+      <w:proofErr w:type="gramStart"/>
+      <w:r>
+        <w:t>{ background</w:t>
+      </w:r>
+      <w:proofErr w:type="gramEnd"/>
+      <w:r>
+        <w:t>: none; padding: 0</w:t>
+      </w:r>
+      <w:proofErr w:type="gramStart"/>
+      <w:r>
+        <w:t>; }</w:t>
+      </w:r>
+      <w:proofErr w:type="gramEnd"/>
+    </w:p>
+    <w:p>
+      <w:pPr>
+        <w:pStyle w:val="SourceCode"/>
+      </w:pPr>
+      <w:r>
+        <w:tab/>
+      </w:r>
+      <w:r>
+        <w:tab/>
+      </w:r>
+      <w:proofErr w:type="gramStart"/>
+      <w:r>
+        <w:t>.form</w:t>
+      </w:r>
+      <w:proofErr w:type="gramEnd"/>
+      <w:r>
+        <w:t xml:space="preserve">-1040 </w:t>
+      </w:r>
+      <w:proofErr w:type="gramStart"/>
+      <w:r>
+        <w:t>{ border</w:t>
+      </w:r>
+      <w:proofErr w:type="gramEnd"/>
+      <w:r>
+        <w:t>: none; width: 100%</w:t>
+      </w:r>
+      <w:proofErr w:type="gramStart"/>
+      <w:r>
+        <w:t>; }</w:t>
+      </w:r>
+      <w:proofErr w:type="gramEnd"/>
+    </w:p>
+    <w:p>
+      <w:pPr>
+        <w:pStyle w:val="SourceCode"/>
+        <w:ind w:firstLine="720"/>
+      </w:pPr>
+      <w:r>
+        <w:t>}</w:t>
+      </w:r>
+    </w:p>
+    <w:p>
+      <w:pPr>
+        <w:pStyle w:val="Body-Text"/>
+      </w:pPr>
+    </w:p>
+    <w:p>
+      <w:pPr>
+        <w:pStyle w:val="Body-Text"/>
       </w:pPr>
       <w:r>
         <w:t xml:space="preserve">The Forms.js module manages the forms that are in use by the tool. Any form that is created should be created by calling </w:t>
       </w:r>
+      <w:proofErr w:type="spellStart"/>
       <w:r>
         <w:rPr>
           <w:rStyle w:val="SourceCodechar"/>
         </w:rPr>
-        <w:t>Forms.createForm()</w:t>
+        <w:t>Forms.createForm</w:t>
+      </w:r>
+      <w:proofErr w:type="spellEnd"/>
+      <w:r>
+        <w:rPr>
+          <w:rStyle w:val="SourceCodechar"/>
+        </w:rPr>
+        <w:t>()</w:t>
       </w:r>
       <w:r>
         <w:t xml:space="preserve">, not by calling </w:t>
@@ -6033,7 +6668,29 @@
         <w:rPr>
           <w:rStyle w:val="SourceCodechar"/>
         </w:rPr>
-        <w:t>new FormName()</w:t>
+        <w:t xml:space="preserve">new </w:t>
+      </w:r>
+      <w:proofErr w:type="spellStart"/>
+      <w:proofErr w:type="gramStart"/>
+      <w:r>
+        <w:rPr>
+          <w:rStyle w:val="SourceCodechar"/>
+        </w:rPr>
+        <w:t>FormName</w:t>
+      </w:r>
+      <w:proofErr w:type="spellEnd"/>
+      <w:r>
+        <w:rPr>
+          <w:rStyle w:val="SourceCodechar"/>
+        </w:rPr>
+        <w:t>(</w:t>
+      </w:r>
+      <w:proofErr w:type="gramEnd"/>
+      <w:r>
+        <w:rPr>
+          <w:rStyle w:val="SourceCodechar"/>
+        </w:rPr>
+        <w:t>)</w:t>
       </w:r>
       <w:r>
         <w:t>. This allows the Forms module to keep tract of which forms have been created and providing convenient access to the form information.</w:t>
@@ -6044,15 +6701,43 @@
         <w:pStyle w:val="Body-Text"/>
       </w:pPr>
       <w:r>
-        <w:t>Normally, a tax form must be created and calculated before values can be read from the form for use by another form. But to prevent creating and printing a lot of unused forms, if the form is just going to return 0. For example, form 1040 need to read the withholding information from lots of forms (e.g.,W-2s, 1099s), it is not necessary to create these forms just to return 0. Any form that does not reference another form and has not already been created with initial values, does not need to be created when it is referenced.</w:t>
-      </w:r>
-    </w:p>
-    <w:p>
-      <w:pPr>
-        <w:pStyle w:val="Body-Text"/>
-      </w:pPr>
-      <w:r>
-        <w:t>A form does not need to be created to be accessed. If the form does not exist, the value returned will be 0. This is sufficient for any form that does not access another form such as the W-2 or 1099-INT. If a form does exist, its calculate() method must be called to make sure the data is correct (the modified flag can be used to prevent recalculating a form when it is not necessary).</w:t>
+        <w:t>Normally, a tax form must be created and calculated before values can be read from the form for use by another form. But to prevent creating and printing a lot of unused forms, if the form is just going to return 0. For example, form 1040 need to read the withholding information from lots of forms (</w:t>
+      </w:r>
+      <w:proofErr w:type="gramStart"/>
+      <w:r>
+        <w:t>e.g.,W</w:t>
+      </w:r>
+      <w:proofErr w:type="gramEnd"/>
+      <w:r>
+        <w:t>-2s, 1099s), it is not necessary to create these forms just to return 0. Any form that does not reference another form and has not already been created with initial values, does not need to be created when it is referenced.</w:t>
+      </w:r>
+    </w:p>
+    <w:p>
+      <w:pPr>
+        <w:pStyle w:val="Body-Text"/>
+      </w:pPr>
+      <w:r>
+        <w:t xml:space="preserve">A form does not need to be created to be accessed. If the form does not exist, the value returned will be 0. This is sufficient for any form that does not access another form such as the W-2 or 1099-INT. If a form </w:t>
+      </w:r>
+      <w:r>
+        <w:lastRenderedPageBreak/>
+        <w:t xml:space="preserve">does exist, </w:t>
+      </w:r>
+      <w:proofErr w:type="gramStart"/>
+      <w:r>
+        <w:t>its</w:t>
+      </w:r>
+      <w:proofErr w:type="gramEnd"/>
+      <w:r>
+        <w:t xml:space="preserve"> </w:t>
+      </w:r>
+      <w:proofErr w:type="gramStart"/>
+      <w:r>
+        <w:t>calculate(</w:t>
+      </w:r>
+      <w:proofErr w:type="gramEnd"/>
+      <w:r>
+        <w:t>) method must be called to make sure the data is correct (the modified flag can be used to prevent recalculating a form when it is not necessary).</w:t>
       </w:r>
     </w:p>
     <w:p>
@@ -6062,11 +6747,47 @@
       <w:r>
         <w:t xml:space="preserve">A form can be accessed by </w:t>
       </w:r>
+      <w:proofErr w:type="spellStart"/>
       <w:r>
         <w:rPr>
           <w:rStyle w:val="SourceCodechar"/>
         </w:rPr>
-        <w:t>Forms.getValue(“formname”, “lineno”)</w:t>
+        <w:t>Forms.getValue</w:t>
+      </w:r>
+      <w:proofErr w:type="spellEnd"/>
+      <w:r>
+        <w:rPr>
+          <w:rStyle w:val="SourceCodechar"/>
+        </w:rPr>
+        <w:t>(“</w:t>
+      </w:r>
+      <w:proofErr w:type="spellStart"/>
+      <w:r>
+        <w:rPr>
+          <w:rStyle w:val="SourceCodechar"/>
+        </w:rPr>
+        <w:t>formname</w:t>
+      </w:r>
+      <w:proofErr w:type="spellEnd"/>
+      <w:r>
+        <w:rPr>
+          <w:rStyle w:val="SourceCodechar"/>
+        </w:rPr>
+        <w:t>”, “</w:t>
+      </w:r>
+      <w:proofErr w:type="spellStart"/>
+      <w:r>
+        <w:rPr>
+          <w:rStyle w:val="SourceCodechar"/>
+        </w:rPr>
+        <w:t>lineno</w:t>
+      </w:r>
+      <w:proofErr w:type="spellEnd"/>
+      <w:r>
+        <w:rPr>
+          <w:rStyle w:val="SourceCodechar"/>
+        </w:rPr>
+        <w:t>”)</w:t>
       </w:r>
       <w:r>
         <w:t>. This will create the form if it does not exist, and it will calculate it if it has not been calculated. This is how most forms are accessed, and it automatically creates a dependency chain. If a form needs a value from another form, that form will be created and calculated before the value is returned.</w:t>
@@ -6074,11 +6795,54 @@
     </w:p>
     <w:p>
       <w:pPr>
+        <w:pStyle w:val="Heading3"/>
+      </w:pPr>
+      <w:r>
+        <w:t>Designing Forms</w:t>
+      </w:r>
+    </w:p>
+    <w:p>
+      <w:pPr>
+        <w:pStyle w:val="Body-Text"/>
+        <w:numPr>
+          <w:ilvl w:val="0"/>
+          <w:numId w:val="24"/>
+        </w:numPr>
+        <w:rPr>
+          <w:lang w:eastAsia="ar-SA"/>
+        </w:rPr>
+      </w:pPr>
+      <w:r>
+        <w:rPr>
+          <w:lang w:eastAsia="ar-SA"/>
+        </w:rPr>
+        <w:t>Look at the original form to decide the increments to divide the form into. If some boxes take up ½ the form and others take up 1/3 you will need to divide the form into sixths to create the forms. Then all boxes can be multiples of the increment amount.</w:t>
+      </w:r>
+    </w:p>
+    <w:p>
+      <w:pPr>
+        <w:pStyle w:val="Body-Text"/>
+        <w:numPr>
+          <w:ilvl w:val="0"/>
+          <w:numId w:val="24"/>
+        </w:numPr>
+        <w:rPr>
+          <w:lang w:eastAsia="ar-SA"/>
+        </w:rPr>
+      </w:pPr>
+      <w:r>
+        <w:rPr>
+          <w:lang w:eastAsia="ar-SA"/>
+        </w:rPr>
+        <w:t>When designing a form in HTML, use a grid layout and make the big boxes first, then put smaller layouts inside the boxes.</w:t>
+      </w:r>
+    </w:p>
+    <w:p>
+      <w:pPr>
         <w:pStyle w:val="Heading1"/>
       </w:pPr>
       <w:bookmarkStart w:id="35" w:name="_Toc237960225"/>
       <w:r>
-        <w:lastRenderedPageBreak/>
         <w:t>Source Control</w:t>
       </w:r>
       <w:bookmarkEnd w:id="35"/>
@@ -6383,6 +7147,7 @@
       </w:pPr>
       <w:bookmarkStart w:id="37" w:name="_Toc237960227"/>
       <w:r>
+        <w:lastRenderedPageBreak/>
         <w:t>Authentication</w:t>
       </w:r>
       <w:bookmarkEnd w:id="37"/>
@@ -6556,7 +7321,6 @@
         <w:ind w:firstLine="720"/>
       </w:pPr>
       <w:r>
-        <w:lastRenderedPageBreak/>
         <w:t>git@github.com:bb3413/TaxTools.git</w:t>
       </w:r>
     </w:p>
@@ -6908,6 +7672,7 @@
       </w:pPr>
       <w:bookmarkStart w:id="39" w:name="_Toc237960229"/>
       <w:r>
+        <w:lastRenderedPageBreak/>
         <w:t>Branches</w:t>
       </w:r>
       <w:bookmarkEnd w:id="39"/>
@@ -6923,7 +7688,15 @@
         <w:t>a</w:t>
       </w:r>
       <w:r>
-        <w:t xml:space="preserve"> separate versions of the same code. The original version continues in one branch and a separate branch is created to keep copies of changes </w:t>
+        <w:t xml:space="preserve"> </w:t>
+      </w:r>
+      <w:proofErr w:type="gramStart"/>
+      <w:r>
+        <w:t>separate versions of the same code</w:t>
+      </w:r>
+      <w:proofErr w:type="gramEnd"/>
+      <w:r>
+        <w:t xml:space="preserve">. The original version continues in one branch and a separate branch is created to keep copies of changes </w:t>
       </w:r>
       <w:r>
         <w:t xml:space="preserve">that </w:t>
@@ -7139,15 +7912,7 @@
           <w:rFonts w:cstheme="minorHAnsi"/>
           <w:lang w:eastAsia="ar-SA"/>
         </w:rPr>
-        <w:t xml:space="preserve"> Developing new features in their own branch allows the changes to be checked in (committed) even if they are not complete. The need to check in incomplete </w:t>
-      </w:r>
-      <w:r>
-        <w:rPr>
-          <w:rFonts w:cstheme="minorHAnsi"/>
-          <w:lang w:eastAsia="ar-SA"/>
-        </w:rPr>
-        <w:lastRenderedPageBreak/>
-        <w:t>changes prevents the need to have “stashes” for each change that is in progress but not complete (stashes are needed to save files that are not checked-in when you need to change to another branch to work on another problem).</w:t>
+        <w:t xml:space="preserve"> Developing new features in their own branch allows the changes to be checked in (committed) even if they are not complete. The need to check in incomplete changes prevents the need to have “stashes” for each change that is in progress but not complete (stashes are needed to save files that are not checked-in when you need to change to another branch to work on another problem).</w:t>
       </w:r>
     </w:p>
     <w:p>
@@ -7528,7 +8293,15 @@
         <w:spacing w:after="0"/>
       </w:pPr>
       <w:r>
-        <w:t>Add .gitignore:</w:t>
+        <w:t>Add .</w:t>
+      </w:r>
+      <w:proofErr w:type="spellStart"/>
+      <w:r>
+        <w:t>gitignore</w:t>
+      </w:r>
+      <w:proofErr w:type="spellEnd"/>
+      <w:r>
+        <w:t>:</w:t>
       </w:r>
       <w:r>
         <w:tab/>
@@ -7537,8 +8310,13 @@
         <w:tab/>
       </w:r>
       <w:r>
-        <w:t>No .gitignore</w:t>
-      </w:r>
+        <w:t>No .</w:t>
+      </w:r>
+      <w:proofErr w:type="spellStart"/>
+      <w:r>
+        <w:t>gitignore</w:t>
+      </w:r>
+      <w:proofErr w:type="spellEnd"/>
     </w:p>
     <w:p>
       <w:pPr>
@@ -7565,6 +8343,7 @@
         <w:ind w:left="1800"/>
       </w:pPr>
       <w:r>
+        <w:lastRenderedPageBreak/>
         <w:t>Click "Create repository."</w:t>
       </w:r>
     </w:p>
@@ -7614,12 +8393,14 @@
       <w:r>
         <w:t xml:space="preserve"> </w:t>
       </w:r>
+      <w:proofErr w:type="spellStart"/>
       <w:r>
         <w:rPr>
           <w:rStyle w:val="SourceCodechar"/>
         </w:rPr>
         <w:t>init</w:t>
       </w:r>
+      <w:proofErr w:type="spellEnd"/>
       <w:r>
         <w:t> </w:t>
       </w:r>
@@ -7685,20 +8466,27 @@
       <w:r>
         <w:t xml:space="preserve">$ cd </w:t>
       </w:r>
+      <w:proofErr w:type="spellStart"/>
       <w:r>
         <w:rPr>
           <w:rStyle w:val="SourceCodenon-literal"/>
         </w:rPr>
         <w:t>TaxToolsDirectory</w:t>
       </w:r>
-    </w:p>
-    <w:p>
-      <w:pPr>
-        <w:pStyle w:val="SourceCode"/>
-      </w:pPr>
-      <w:r>
-        <w:t>$ git init</w:t>
-      </w:r>
+      <w:proofErr w:type="spellEnd"/>
+    </w:p>
+    <w:p>
+      <w:pPr>
+        <w:pStyle w:val="SourceCode"/>
+      </w:pPr>
+      <w:r>
+        <w:t xml:space="preserve">$ git </w:t>
+      </w:r>
+      <w:proofErr w:type="spellStart"/>
+      <w:r>
+        <w:t>init</w:t>
+      </w:r>
+      <w:proofErr w:type="spellEnd"/>
     </w:p>
     <w:p>
       <w:pPr>
@@ -7722,8 +8510,16 @@
         <w:rPr>
           <w:rStyle w:val="SourceCodechar"/>
         </w:rPr>
-        <w:t>.gitignore</w:t>
-      </w:r>
+        <w:t>.</w:t>
+      </w:r>
+      <w:proofErr w:type="spellStart"/>
+      <w:r>
+        <w:rPr>
+          <w:rStyle w:val="SourceCodechar"/>
+        </w:rPr>
+        <w:t>gitignore</w:t>
+      </w:r>
+      <w:proofErr w:type="spellEnd"/>
       <w:r>
         <w:rPr>
           <w:lang w:eastAsia="ar-SA"/>
@@ -7745,8 +8541,18 @@
         <w:t xml:space="preserve">$ </w:t>
       </w:r>
       <w:r>
-        <w:t>cat &lt;&lt;-EOF &gt;&gt;.gitignore</w:t>
-      </w:r>
+        <w:t>cat &lt;&lt;-EOF &gt;</w:t>
+      </w:r>
+      <w:proofErr w:type="gramStart"/>
+      <w:r>
+        <w:t>&gt;.</w:t>
+      </w:r>
+      <w:proofErr w:type="spellStart"/>
+      <w:r>
+        <w:t>gitignore</w:t>
+      </w:r>
+      <w:proofErr w:type="spellEnd"/>
+      <w:proofErr w:type="gramEnd"/>
     </w:p>
     <w:p>
       <w:pPr>
@@ -7754,11 +8560,15 @@
         <w:ind w:left="2160"/>
       </w:pPr>
       <w:r>
-        <w:lastRenderedPageBreak/>
         <w:t xml:space="preserve"># </w:t>
       </w:r>
-      <w:r>
-        <w:t>DreamWeaver status files</w:t>
+      <w:proofErr w:type="spellStart"/>
+      <w:r>
+        <w:t>DreamWeaver</w:t>
+      </w:r>
+      <w:proofErr w:type="spellEnd"/>
+      <w:r>
+        <w:t xml:space="preserve"> status files</w:t>
       </w:r>
     </w:p>
     <w:p>
@@ -7823,8 +8633,13 @@
         <w:pStyle w:val="SourceCode"/>
         <w:ind w:left="2160"/>
       </w:pPr>
-      <w:r>
-        <w:t>nodes_modules/</w:t>
+      <w:proofErr w:type="spellStart"/>
+      <w:r>
+        <w:t>nodes_modules</w:t>
+      </w:r>
+      <w:proofErr w:type="spellEnd"/>
+      <w:r>
+        <w:t>/</w:t>
       </w:r>
     </w:p>
     <w:p>
@@ -7847,9 +8662,11 @@
         <w:pStyle w:val="SourceCode"/>
         <w:ind w:left="2160"/>
       </w:pPr>
+      <w:proofErr w:type="spellStart"/>
       <w:r>
         <w:t>package.json</w:t>
       </w:r>
+      <w:proofErr w:type="spellEnd"/>
     </w:p>
     <w:p>
       <w:pPr>
@@ -7857,8 +8674,15 @@
         <w:ind w:left="2160"/>
       </w:pPr>
       <w:r>
-        <w:t>package-lock.json</w:t>
-      </w:r>
+        <w:t>package-</w:t>
+      </w:r>
+      <w:proofErr w:type="spellStart"/>
+      <w:proofErr w:type="gramStart"/>
+      <w:r>
+        <w:t>lock.json</w:t>
+      </w:r>
+      <w:proofErr w:type="spellEnd"/>
+      <w:proofErr w:type="gramEnd"/>
     </w:p>
     <w:p>
       <w:pPr>
@@ -7872,7 +8696,15 @@
         <w:ind w:left="2160"/>
       </w:pPr>
       <w:r>
-        <w:t># ESLint configuration file</w:t>
+        <w:t xml:space="preserve"># </w:t>
+      </w:r>
+      <w:proofErr w:type="spellStart"/>
+      <w:r>
+        <w:t>ESLint</w:t>
+      </w:r>
+      <w:proofErr w:type="spellEnd"/>
+      <w:r>
+        <w:t xml:space="preserve"> configuration file</w:t>
       </w:r>
     </w:p>
     <w:p>
@@ -7880,9 +8712,11 @@
         <w:pStyle w:val="SourceCode"/>
         <w:ind w:left="2160"/>
       </w:pPr>
+      <w:proofErr w:type="spellStart"/>
       <w:r>
         <w:t>eslint.config.mjs</w:t>
       </w:r>
+      <w:proofErr w:type="spellEnd"/>
     </w:p>
     <w:p>
       <w:pPr>
@@ -7980,8 +8814,13 @@
         <w:pStyle w:val="SourceCode"/>
       </w:pPr>
       <w:r>
-        <w:t>$ git add .</w:t>
-      </w:r>
+        <w:t xml:space="preserve">$ git </w:t>
+      </w:r>
+      <w:proofErr w:type="gramStart"/>
+      <w:r>
+        <w:t>add .</w:t>
+      </w:r>
+      <w:proofErr w:type="gramEnd"/>
     </w:p>
     <w:p>
       <w:pPr>
@@ -8060,6 +8899,7 @@
       <w:r>
         <w:t xml:space="preserve">$ git tag </w:t>
       </w:r>
+      <w:proofErr w:type="spellStart"/>
       <w:r>
         <w:rPr>
           <w:rStyle w:val="SourceCodenon-literal"/>
@@ -8084,6 +8924,7 @@
         </w:rPr>
         <w:t>umber</w:t>
       </w:r>
+      <w:proofErr w:type="spellEnd"/>
       <w:r>
         <w:tab/>
         <w:t xml:space="preserve"># e.g., </w:t>
@@ -8173,9 +9014,11 @@
       <w:r>
         <w:t xml:space="preserve">remote add origin </w:t>
       </w:r>
+      <w:proofErr w:type="gramStart"/>
       <w:r>
         <w:t>git@github.com:bb3413/TaxTools.git</w:t>
       </w:r>
+      <w:proofErr w:type="gramEnd"/>
     </w:p>
     <w:p>
       <w:pPr>
@@ -8185,14 +9028,29 @@
         <w:t xml:space="preserve">$ git </w:t>
       </w:r>
       <w:r>
-        <w:t>remote add origin</w:t>
-      </w:r>
-      <w:r>
-        <w:t xml:space="preserve">SSH </w:t>
-      </w:r>
-      <w:r>
-        <w:t>git@github.com:bb3413/TaxTools.git</w:t>
-      </w:r>
+        <w:t xml:space="preserve">remote add </w:t>
+      </w:r>
+      <w:proofErr w:type="spellStart"/>
+      <w:r>
+        <w:t>origin</w:t>
+      </w:r>
+      <w:r>
+        <w:t>SSH</w:t>
+      </w:r>
+      <w:proofErr w:type="spellEnd"/>
+      <w:r>
+        <w:t xml:space="preserve"> </w:t>
+      </w:r>
+      <w:proofErr w:type="gramStart"/>
+      <w:r>
+        <w:t>git@github.com:bb3413/</w:t>
+      </w:r>
+      <w:proofErr w:type="spellStart"/>
+      <w:r>
+        <w:t>TaxTools.git</w:t>
+      </w:r>
+      <w:proofErr w:type="spellEnd"/>
+      <w:proofErr w:type="gramEnd"/>
     </w:p>
     <w:p>
       <w:pPr>
@@ -8202,11 +9060,16 @@
         <w:t xml:space="preserve">$ git </w:t>
       </w:r>
       <w:r>
-        <w:t>remote add origin</w:t>
+        <w:t xml:space="preserve">remote add </w:t>
+      </w:r>
+      <w:proofErr w:type="spellStart"/>
+      <w:r>
+        <w:t>origin</w:t>
       </w:r>
       <w:r>
         <w:t>HTML</w:t>
       </w:r>
+      <w:proofErr w:type="spellEnd"/>
       <w:r>
         <w:t xml:space="preserve"> </w:t>
       </w:r>
@@ -8450,8 +9313,13 @@
         <w:pStyle w:val="SourceCode"/>
       </w:pPr>
       <w:r>
-        <w:t>$ git add .</w:t>
-      </w:r>
+        <w:t xml:space="preserve">$ git </w:t>
+      </w:r>
+      <w:proofErr w:type="gramStart"/>
+      <w:r>
+        <w:t>add .</w:t>
+      </w:r>
+      <w:proofErr w:type="gramEnd"/>
     </w:p>
     <w:p>
       <w:pPr>
@@ -8475,8 +9343,15 @@
         </w:numPr>
       </w:pPr>
       <w:r>
-        <w:lastRenderedPageBreak/>
-        <w:t>Push the development branch to GitGub.</w:t>
+        <w:t xml:space="preserve">Push the development branch to </w:t>
+      </w:r>
+      <w:proofErr w:type="spellStart"/>
+      <w:r>
+        <w:t>GitGub</w:t>
+      </w:r>
+      <w:proofErr w:type="spellEnd"/>
+      <w:r>
+        <w:t>.</w:t>
       </w:r>
       <w:r>
         <w:t xml:space="preserve"> T</w:t>
@@ -8541,8 +9416,13 @@
         <w:pStyle w:val="SourceCode"/>
       </w:pPr>
       <w:r>
-        <w:t>$ git push –u origin develop</w:t>
-      </w:r>
+        <w:t xml:space="preserve">$ git push –u origin </w:t>
+      </w:r>
+      <w:proofErr w:type="gramStart"/>
+      <w:r>
+        <w:t>develop</w:t>
+      </w:r>
+      <w:proofErr w:type="gramEnd"/>
     </w:p>
     <w:p>
       <w:pPr>
@@ -8752,8 +9632,24 @@
         <w:rPr>
           <w:rStyle w:val="SourceCodechar"/>
         </w:rPr>
-        <w:t>$HOME/.gitconfig</w:t>
-      </w:r>
+        <w:t>$HOME</w:t>
+      </w:r>
+      <w:proofErr w:type="gramStart"/>
+      <w:r>
+        <w:rPr>
+          <w:rStyle w:val="SourceCodechar"/>
+        </w:rPr>
+        <w:t>/.</w:t>
+      </w:r>
+      <w:proofErr w:type="spellStart"/>
+      <w:r>
+        <w:rPr>
+          <w:rStyle w:val="SourceCodechar"/>
+        </w:rPr>
+        <w:t>gitconfig</w:t>
+      </w:r>
+      <w:proofErr w:type="spellEnd"/>
+      <w:proofErr w:type="gramEnd"/>
       <w:r>
         <w:rPr>
           <w:lang w:eastAsia="ar-SA"/>
@@ -8850,7 +9746,23 @@
         <w:rPr>
           <w:lang w:eastAsia="ar-SA"/>
         </w:rPr>
-        <w:t>$ git config –-global user.email “</w:t>
+        <w:t xml:space="preserve">$ git config –-global </w:t>
+      </w:r>
+      <w:proofErr w:type="spellStart"/>
+      <w:proofErr w:type="gramStart"/>
+      <w:r>
+        <w:rPr>
+          <w:lang w:eastAsia="ar-SA"/>
+        </w:rPr>
+        <w:t>user.email</w:t>
+      </w:r>
+      <w:proofErr w:type="spellEnd"/>
+      <w:proofErr w:type="gramEnd"/>
+      <w:r>
+        <w:rPr>
+          <w:lang w:eastAsia="ar-SA"/>
+        </w:rPr>
+        <w:t xml:space="preserve"> “</w:t>
       </w:r>
       <w:r>
         <w:rPr>
@@ -8922,7 +9834,23 @@
         <w:rPr>
           <w:lang w:eastAsia="ar-SA"/>
         </w:rPr>
-        <w:t xml:space="preserve">git config --global init.defaultBranch </w:t>
+        <w:t xml:space="preserve">git config --global </w:t>
+      </w:r>
+      <w:proofErr w:type="spellStart"/>
+      <w:proofErr w:type="gramStart"/>
+      <w:r>
+        <w:rPr>
+          <w:lang w:eastAsia="ar-SA"/>
+        </w:rPr>
+        <w:t>init.defaultBranch</w:t>
+      </w:r>
+      <w:proofErr w:type="spellEnd"/>
+      <w:proofErr w:type="gramEnd"/>
+      <w:r>
+        <w:rPr>
+          <w:lang w:eastAsia="ar-SA"/>
+        </w:rPr>
+        <w:t xml:space="preserve"> </w:t>
       </w:r>
       <w:r>
         <w:rPr>
@@ -9012,7 +9940,23 @@
         <w:rPr>
           <w:lang w:eastAsia="ar-SA"/>
         </w:rPr>
-        <w:t xml:space="preserve">git config --global --add safe.directory </w:t>
+        <w:t xml:space="preserve">git config --global --add </w:t>
+      </w:r>
+      <w:proofErr w:type="spellStart"/>
+      <w:proofErr w:type="gramStart"/>
+      <w:r>
+        <w:rPr>
+          <w:lang w:eastAsia="ar-SA"/>
+        </w:rPr>
+        <w:t>safe.directory</w:t>
+      </w:r>
+      <w:proofErr w:type="spellEnd"/>
+      <w:proofErr w:type="gramEnd"/>
+      <w:r>
+        <w:rPr>
+          <w:lang w:eastAsia="ar-SA"/>
+        </w:rPr>
+        <w:t xml:space="preserve"> </w:t>
       </w:r>
       <w:r>
         <w:rPr>
@@ -9033,7 +9977,49 @@
         <w:rPr>
           <w:lang w:eastAsia="ar-SA"/>
         </w:rPr>
-        <w:t>'/mnt/g/My Drive/Documents/VSCode/TaxToolsDev'</w:t>
+        <w:t>'/</w:t>
+      </w:r>
+      <w:proofErr w:type="spellStart"/>
+      <w:r>
+        <w:rPr>
+          <w:lang w:eastAsia="ar-SA"/>
+        </w:rPr>
+        <w:t>mnt</w:t>
+      </w:r>
+      <w:proofErr w:type="spellEnd"/>
+      <w:r>
+        <w:rPr>
+          <w:lang w:eastAsia="ar-SA"/>
+        </w:rPr>
+        <w:t>/g/My Drive/Documents/</w:t>
+      </w:r>
+      <w:proofErr w:type="spellStart"/>
+      <w:r>
+        <w:rPr>
+          <w:lang w:eastAsia="ar-SA"/>
+        </w:rPr>
+        <w:t>VSCode</w:t>
+      </w:r>
+      <w:proofErr w:type="spellEnd"/>
+      <w:r>
+        <w:rPr>
+          <w:lang w:eastAsia="ar-SA"/>
+        </w:rPr>
+        <w:t>/</w:t>
+      </w:r>
+      <w:proofErr w:type="spellStart"/>
+      <w:r>
+        <w:rPr>
+          <w:lang w:eastAsia="ar-SA"/>
+        </w:rPr>
+        <w:t>TaxToolsDev</w:t>
+      </w:r>
+      <w:proofErr w:type="spellEnd"/>
+      <w:r>
+        <w:rPr>
+          <w:lang w:eastAsia="ar-SA"/>
+        </w:rPr>
+        <w:t>'</w:t>
       </w:r>
     </w:p>
     <w:p>
@@ -9042,6 +10028,7 @@
       </w:pPr>
       <w:bookmarkStart w:id="43" w:name="_Toc237960233"/>
       <w:r>
+        <w:lastRenderedPageBreak/>
         <w:t>Create</w:t>
       </w:r>
       <w:r>
@@ -9298,7 +10285,6 @@
         </w:numPr>
       </w:pPr>
       <w:r>
-        <w:lastRenderedPageBreak/>
         <w:t>Ask</w:t>
       </w:r>
       <w:r>
@@ -9457,8 +10443,13 @@
         <w:t xml:space="preserve">$ </w:t>
       </w:r>
       <w:r>
-        <w:t>git pull</w:t>
-      </w:r>
+        <w:t xml:space="preserve">git </w:t>
+      </w:r>
+      <w:proofErr w:type="gramStart"/>
+      <w:r>
+        <w:t>pull</w:t>
+      </w:r>
+      <w:proofErr w:type="gramEnd"/>
     </w:p>
     <w:p>
       <w:pPr>
@@ -9736,8 +10727,13 @@
         <w:t xml:space="preserve">$ </w:t>
       </w:r>
       <w:r>
-        <w:t>git add .</w:t>
-      </w:r>
+        <w:t xml:space="preserve">git </w:t>
+      </w:r>
+      <w:proofErr w:type="gramStart"/>
+      <w:r>
+        <w:t>add .</w:t>
+      </w:r>
+      <w:proofErr w:type="gramEnd"/>
     </w:p>
     <w:p>
       <w:pPr>
@@ -9766,6 +10762,7 @@
         <w:pStyle w:val="Body-Text"/>
       </w:pPr>
       <w:r>
+        <w:lastRenderedPageBreak/>
         <w:t>Or, you can do it one step.</w:t>
       </w:r>
     </w:p>
@@ -9996,7 +10993,6 @@
         <w:pStyle w:val="SourceCode"/>
       </w:pPr>
       <w:r>
-        <w:lastRenderedPageBreak/>
         <w:t xml:space="preserve">$ git </w:t>
       </w:r>
       <w:r>
@@ -10199,12 +11195,14 @@
       <w:r>
         <w:t xml:space="preserve">$ git branch </w:t>
       </w:r>
+      <w:proofErr w:type="spellStart"/>
       <w:r>
         <w:rPr>
           <w:rStyle w:val="SourceCodenon-literal"/>
         </w:rPr>
         <w:t>branch</w:t>
       </w:r>
+      <w:proofErr w:type="spellEnd"/>
       <w:r>
         <w:tab/>
       </w:r>
@@ -10405,12 +11403,14 @@
       <w:r>
         <w:t xml:space="preserve">$ git branch </w:t>
       </w:r>
+      <w:proofErr w:type="spellStart"/>
       <w:r>
         <w:rPr>
           <w:rStyle w:val="SourceCodenon-literal"/>
         </w:rPr>
         <w:t>branch</w:t>
       </w:r>
+      <w:proofErr w:type="spellEnd"/>
       <w:r>
         <w:tab/>
       </w:r>
@@ -10610,7 +11610,17 @@
         <w:pStyle w:val="SourceCode"/>
       </w:pPr>
       <w:r>
-        <w:t>$ git config pull.rebase false</w:t>
+        <w:t xml:space="preserve">$ git config </w:t>
+      </w:r>
+      <w:proofErr w:type="spellStart"/>
+      <w:proofErr w:type="gramStart"/>
+      <w:r>
+        <w:t>pull.rebase</w:t>
+      </w:r>
+      <w:proofErr w:type="spellEnd"/>
+      <w:proofErr w:type="gramEnd"/>
+      <w:r>
+        <w:t xml:space="preserve"> false</w:t>
       </w:r>
     </w:p>
     <w:p>
@@ -10730,6 +11740,7 @@
         <w:rPr>
           <w:lang w:eastAsia="ar-SA"/>
         </w:rPr>
+        <w:lastRenderedPageBreak/>
         <w:t>Before you add a new file, make sure you are in the correct branch and the correct location, then create the file.</w:t>
       </w:r>
     </w:p>
@@ -10935,7 +11946,6 @@
       </w:pPr>
       <w:bookmarkStart w:id="51" w:name="_Toc237960241"/>
       <w:r>
-        <w:lastRenderedPageBreak/>
         <w:t>Change a File</w:t>
       </w:r>
       <w:bookmarkEnd w:id="51"/>
@@ -11151,8 +12161,13 @@
         <w:pStyle w:val="SourceCode"/>
       </w:pPr>
       <w:r>
-        <w:t>$ git restore .</w:t>
-      </w:r>
+        <w:t xml:space="preserve">$ git </w:t>
+      </w:r>
+      <w:proofErr w:type="gramStart"/>
+      <w:r>
+        <w:t>restore .</w:t>
+      </w:r>
+      <w:proofErr w:type="gramEnd"/>
       <w:r>
         <w:tab/>
       </w:r>
@@ -11375,6 +12390,7 @@
         <w:pStyle w:val="Heading4"/>
       </w:pPr>
       <w:r>
+        <w:lastRenderedPageBreak/>
         <w:t>Revert a Stage</w:t>
       </w:r>
     </w:p>
@@ -11440,34 +12456,36 @@
         </w:rPr>
         <w:t xml:space="preserve"># </w:t>
       </w:r>
+      <w:proofErr w:type="spellStart"/>
       <w:r>
         <w:rPr>
           <w:rStyle w:val="SourceCodenon-literal"/>
           <w:rFonts w:ascii="Courier New" w:hAnsi="Courier New"/>
           <w:i w:val="0"/>
         </w:rPr>
-        <w:t>Unstage a file</w:t>
-      </w:r>
-    </w:p>
-    <w:p>
-      <w:pPr>
-        <w:pStyle w:val="SourceCode"/>
-      </w:pPr>
+        <w:t>Unstage</w:t>
+      </w:r>
+      <w:proofErr w:type="spellEnd"/>
       <w:r>
         <w:rPr>
           <w:rStyle w:val="SourceCodenon-literal"/>
           <w:rFonts w:ascii="Courier New" w:hAnsi="Courier New"/>
           <w:i w:val="0"/>
         </w:rPr>
-        <w:t>$ git reset</w:t>
-      </w:r>
+        <w:t xml:space="preserve"> a file</w:t>
+      </w:r>
+    </w:p>
+    <w:p>
+      <w:pPr>
+        <w:pStyle w:val="SourceCode"/>
+      </w:pPr>
       <w:r>
         <w:rPr>
           <w:rStyle w:val="SourceCodenon-literal"/>
           <w:rFonts w:ascii="Courier New" w:hAnsi="Courier New"/>
           <w:i w:val="0"/>
         </w:rPr>
-        <w:tab/>
+        <w:t>$ git reset</w:t>
       </w:r>
       <w:r>
         <w:rPr>
@@ -11484,7 +12502,33 @@
           <w:i w:val="0"/>
         </w:rPr>
         <w:tab/>
-        <w:t># Unstage everything</w:t>
+      </w:r>
+      <w:r>
+        <w:rPr>
+          <w:rStyle w:val="SourceCodenon-literal"/>
+          <w:rFonts w:ascii="Courier New" w:hAnsi="Courier New"/>
+          <w:i w:val="0"/>
+        </w:rPr>
+        <w:tab/>
+        <w:t xml:space="preserve"># </w:t>
+      </w:r>
+      <w:proofErr w:type="spellStart"/>
+      <w:r>
+        <w:rPr>
+          <w:rStyle w:val="SourceCodenon-literal"/>
+          <w:rFonts w:ascii="Courier New" w:hAnsi="Courier New"/>
+          <w:i w:val="0"/>
+        </w:rPr>
+        <w:t>Unstage</w:t>
+      </w:r>
+      <w:proofErr w:type="spellEnd"/>
+      <w:r>
+        <w:rPr>
+          <w:rStyle w:val="SourceCodenon-literal"/>
+          <w:rFonts w:ascii="Courier New" w:hAnsi="Courier New"/>
+          <w:i w:val="0"/>
+        </w:rPr>
+        <w:t xml:space="preserve"> everything</w:t>
       </w:r>
     </w:p>
     <w:p>
@@ -11596,7 +12640,6 @@
       </w:pPr>
       <w:bookmarkStart w:id="54" w:name="_Toc237960244"/>
       <w:r>
-        <w:lastRenderedPageBreak/>
         <w:t>Push Changes to the Remote Repository</w:t>
       </w:r>
       <w:bookmarkEnd w:id="54"/>
@@ -11783,12 +12826,14 @@
       <w:r>
         <w:t xml:space="preserve">cd </w:t>
       </w:r>
+      <w:proofErr w:type="spellStart"/>
       <w:r>
         <w:rPr>
           <w:rStyle w:val="SourceCodenon-literal"/>
         </w:rPr>
         <w:t>TaxToolsDirectory</w:t>
       </w:r>
+      <w:proofErr w:type="spellEnd"/>
     </w:p>
     <w:p>
       <w:pPr>
@@ -11798,8 +12843,13 @@
         <w:t xml:space="preserve">$ </w:t>
       </w:r>
       <w:r>
-        <w:t>git pull</w:t>
-      </w:r>
+        <w:t xml:space="preserve">git </w:t>
+      </w:r>
+      <w:proofErr w:type="gramStart"/>
+      <w:r>
+        <w:t>pull</w:t>
+      </w:r>
+      <w:proofErr w:type="gramEnd"/>
     </w:p>
     <w:p>
       <w:pPr>
@@ -11908,8 +12958,13 @@
         <w:ind w:firstLine="720"/>
       </w:pPr>
       <w:r>
-        <w:t>$ code .</w:t>
-      </w:r>
+        <w:t xml:space="preserve">$ </w:t>
+      </w:r>
+      <w:proofErr w:type="gramStart"/>
+      <w:r>
+        <w:t>code .</w:t>
+      </w:r>
+      <w:proofErr w:type="gramEnd"/>
       <w:r>
         <w:tab/>
         <w:t># Run VS Code editor in the current directory.</w:t>
@@ -11935,8 +12990,13 @@
         <w:ind w:firstLine="720"/>
       </w:pPr>
       <w:r>
-        <w:t>$ git add .</w:t>
-      </w:r>
+        <w:t xml:space="preserve">$ git </w:t>
+      </w:r>
+      <w:proofErr w:type="gramStart"/>
+      <w:r>
+        <w:t>add .</w:t>
+      </w:r>
+      <w:proofErr w:type="gramEnd"/>
       <w:r>
         <w:tab/>
         <w:t># Add the changes to the staging area.</w:t>
@@ -12068,6 +13128,7 @@
         <w:pStyle w:val="SourceCode"/>
       </w:pPr>
       <w:r>
+        <w:lastRenderedPageBreak/>
         <w:t>$ edit version.js version.html</w:t>
       </w:r>
     </w:p>
@@ -12121,7 +13182,15 @@
         <w:t>Update the Web page with the new prototype version</w:t>
       </w:r>
       <w:r>
-        <w:t xml:space="preserve">. Open DreamWeaver and push </w:t>
+        <w:t xml:space="preserve">. Open </w:t>
+      </w:r>
+      <w:proofErr w:type="spellStart"/>
+      <w:r>
+        <w:t>DreamWeaver</w:t>
+      </w:r>
+      <w:proofErr w:type="spellEnd"/>
+      <w:r>
+        <w:t xml:space="preserve"> and push </w:t>
       </w:r>
       <w:r>
         <w:t xml:space="preserve">the </w:t>
@@ -12230,7 +13299,6 @@
         <w:pStyle w:val="SourceCode"/>
       </w:pPr>
       <w:r>
-        <w:lastRenderedPageBreak/>
         <w:t>$ git checkout main</w:t>
       </w:r>
     </w:p>
@@ -12239,8 +13307,13 @@
         <w:pStyle w:val="SourceCode"/>
       </w:pPr>
       <w:r>
-        <w:t>$ git pull</w:t>
-      </w:r>
+        <w:t xml:space="preserve">$ git </w:t>
+      </w:r>
+      <w:proofErr w:type="gramStart"/>
+      <w:r>
+        <w:t>pull</w:t>
+      </w:r>
+      <w:proofErr w:type="gramEnd"/>
     </w:p>
     <w:p>
       <w:pPr>
@@ -12635,8 +13708,13 @@
         <w:pStyle w:val="SourceCode"/>
       </w:pPr>
       <w:r>
-        <w:t>$ cd ..</w:t>
-      </w:r>
+        <w:t>$ cd</w:t>
+      </w:r>
+      <w:proofErr w:type="gramStart"/>
+      <w:r>
+        <w:t xml:space="preserve"> ..</w:t>
+      </w:r>
+      <w:proofErr w:type="gramEnd"/>
     </w:p>
     <w:p>
       <w:pPr>
@@ -12668,6 +13746,7 @@
         <w:pStyle w:val="SourceCode"/>
       </w:pPr>
       <w:r>
+        <w:lastRenderedPageBreak/>
         <w:t>$ git checkout main</w:t>
       </w:r>
     </w:p>
@@ -12755,6 +13834,7 @@
       <w:r>
         <w:t xml:space="preserve">$ git tag </w:t>
       </w:r>
+      <w:proofErr w:type="spellStart"/>
       <w:r>
         <w:rPr>
           <w:rStyle w:val="SourceCodenon-literal"/>
@@ -12779,6 +13859,7 @@
         </w:rPr>
         <w:t>umber</w:t>
       </w:r>
+      <w:proofErr w:type="spellEnd"/>
       <w:r>
         <w:rPr>
           <w:rStyle w:val="SourceCodenon-literal"/>
@@ -12892,41 +13973,86 @@
       <w:r>
         <w:t>$ cd $TAXTOOLS</w:t>
       </w:r>
+      <w:proofErr w:type="gramStart"/>
       <w:r>
         <w:t>/..</w:t>
       </w:r>
-    </w:p>
-    <w:p>
-      <w:pPr>
-        <w:pStyle w:val="SourceCode"/>
-      </w:pPr>
-      <w:r>
-        <w:t>$ rm –rf TaxToolsNew</w:t>
-      </w:r>
-    </w:p>
-    <w:p>
-      <w:pPr>
-        <w:pStyle w:val="SourceCode"/>
-      </w:pPr>
-      <w:r>
-        <w:lastRenderedPageBreak/>
-        <w:t>$ TaxToolsDev/tools/UpdateRelease</w:t>
-      </w:r>
+      <w:proofErr w:type="gramEnd"/>
+    </w:p>
+    <w:p>
+      <w:pPr>
+        <w:pStyle w:val="SourceCode"/>
+      </w:pPr>
+      <w:r>
+        <w:t xml:space="preserve">$ rm –rf </w:t>
+      </w:r>
+      <w:proofErr w:type="spellStart"/>
+      <w:r>
+        <w:t>TaxToolsNew</w:t>
+      </w:r>
+      <w:proofErr w:type="spellEnd"/>
+    </w:p>
+    <w:p>
+      <w:pPr>
+        <w:pStyle w:val="SourceCode"/>
+      </w:pPr>
+      <w:r>
+        <w:t xml:space="preserve">$ </w:t>
+      </w:r>
+      <w:proofErr w:type="spellStart"/>
+      <w:r>
+        <w:t>TaxToolsDev</w:t>
+      </w:r>
+      <w:proofErr w:type="spellEnd"/>
+      <w:r>
+        <w:t>/tools/</w:t>
+      </w:r>
+      <w:proofErr w:type="spellStart"/>
+      <w:r>
+        <w:t>UpdateRelease</w:t>
+      </w:r>
+      <w:proofErr w:type="spellEnd"/>
       <w:r>
         <w:tab/>
       </w:r>
       <w:r>
         <w:tab/>
-        <w:t># Copy TaxToolsDev to TaxToolsNew</w:t>
-      </w:r>
-    </w:p>
-    <w:p>
-      <w:pPr>
-        <w:pStyle w:val="SourceCode"/>
-      </w:pPr>
-      <w:r>
-        <w:t>$ dircmp TaxTools TaxToolsNew</w:t>
-      </w:r>
+        <w:t xml:space="preserve"># Copy </w:t>
+      </w:r>
+      <w:proofErr w:type="spellStart"/>
+      <w:r>
+        <w:t>TaxToolsDev</w:t>
+      </w:r>
+      <w:proofErr w:type="spellEnd"/>
+      <w:r>
+        <w:t xml:space="preserve"> to </w:t>
+      </w:r>
+      <w:proofErr w:type="spellStart"/>
+      <w:r>
+        <w:t>TaxToolsNew</w:t>
+      </w:r>
+      <w:proofErr w:type="spellEnd"/>
+    </w:p>
+    <w:p>
+      <w:pPr>
+        <w:pStyle w:val="SourceCode"/>
+      </w:pPr>
+      <w:r>
+        <w:t xml:space="preserve">$ </w:t>
+      </w:r>
+      <w:proofErr w:type="spellStart"/>
+      <w:r>
+        <w:t>dircmp</w:t>
+      </w:r>
+      <w:proofErr w:type="spellEnd"/>
+      <w:r>
+        <w:t xml:space="preserve"> TaxTools </w:t>
+      </w:r>
+      <w:proofErr w:type="spellStart"/>
+      <w:r>
+        <w:t>TaxToolsNew</w:t>
+      </w:r>
+      <w:proofErr w:type="spellEnd"/>
       <w:r>
         <w:tab/>
       </w:r>
@@ -12956,7 +14082,15 @@
         <w:t xml:space="preserve">make a backup copy and </w:t>
       </w:r>
       <w:r>
-        <w:t>replace the TaxTools directory with TaxToolsNew.</w:t>
+        <w:t xml:space="preserve">replace the TaxTools directory with </w:t>
+      </w:r>
+      <w:proofErr w:type="spellStart"/>
+      <w:r>
+        <w:t>TaxToolsNew</w:t>
+      </w:r>
+      <w:proofErr w:type="spellEnd"/>
+      <w:r>
+        <w:t>.</w:t>
       </w:r>
     </w:p>
     <w:p>
@@ -12967,14 +14101,24 @@
         <w:t>$</w:t>
       </w:r>
       <w:r>
-        <w:t xml:space="preserve"> mv TaxToolsNew TaxTools-</w:t>
-      </w:r>
+        <w:t xml:space="preserve"> mv </w:t>
+      </w:r>
+      <w:proofErr w:type="spellStart"/>
+      <w:r>
+        <w:t>TaxToolsNew</w:t>
+      </w:r>
+      <w:proofErr w:type="spellEnd"/>
+      <w:r>
+        <w:t xml:space="preserve"> TaxTools-</w:t>
+      </w:r>
+      <w:proofErr w:type="spellStart"/>
       <w:r>
         <w:rPr>
           <w:rStyle w:val="SourceCodenon-literal"/>
         </w:rPr>
         <w:t>VersionNumber</w:t>
       </w:r>
+      <w:proofErr w:type="spellEnd"/>
     </w:p>
     <w:p>
       <w:pPr>
@@ -12987,13 +14131,21 @@
         <w:t xml:space="preserve">$ </w:t>
       </w:r>
       <w:r>
-        <w:t>tar –cv</w:t>
+        <w:t>tar –</w:t>
+      </w:r>
+      <w:proofErr w:type="spellStart"/>
+      <w:r>
+        <w:t>cv</w:t>
       </w:r>
       <w:r>
         <w:t>z</w:t>
       </w:r>
       <w:r>
-        <w:t>f TaxTools-</w:t>
+        <w:t>f</w:t>
+      </w:r>
+      <w:proofErr w:type="spellEnd"/>
+      <w:r>
+        <w:t xml:space="preserve"> TaxTools-</w:t>
       </w:r>
       <w:r>
         <w:rPr>
@@ -13004,12 +14156,14 @@
       <w:r>
         <w:t>.tgz TaxTools-</w:t>
       </w:r>
+      <w:proofErr w:type="spellStart"/>
       <w:r>
         <w:rPr>
           <w:rStyle w:val="SourceCodenon-literal"/>
         </w:rPr>
         <w:t>VersionNumber</w:t>
       </w:r>
+      <w:proofErr w:type="spellEnd"/>
     </w:p>
     <w:p>
       <w:pPr>
@@ -13059,12 +14213,14 @@
       <w:r>
         <w:t>TaxTools-</w:t>
       </w:r>
+      <w:proofErr w:type="spellStart"/>
       <w:r>
         <w:rPr>
           <w:rStyle w:val="SourceCodenon-literal"/>
         </w:rPr>
         <w:t>VersionNumber</w:t>
       </w:r>
+      <w:proofErr w:type="spellEnd"/>
       <w:r>
         <w:t xml:space="preserve"> TaxTools</w:t>
       </w:r>
@@ -13104,8 +14260,13 @@
         <w:t xml:space="preserve">$ </w:t>
       </w:r>
       <w:r>
-        <w:t>Open DreamWeaver</w:t>
-      </w:r>
+        <w:t xml:space="preserve">Open </w:t>
+      </w:r>
+      <w:proofErr w:type="spellStart"/>
+      <w:r>
+        <w:t>DreamWeaver</w:t>
+      </w:r>
+      <w:proofErr w:type="spellEnd"/>
     </w:p>
     <w:p>
       <w:pPr>
@@ -13309,6 +14470,7 @@
       <w:r>
         <w:t xml:space="preserve">$ git tag </w:t>
       </w:r>
+      <w:proofErr w:type="spellStart"/>
       <w:r>
         <w:rPr>
           <w:rStyle w:val="SourceCodenon-literal"/>
@@ -13333,6 +14495,7 @@
         </w:rPr>
         <w:t>umber</w:t>
       </w:r>
+      <w:proofErr w:type="spellEnd"/>
       <w:r>
         <w:rPr>
           <w:rStyle w:val="SourceCodenon-literal"/>
@@ -13450,12 +14613,14 @@
       <w:r>
         <w:t xml:space="preserve">--delete </w:t>
       </w:r>
+      <w:proofErr w:type="spellStart"/>
       <w:r>
         <w:rPr>
           <w:rStyle w:val="SourceCodenon-literal"/>
         </w:rPr>
         <w:t>tagName</w:t>
       </w:r>
+      <w:proofErr w:type="spellEnd"/>
       <w:r>
         <w:rPr>
           <w:rStyle w:val="SourceCodenon-literal"/>
@@ -13491,12 +14656,14 @@
       <w:r>
         <w:t xml:space="preserve">--delete </w:t>
       </w:r>
+      <w:proofErr w:type="spellStart"/>
       <w:r>
         <w:rPr>
           <w:rStyle w:val="SourceCodenon-literal"/>
         </w:rPr>
         <w:t>tagName</w:t>
       </w:r>
+      <w:proofErr w:type="spellEnd"/>
       <w:r>
         <w:tab/>
       </w:r>
@@ -13510,6 +14677,7 @@
         <w:rPr>
           <w:lang w:eastAsia="ar-SA"/>
         </w:rPr>
+        <w:lastRenderedPageBreak/>
         <w:t xml:space="preserve">Git </w:t>
       </w:r>
       <w:r>
@@ -13662,7 +14830,6 @@
         <w:rPr>
           <w:lang w:eastAsia="ar-SA"/>
         </w:rPr>
-        <w:lastRenderedPageBreak/>
         <w:t>To list guides</w:t>
       </w:r>
       <w:r>
@@ -13915,12 +15082,14 @@
       <w:r>
         <w:t xml:space="preserve"> </w:t>
       </w:r>
+      <w:proofErr w:type="spellStart"/>
       <w:r>
         <w:rPr>
           <w:rStyle w:val="SourceCodechar"/>
         </w:rPr>
         <w:t>init</w:t>
       </w:r>
+      <w:proofErr w:type="spellEnd"/>
       <w:r>
         <w:t xml:space="preserve"> command. Once initialized, the directory will have a subdirectory named </w:t>
       </w:r>
@@ -14040,7 +15209,11 @@
         <w:pStyle w:val="Body-Text"/>
       </w:pPr>
       <w:r>
-        <w:t xml:space="preserve">Visual Studio Code, usually called VS Code, is a popular, free editor for developers. There are many extensions that give it additional capabilities and interoperability with other tools, but it comes with build in support for HTML, CSS, and JavaScript. For more information on VS Code, go to </w:t>
+        <w:t xml:space="preserve">Visual Studio Code, usually called VS Code, is a popular, free editor for developers. There are many extensions that give it additional capabilities and interoperability with other tools, but it comes with build </w:t>
+      </w:r>
+      <w:r>
+        <w:lastRenderedPageBreak/>
+        <w:t xml:space="preserve">in support for HTML, CSS, and JavaScript. For more information on VS Code, go to </w:t>
       </w:r>
       <w:hyperlink r:id="rId12" w:history="1">
         <w:r>
@@ -14213,7 +15386,6 @@
         </w:numPr>
       </w:pPr>
       <w:r>
-        <w:lastRenderedPageBreak/>
         <w:t xml:space="preserve">Click </w:t>
       </w:r>
       <w:r>
@@ -14437,8 +15609,30 @@
         <w:rPr>
           <w:rStyle w:val="SourceCodechar"/>
         </w:rPr>
-        <w:t>.vscode/settings.json</w:t>
-      </w:r>
+        <w:t>.</w:t>
+      </w:r>
+      <w:proofErr w:type="spellStart"/>
+      <w:r>
+        <w:rPr>
+          <w:rStyle w:val="SourceCodechar"/>
+        </w:rPr>
+        <w:t>vscode</w:t>
+      </w:r>
+      <w:proofErr w:type="spellEnd"/>
+      <w:r>
+        <w:rPr>
+          <w:rStyle w:val="SourceCodechar"/>
+        </w:rPr>
+        <w:t>/</w:t>
+      </w:r>
+      <w:proofErr w:type="spellStart"/>
+      <w:r>
+        <w:rPr>
+          <w:rStyle w:val="SourceCodechar"/>
+        </w:rPr>
+        <w:t>settings.json</w:t>
+      </w:r>
+      <w:proofErr w:type="spellEnd"/>
       <w:r>
         <w:t>. at the top of the project directory. This is a workspace file are should be checked into the Git repository.</w:t>
       </w:r>
@@ -14484,8 +15678,12 @@
       </w:r>
       <w:r>
         <w:tab/>
+      </w:r>
+      <w:proofErr w:type="spellStart"/>
+      <w:r>
         <w:t>Tabsize</w:t>
       </w:r>
+      <w:proofErr w:type="spellEnd"/>
       <w:r>
         <w:tab/>
       </w:r>
@@ -14632,7 +15830,21 @@
         <w:rPr>
           <w:lang w:eastAsia="ar-SA"/>
         </w:rPr>
-        <w:t>I use the following extensions. VS Code does not support printing, so you need to add an extension to provide the functionality. The Print extension adds print icons to the top banner of the editor panel. The ESLint and Prettier extensions are discussed below.</w:t>
+        <w:t xml:space="preserve">I use the following extensions. VS Code does not support printing, so you need to add an extension to provide the functionality. The Print extension adds print icons to the top banner of the editor panel. The </w:t>
+      </w:r>
+      <w:proofErr w:type="spellStart"/>
+      <w:r>
+        <w:rPr>
+          <w:lang w:eastAsia="ar-SA"/>
+        </w:rPr>
+        <w:t>ESLint</w:t>
+      </w:r>
+      <w:proofErr w:type="spellEnd"/>
+      <w:r>
+        <w:rPr>
+          <w:lang w:eastAsia="ar-SA"/>
+        </w:rPr>
+        <w:t xml:space="preserve"> and Prettier extensions are discussed below.</w:t>
       </w:r>
     </w:p>
     <w:p>
@@ -14641,6 +15853,7 @@
         <w:spacing w:after="0"/>
       </w:pPr>
       <w:r>
+        <w:lastRenderedPageBreak/>
         <w:t>Print</w:t>
       </w:r>
     </w:p>
@@ -14658,9 +15871,11 @@
         <w:pStyle w:val="Hang-Medium"/>
         <w:spacing w:after="0"/>
       </w:pPr>
+      <w:proofErr w:type="spellStart"/>
       <w:r>
         <w:t>ESLint</w:t>
       </w:r>
+      <w:proofErr w:type="spellEnd"/>
     </w:p>
     <w:p>
       <w:pPr>
@@ -14682,9 +15897,11 @@
         <w:pStyle w:val="Hang-Medium"/>
         <w:spacing w:after="0"/>
       </w:pPr>
+      <w:proofErr w:type="spellStart"/>
       <w:r>
         <w:t>GitLens</w:t>
       </w:r>
+      <w:proofErr w:type="spellEnd"/>
     </w:p>
     <w:p>
       <w:pPr>
@@ -14728,7 +15945,15 @@
         <w:spacing w:after="0"/>
       </w:pPr>
       <w:r>
-        <w:t>Open in Browser (by TechER)</w:t>
+        <w:t xml:space="preserve">Open in Browser (by </w:t>
+      </w:r>
+      <w:proofErr w:type="spellStart"/>
+      <w:r>
+        <w:t>TechER</w:t>
+      </w:r>
+      <w:proofErr w:type="spellEnd"/>
+      <w:r>
+        <w:t>)</w:t>
       </w:r>
     </w:p>
     <w:p>
@@ -14760,8 +15985,13 @@
         <w:spacing w:after="0"/>
       </w:pPr>
       <w:r>
-        <w:t>Ctrl + ,</w:t>
-      </w:r>
+        <w:t xml:space="preserve">Ctrl </w:t>
+      </w:r>
+      <w:proofErr w:type="gramStart"/>
+      <w:r>
+        <w:t>+ ,</w:t>
+      </w:r>
+      <w:proofErr w:type="gramEnd"/>
       <w:r>
         <w:tab/>
         <w:t>Open settings</w:t>
@@ -14786,8 +16016,13 @@
         <w:spacing w:after="0"/>
       </w:pPr>
       <w:r>
-        <w:t>Ctrl + K  S</w:t>
-      </w:r>
+        <w:t xml:space="preserve">Ctrl + </w:t>
+      </w:r>
+      <w:proofErr w:type="gramStart"/>
+      <w:r>
+        <w:t>K  S</w:t>
+      </w:r>
+      <w:proofErr w:type="gramEnd"/>
       <w:r>
         <w:tab/>
         <w:t>Save all</w:t>
@@ -14799,7 +16034,6 @@
         <w:spacing w:after="0"/>
       </w:pPr>
       <w:r>
-        <w:lastRenderedPageBreak/>
         <w:t>Shift + Alt + F</w:t>
       </w:r>
       <w:r>
@@ -14895,12 +16129,12 @@
       <w:pPr>
         <w:pStyle w:val="Heading2"/>
       </w:pPr>
-      <w:bookmarkStart w:id="69" w:name="_Toc227669205"/>
-      <w:bookmarkStart w:id="70" w:name="_Toc237960258"/>
+      <w:bookmarkStart w:id="69" w:name="_Toc237960258"/>
+      <w:bookmarkStart w:id="70" w:name="_Toc227669205"/>
       <w:r>
         <w:t>Node and NPM</w:t>
       </w:r>
-      <w:bookmarkEnd w:id="70"/>
+      <w:bookmarkEnd w:id="69"/>
     </w:p>
     <w:p>
       <w:pPr>
@@ -14988,12 +16222,14 @@
       <w:r>
         <w:t xml:space="preserve">In a terminal window, initialize the package manager (NPM) for use with your project. This step only needs to be done once, so this step has already been done. This step creates the file </w:t>
       </w:r>
+      <w:proofErr w:type="spellStart"/>
       <w:r>
         <w:rPr>
           <w:rStyle w:val="SourceCodechar"/>
         </w:rPr>
         <w:t>package.json</w:t>
       </w:r>
+      <w:proofErr w:type="spellEnd"/>
       <w:r>
         <w:t>, which NPM uses to track which packages have been installed and their dependencies.</w:t>
       </w:r>
@@ -15005,6 +16241,7 @@
       <w:r>
         <w:t xml:space="preserve">$ cd </w:t>
       </w:r>
+      <w:proofErr w:type="spellStart"/>
       <w:r>
         <w:rPr>
           <w:rStyle w:val="SourceCodenon-literal"/>
@@ -15017,13 +16254,30 @@
         </w:rPr>
         <w:t>Directory</w:t>
       </w:r>
-    </w:p>
-    <w:p>
-      <w:pPr>
-        <w:pStyle w:val="SourceCode"/>
-      </w:pPr>
-      <w:r>
-        <w:t>$ npm init -y</w:t>
+      <w:proofErr w:type="spellEnd"/>
+    </w:p>
+    <w:p>
+      <w:pPr>
+        <w:pStyle w:val="SourceCode"/>
+      </w:pPr>
+      <w:r>
+        <w:t xml:space="preserve">$ </w:t>
+      </w:r>
+      <w:proofErr w:type="spellStart"/>
+      <w:r>
+        <w:t>npm</w:t>
+      </w:r>
+      <w:proofErr w:type="spellEnd"/>
+      <w:r>
+        <w:t xml:space="preserve"> </w:t>
+      </w:r>
+      <w:proofErr w:type="spellStart"/>
+      <w:r>
+        <w:t>init</w:t>
+      </w:r>
+      <w:proofErr w:type="spellEnd"/>
+      <w:r>
+        <w:t xml:space="preserve"> -y</w:t>
       </w:r>
     </w:p>
     <w:p>
@@ -15048,29 +16302,55 @@
         <w:pStyle w:val="SourceCode"/>
       </w:pPr>
       <w:r>
-        <w:t xml:space="preserve">$ npm install </w:t>
-      </w:r>
+        <w:t xml:space="preserve">$ </w:t>
+      </w:r>
+      <w:proofErr w:type="spellStart"/>
+      <w:r>
+        <w:t>npm</w:t>
+      </w:r>
+      <w:proofErr w:type="spellEnd"/>
+      <w:r>
+        <w:t xml:space="preserve"> install </w:t>
+      </w:r>
+      <w:proofErr w:type="spellStart"/>
       <w:r>
         <w:rPr>
           <w:rStyle w:val="SourceCodenon-literal"/>
         </w:rPr>
         <w:t>packageName</w:t>
       </w:r>
-    </w:p>
-    <w:p>
-      <w:pPr>
-        <w:pStyle w:val="SourceCode"/>
-      </w:pPr>
-      <w:r>
-        <w:t>$ npm list</w:t>
-      </w:r>
-    </w:p>
-    <w:p>
-      <w:pPr>
-        <w:pStyle w:val="SourceCode"/>
-      </w:pPr>
-      <w:r>
-        <w:t>$ npm outdated</w:t>
+      <w:proofErr w:type="spellEnd"/>
+    </w:p>
+    <w:p>
+      <w:pPr>
+        <w:pStyle w:val="SourceCode"/>
+      </w:pPr>
+      <w:r>
+        <w:t xml:space="preserve">$ </w:t>
+      </w:r>
+      <w:proofErr w:type="spellStart"/>
+      <w:r>
+        <w:t>npm</w:t>
+      </w:r>
+      <w:proofErr w:type="spellEnd"/>
+      <w:r>
+        <w:t xml:space="preserve"> list</w:t>
+      </w:r>
+    </w:p>
+    <w:p>
+      <w:pPr>
+        <w:pStyle w:val="SourceCode"/>
+      </w:pPr>
+      <w:r>
+        <w:t xml:space="preserve">$ </w:t>
+      </w:r>
+      <w:proofErr w:type="spellStart"/>
+      <w:r>
+        <w:t>npm</w:t>
+      </w:r>
+      <w:proofErr w:type="spellEnd"/>
+      <w:r>
+        <w:t xml:space="preserve"> outdated</w:t>
       </w:r>
       <w:r>
         <w:tab/>
@@ -15085,28 +16365,49 @@
         </w:rPr>
       </w:pPr>
       <w:r>
-        <w:t xml:space="preserve">$ npm uninstall </w:t>
-      </w:r>
+        <w:lastRenderedPageBreak/>
+        <w:t xml:space="preserve">$ </w:t>
+      </w:r>
+      <w:proofErr w:type="spellStart"/>
+      <w:r>
+        <w:t>npm</w:t>
+      </w:r>
+      <w:proofErr w:type="spellEnd"/>
+      <w:r>
+        <w:t xml:space="preserve"> uninstall </w:t>
+      </w:r>
+      <w:proofErr w:type="spellStart"/>
       <w:r>
         <w:rPr>
           <w:rStyle w:val="SourceCodenon-literal"/>
         </w:rPr>
         <w:t>packageName</w:t>
       </w:r>
-    </w:p>
-    <w:p>
-      <w:pPr>
-        <w:pStyle w:val="SourceCode"/>
-      </w:pPr>
-      <w:r>
-        <w:t>$ npm update [</w:t>
-      </w:r>
+      <w:proofErr w:type="spellEnd"/>
+    </w:p>
+    <w:p>
+      <w:pPr>
+        <w:pStyle w:val="SourceCode"/>
+      </w:pPr>
+      <w:r>
+        <w:t xml:space="preserve">$ </w:t>
+      </w:r>
+      <w:proofErr w:type="spellStart"/>
+      <w:r>
+        <w:t>npm</w:t>
+      </w:r>
+      <w:proofErr w:type="spellEnd"/>
+      <w:r>
+        <w:t xml:space="preserve"> update [</w:t>
+      </w:r>
+      <w:proofErr w:type="spellStart"/>
       <w:r>
         <w:rPr>
           <w:rStyle w:val="SourceCodenon-literal"/>
         </w:rPr>
         <w:t>packageName</w:t>
       </w:r>
+      <w:proofErr w:type="spellEnd"/>
       <w:r>
         <w:t>]</w:t>
       </w:r>
@@ -15195,6 +16496,7 @@
       <w:r>
         <w:t xml:space="preserve">$ cd </w:t>
       </w:r>
+      <w:proofErr w:type="spellStart"/>
       <w:r>
         <w:rPr>
           <w:rStyle w:val="SourceCodenon-literal"/>
@@ -15207,19 +16509,34 @@
         </w:rPr>
         <w:t>Directory</w:t>
       </w:r>
-    </w:p>
-    <w:p>
-      <w:pPr>
-        <w:pStyle w:val="SourceCode"/>
-        <w:rPr>
-          <w:lang w:eastAsia="ar-SA"/>
-        </w:rPr>
-      </w:pPr>
-      <w:r>
-        <w:rPr>
-          <w:lang w:eastAsia="ar-SA"/>
-        </w:rPr>
-        <w:t>$ npm install prettier --save-dev</w:t>
+      <w:proofErr w:type="spellEnd"/>
+    </w:p>
+    <w:p>
+      <w:pPr>
+        <w:pStyle w:val="SourceCode"/>
+        <w:rPr>
+          <w:lang w:eastAsia="ar-SA"/>
+        </w:rPr>
+      </w:pPr>
+      <w:r>
+        <w:rPr>
+          <w:lang w:eastAsia="ar-SA"/>
+        </w:rPr>
+        <w:t xml:space="preserve">$ </w:t>
+      </w:r>
+      <w:proofErr w:type="spellStart"/>
+      <w:r>
+        <w:rPr>
+          <w:lang w:eastAsia="ar-SA"/>
+        </w:rPr>
+        <w:t>npm</w:t>
+      </w:r>
+      <w:proofErr w:type="spellEnd"/>
+      <w:r>
+        <w:rPr>
+          <w:lang w:eastAsia="ar-SA"/>
+        </w:rPr>
+        <w:t xml:space="preserve"> install prettier --save-dev</w:t>
       </w:r>
     </w:p>
     <w:p>
@@ -15256,7 +16573,15 @@
         </w:rPr>
       </w:pPr>
       <w:r>
-        <w:t xml:space="preserve">$ npx prettier </w:t>
+        <w:t xml:space="preserve">$ </w:t>
+      </w:r>
+      <w:proofErr w:type="spellStart"/>
+      <w:r>
+        <w:t>npx</w:t>
+      </w:r>
+      <w:proofErr w:type="spellEnd"/>
+      <w:r>
+        <w:t xml:space="preserve"> prettier </w:t>
       </w:r>
       <w:r>
         <w:rPr>
@@ -15310,7 +16635,21 @@
         <w:rPr>
           <w:rStyle w:val="setting-item-label"/>
         </w:rPr>
-        <w:t xml:space="preserve">Format On </w:t>
+        <w:t xml:space="preserve">Format </w:t>
+      </w:r>
+      <w:proofErr w:type="gramStart"/>
+      <w:r>
+        <w:rPr>
+          <w:rStyle w:val="setting-item-label"/>
+        </w:rPr>
+        <w:t>On</w:t>
+      </w:r>
+      <w:proofErr w:type="gramEnd"/>
+      <w:r>
+        <w:rPr>
+          <w:rStyle w:val="setting-item-label"/>
+        </w:rPr>
+        <w:t xml:space="preserve"> </w:t>
       </w:r>
       <w:r>
         <w:t>Save</w:t>
@@ -15350,7 +16689,6 @@
         <w:rPr>
           <w:rStyle w:val="setting-item-label"/>
         </w:rPr>
-        <w:lastRenderedPageBreak/>
         <w:t>Editor</w:t>
       </w:r>
       <w:r>
@@ -15385,37 +16723,61 @@
         <w:pStyle w:val="Heading3"/>
       </w:pPr>
       <w:bookmarkStart w:id="73" w:name="_Toc237960261"/>
+      <w:proofErr w:type="spellStart"/>
       <w:r>
         <w:t>ESLint</w:t>
       </w:r>
       <w:bookmarkEnd w:id="73"/>
-    </w:p>
-    <w:p>
-      <w:pPr>
-        <w:pStyle w:val="Body-Text"/>
-        <w:rPr>
-          <w:lang w:eastAsia="ar-SA"/>
-        </w:rPr>
-      </w:pPr>
-      <w:r>
-        <w:rPr>
-          <w:lang w:eastAsia="ar-SA"/>
-        </w:rPr>
-        <w:t>NOTE: This does not work when the source code is hosted on Google Drive. Clone a new repository on the local system and use ESLint there.</w:t>
-      </w:r>
-    </w:p>
-    <w:p>
-      <w:pPr>
-        <w:pStyle w:val="Body-Text"/>
-        <w:rPr>
-          <w:lang w:eastAsia="ar-SA"/>
-        </w:rPr>
-      </w:pPr>
-      <w:r>
-        <w:rPr>
-          <w:lang w:eastAsia="ar-SA"/>
-        </w:rPr>
-        <w:t xml:space="preserve">ESLint is the code checker used </w:t>
+      <w:proofErr w:type="spellEnd"/>
+    </w:p>
+    <w:p>
+      <w:pPr>
+        <w:pStyle w:val="Body-Text"/>
+        <w:rPr>
+          <w:lang w:eastAsia="ar-SA"/>
+        </w:rPr>
+      </w:pPr>
+      <w:r>
+        <w:rPr>
+          <w:lang w:eastAsia="ar-SA"/>
+        </w:rPr>
+        <w:t xml:space="preserve">NOTE: This does not work when the source code is hosted on Google Drive. Clone a new repository on the local system and use </w:t>
+      </w:r>
+      <w:proofErr w:type="spellStart"/>
+      <w:r>
+        <w:rPr>
+          <w:lang w:eastAsia="ar-SA"/>
+        </w:rPr>
+        <w:t>ESLint</w:t>
+      </w:r>
+      <w:proofErr w:type="spellEnd"/>
+      <w:r>
+        <w:rPr>
+          <w:lang w:eastAsia="ar-SA"/>
+        </w:rPr>
+        <w:t xml:space="preserve"> there.</w:t>
+      </w:r>
+    </w:p>
+    <w:p>
+      <w:pPr>
+        <w:pStyle w:val="Body-Text"/>
+        <w:rPr>
+          <w:lang w:eastAsia="ar-SA"/>
+        </w:rPr>
+      </w:pPr>
+      <w:proofErr w:type="spellStart"/>
+      <w:r>
+        <w:rPr>
+          <w:lang w:eastAsia="ar-SA"/>
+        </w:rPr>
+        <w:t>ESLint</w:t>
+      </w:r>
+      <w:proofErr w:type="spellEnd"/>
+      <w:r>
+        <w:rPr>
+          <w:lang w:eastAsia="ar-SA"/>
+        </w:rPr>
+        <w:t xml:space="preserve"> is the code checker used </w:t>
       </w:r>
       <w:r>
         <w:rPr>
@@ -15457,7 +16819,21 @@
         <w:rPr>
           <w:lang w:eastAsia="ar-SA"/>
         </w:rPr>
-        <w:t xml:space="preserve">Install the ESLint package. The </w:t>
+        <w:t xml:space="preserve">Install the </w:t>
+      </w:r>
+      <w:proofErr w:type="spellStart"/>
+      <w:r>
+        <w:rPr>
+          <w:lang w:eastAsia="ar-SA"/>
+        </w:rPr>
+        <w:t>ESLint</w:t>
+      </w:r>
+      <w:proofErr w:type="spellEnd"/>
+      <w:r>
+        <w:rPr>
+          <w:lang w:eastAsia="ar-SA"/>
+        </w:rPr>
+        <w:t xml:space="preserve"> package. The </w:t>
       </w:r>
       <w:r>
         <w:rPr>
@@ -15483,6 +16859,7 @@
       <w:r>
         <w:t xml:space="preserve">$ cd </w:t>
       </w:r>
+      <w:proofErr w:type="spellStart"/>
       <w:r>
         <w:rPr>
           <w:rStyle w:val="SourceCodenon-literal"/>
@@ -15495,19 +16872,48 @@
         </w:rPr>
         <w:t>Directory</w:t>
       </w:r>
-    </w:p>
-    <w:p>
-      <w:pPr>
-        <w:pStyle w:val="SourceCode"/>
-        <w:rPr>
-          <w:lang w:eastAsia="ar-SA"/>
-        </w:rPr>
-      </w:pPr>
-      <w:r>
-        <w:rPr>
-          <w:lang w:eastAsia="ar-SA"/>
-        </w:rPr>
-        <w:t>$ npm install eslint -–save-dev</w:t>
+      <w:proofErr w:type="spellEnd"/>
+    </w:p>
+    <w:p>
+      <w:pPr>
+        <w:pStyle w:val="SourceCode"/>
+        <w:rPr>
+          <w:lang w:eastAsia="ar-SA"/>
+        </w:rPr>
+      </w:pPr>
+      <w:r>
+        <w:rPr>
+          <w:lang w:eastAsia="ar-SA"/>
+        </w:rPr>
+        <w:t xml:space="preserve">$ </w:t>
+      </w:r>
+      <w:proofErr w:type="spellStart"/>
+      <w:r>
+        <w:rPr>
+          <w:lang w:eastAsia="ar-SA"/>
+        </w:rPr>
+        <w:t>npm</w:t>
+      </w:r>
+      <w:proofErr w:type="spellEnd"/>
+      <w:r>
+        <w:rPr>
+          <w:lang w:eastAsia="ar-SA"/>
+        </w:rPr>
+        <w:t xml:space="preserve"> install </w:t>
+      </w:r>
+      <w:proofErr w:type="spellStart"/>
+      <w:r>
+        <w:rPr>
+          <w:lang w:eastAsia="ar-SA"/>
+        </w:rPr>
+        <w:t>eslint</w:t>
+      </w:r>
+      <w:proofErr w:type="spellEnd"/>
+      <w:r>
+        <w:rPr>
+          <w:lang w:eastAsia="ar-SA"/>
+        </w:rPr>
+        <w:t xml:space="preserve"> -–save-dev</w:t>
       </w:r>
     </w:p>
     <w:p>
@@ -15533,22 +16939,72 @@
         <w:rPr>
           <w:lang w:eastAsia="ar-SA"/>
         </w:rPr>
-        <w:t>Create a default configuration for ESLint.</w:t>
-      </w:r>
-    </w:p>
-    <w:p>
-      <w:pPr>
-        <w:pStyle w:val="SourceCode"/>
-        <w:rPr>
-          <w:lang w:eastAsia="ar-SA"/>
-        </w:rPr>
-      </w:pPr>
-      <w:r>
-        <w:rPr>
-          <w:lang w:eastAsia="ar-SA"/>
-        </w:rPr>
-        <w:t>$ npx eslint –-init</w:t>
-      </w:r>
+        <w:t xml:space="preserve">Create a default configuration for </w:t>
+      </w:r>
+      <w:proofErr w:type="spellStart"/>
+      <w:r>
+        <w:rPr>
+          <w:lang w:eastAsia="ar-SA"/>
+        </w:rPr>
+        <w:t>ESLint</w:t>
+      </w:r>
+      <w:proofErr w:type="spellEnd"/>
+      <w:r>
+        <w:rPr>
+          <w:lang w:eastAsia="ar-SA"/>
+        </w:rPr>
+        <w:t>.</w:t>
+      </w:r>
+    </w:p>
+    <w:p>
+      <w:pPr>
+        <w:pStyle w:val="SourceCode"/>
+        <w:rPr>
+          <w:lang w:eastAsia="ar-SA"/>
+        </w:rPr>
+      </w:pPr>
+      <w:r>
+        <w:rPr>
+          <w:lang w:eastAsia="ar-SA"/>
+        </w:rPr>
+        <w:t xml:space="preserve">$ </w:t>
+      </w:r>
+      <w:proofErr w:type="spellStart"/>
+      <w:r>
+        <w:rPr>
+          <w:lang w:eastAsia="ar-SA"/>
+        </w:rPr>
+        <w:t>npx</w:t>
+      </w:r>
+      <w:proofErr w:type="spellEnd"/>
+      <w:r>
+        <w:rPr>
+          <w:lang w:eastAsia="ar-SA"/>
+        </w:rPr>
+        <w:t xml:space="preserve"> </w:t>
+      </w:r>
+      <w:proofErr w:type="spellStart"/>
+      <w:r>
+        <w:rPr>
+          <w:lang w:eastAsia="ar-SA"/>
+        </w:rPr>
+        <w:t>eslint</w:t>
+      </w:r>
+      <w:proofErr w:type="spellEnd"/>
+      <w:r>
+        <w:rPr>
+          <w:lang w:eastAsia="ar-SA"/>
+        </w:rPr>
+        <w:t xml:space="preserve"> –-</w:t>
+      </w:r>
+      <w:proofErr w:type="spellStart"/>
+      <w:r>
+        <w:rPr>
+          <w:lang w:eastAsia="ar-SA"/>
+        </w:rPr>
+        <w:t>init</w:t>
+      </w:r>
+      <w:proofErr w:type="spellEnd"/>
     </w:p>
     <w:p>
       <w:pPr>
@@ -15573,7 +17029,21 @@
         <w:rPr>
           <w:lang w:eastAsia="ar-SA"/>
         </w:rPr>
-        <w:t>Run ESLint on a file.</w:t>
+        <w:t xml:space="preserve">Run </w:t>
+      </w:r>
+      <w:proofErr w:type="spellStart"/>
+      <w:r>
+        <w:rPr>
+          <w:lang w:eastAsia="ar-SA"/>
+        </w:rPr>
+        <w:t>ESLint</w:t>
+      </w:r>
+      <w:proofErr w:type="spellEnd"/>
+      <w:r>
+        <w:rPr>
+          <w:lang w:eastAsia="ar-SA"/>
+        </w:rPr>
+        <w:t xml:space="preserve"> on a file.</w:t>
       </w:r>
     </w:p>
     <w:p>
@@ -15584,7 +17054,23 @@
         </w:rPr>
       </w:pPr>
       <w:r>
-        <w:t xml:space="preserve">$ npx eslint </w:t>
+        <w:t xml:space="preserve">$ </w:t>
+      </w:r>
+      <w:proofErr w:type="spellStart"/>
+      <w:r>
+        <w:t>npx</w:t>
+      </w:r>
+      <w:proofErr w:type="spellEnd"/>
+      <w:r>
+        <w:t xml:space="preserve"> </w:t>
+      </w:r>
+      <w:proofErr w:type="spellStart"/>
+      <w:r>
+        <w:t>eslint</w:t>
+      </w:r>
+      <w:proofErr w:type="spellEnd"/>
+      <w:r>
+        <w:t xml:space="preserve"> </w:t>
       </w:r>
       <w:r>
         <w:rPr>
@@ -15598,7 +17084,7 @@
         <w:pStyle w:val="SourceCode"/>
       </w:pPr>
     </w:p>
-    <w:bookmarkEnd w:id="69"/>
+    <w:bookmarkEnd w:id="70"/>
     <w:p>
       <w:pPr>
         <w:pStyle w:val="Body-Text"/>
@@ -15608,7 +17094,15 @@
         </w:numPr>
       </w:pPr>
       <w:r>
-        <w:t>In VS Code, install the extension ESLint. Restart VS Code.</w:t>
+        <w:t xml:space="preserve">In VS Code, install the extension </w:t>
+      </w:r>
+      <w:proofErr w:type="spellStart"/>
+      <w:r>
+        <w:t>ESLint</w:t>
+      </w:r>
+      <w:proofErr w:type="spellEnd"/>
+      <w:r>
+        <w:t>. Restart VS Code.</w:t>
       </w:r>
     </w:p>
     <w:p>
@@ -15740,6 +17234,7 @@
         </w:numPr>
       </w:pPr>
       <w:r>
+        <w:lastRenderedPageBreak/>
         <w:t>Git will be install</w:t>
       </w:r>
       <w:r>
@@ -15767,15 +17262,15 @@
 </file>
 
 <file path=word/endnotes.xml><?xml version="1.0" encoding="utf-8"?>
-<w:endnotes xmlns:ve="http://schemas.openxmlformats.org/markup-compatibility/2006" xmlns:o="urn:schemas-microsoft-com:office:office" xmlns:r="http://schemas.openxmlformats.org/officeDocument/2006/relationships" xmlns:m="http://schemas.openxmlformats.org/officeDocument/2006/math" xmlns:v="urn:schemas-microsoft-com:vml" xmlns:wp="http://schemas.openxmlformats.org/drawingml/2006/wordprocessingDrawing" xmlns:w10="urn:schemas-microsoft-com:office:word" xmlns:w="http://schemas.openxmlformats.org/wordprocessingml/2006/main" xmlns:wne="http://schemas.microsoft.com/office/word/2006/wordml">
-  <w:endnote w:type="separator" w:id="0">
+<w:endnotes xmlns:wpc="http://schemas.microsoft.com/office/word/2010/wordprocessingCanvas" xmlns:cx="http://schemas.microsoft.com/office/drawing/2014/chartex" xmlns:cx1="http://schemas.microsoft.com/office/drawing/2015/9/8/chartex" xmlns:cx2="http://schemas.microsoft.com/office/drawing/2015/10/21/chartex" xmlns:cx3="http://schemas.microsoft.com/office/drawing/2016/5/9/chartex" xmlns:cx4="http://schemas.microsoft.com/office/drawing/2016/5/10/chartex" xmlns:cx5="http://schemas.microsoft.com/office/drawing/2016/5/11/chartex" xmlns:cx6="http://schemas.microsoft.com/office/drawing/2016/5/12/chartex" xmlns:cx7="http://schemas.microsoft.com/office/drawing/2016/5/13/chartex" xmlns:cx8="http://schemas.microsoft.com/office/drawing/2016/5/14/chartex" xmlns:mc="http://schemas.openxmlformats.org/markup-compatibility/2006" xmlns:aink="http://schemas.microsoft.com/office/drawing/2016/ink" xmlns:am3d="http://schemas.microsoft.com/office/drawing/2017/model3d" xmlns:o="urn:schemas-microsoft-com:office:office" xmlns:oel="http://schemas.microsoft.com/office/2019/extlst" xmlns:r="http://schemas.openxmlformats.org/officeDocument/2006/relationships" xmlns:m="http://schemas.openxmlformats.org/officeDocument/2006/math" xmlns:v="urn:schemas-microsoft-com:vml" xmlns:wp14="http://schemas.microsoft.com/office/word/2010/wordprocessingDrawing" xmlns:wp="http://schemas.openxmlformats.org/drawingml/2006/wordprocessingDrawing" xmlns:w10="urn:schemas-microsoft-com:office:word" xmlns:w="http://schemas.openxmlformats.org/wordprocessingml/2006/main" xmlns:w14="http://schemas.microsoft.com/office/word/2010/wordml" xmlns:w15="http://schemas.microsoft.com/office/word/2012/wordml" xmlns:w16cex="http://schemas.microsoft.com/office/word/2018/wordml/cex" xmlns:w16cid="http://schemas.microsoft.com/office/word/2016/wordml/cid" xmlns:w16="http://schemas.microsoft.com/office/word/2018/wordml" xmlns:w16du="http://schemas.microsoft.com/office/word/2023/wordml/word16du" xmlns:w16sdtdh="http://schemas.microsoft.com/office/word/2020/wordml/sdtdatahash" xmlns:w16sdtfl="http://schemas.microsoft.com/office/word/2024/wordml/sdtformatlock" xmlns:w16se="http://schemas.microsoft.com/office/word/2015/wordml/symex" xmlns:wpg="http://schemas.microsoft.com/office/word/2010/wordprocessingGroup" xmlns:wpi="http://schemas.microsoft.com/office/word/2010/wordprocessingInk" xmlns:wne="http://schemas.microsoft.com/office/word/2006/wordml" xmlns:wps="http://schemas.microsoft.com/office/word/2010/wordprocessingShape" mc:Ignorable="w14 w15 w16se w16cid w16 w16cex w16sdtdh w16sdtfl w16du wp14">
+  <w:endnote w:type="separator" w:id="-1">
     <w:p>
       <w:r>
         <w:separator/>
       </w:r>
     </w:p>
   </w:endnote>
-  <w:endnote w:type="continuationSeparator" w:id="1">
+  <w:endnote w:type="continuationSeparator" w:id="0">
     <w:p>
       <w:r>
         <w:continuationSeparator/>
@@ -15786,7 +17281,7 @@
 </file>
 
 <file path=word/footer1.xml><?xml version="1.0" encoding="utf-8"?>
-<w:ftr xmlns:ve="http://schemas.openxmlformats.org/markup-compatibility/2006" xmlns:o="urn:schemas-microsoft-com:office:office" xmlns:r="http://schemas.openxmlformats.org/officeDocument/2006/relationships" xmlns:m="http://schemas.openxmlformats.org/officeDocument/2006/math" xmlns:v="urn:schemas-microsoft-com:vml" xmlns:wp="http://schemas.openxmlformats.org/drawingml/2006/wordprocessingDrawing" xmlns:w10="urn:schemas-microsoft-com:office:word" xmlns:w="http://schemas.openxmlformats.org/wordprocessingml/2006/main" xmlns:wne="http://schemas.microsoft.com/office/word/2006/wordml">
+<w:ftr xmlns:wpc="http://schemas.microsoft.com/office/word/2010/wordprocessingCanvas" xmlns:cx="http://schemas.microsoft.com/office/drawing/2014/chartex" xmlns:cx1="http://schemas.microsoft.com/office/drawing/2015/9/8/chartex" xmlns:cx2="http://schemas.microsoft.com/office/drawing/2015/10/21/chartex" xmlns:cx3="http://schemas.microsoft.com/office/drawing/2016/5/9/chartex" xmlns:cx4="http://schemas.microsoft.com/office/drawing/2016/5/10/chartex" xmlns:cx5="http://schemas.microsoft.com/office/drawing/2016/5/11/chartex" xmlns:cx6="http://schemas.microsoft.com/office/drawing/2016/5/12/chartex" xmlns:cx7="http://schemas.microsoft.com/office/drawing/2016/5/13/chartex" xmlns:cx8="http://schemas.microsoft.com/office/drawing/2016/5/14/chartex" xmlns:mc="http://schemas.openxmlformats.org/markup-compatibility/2006" xmlns:aink="http://schemas.microsoft.com/office/drawing/2016/ink" xmlns:am3d="http://schemas.microsoft.com/office/drawing/2017/model3d" xmlns:o="urn:schemas-microsoft-com:office:office" xmlns:oel="http://schemas.microsoft.com/office/2019/extlst" xmlns:r="http://schemas.openxmlformats.org/officeDocument/2006/relationships" xmlns:m="http://schemas.openxmlformats.org/officeDocument/2006/math" xmlns:v="urn:schemas-microsoft-com:vml" xmlns:wp14="http://schemas.microsoft.com/office/word/2010/wordprocessingDrawing" xmlns:wp="http://schemas.openxmlformats.org/drawingml/2006/wordprocessingDrawing" xmlns:w10="urn:schemas-microsoft-com:office:word" xmlns:w="http://schemas.openxmlformats.org/wordprocessingml/2006/main" xmlns:w14="http://schemas.microsoft.com/office/word/2010/wordml" xmlns:w15="http://schemas.microsoft.com/office/word/2012/wordml" xmlns:w16cex="http://schemas.microsoft.com/office/word/2018/wordml/cex" xmlns:w16cid="http://schemas.microsoft.com/office/word/2016/wordml/cid" xmlns:w16="http://schemas.microsoft.com/office/word/2018/wordml" xmlns:w16du="http://schemas.microsoft.com/office/word/2023/wordml/word16du" xmlns:w16sdtdh="http://schemas.microsoft.com/office/word/2020/wordml/sdtdatahash" xmlns:w16sdtfl="http://schemas.microsoft.com/office/word/2024/wordml/sdtformatlock" xmlns:w16se="http://schemas.microsoft.com/office/word/2015/wordml/symex" xmlns:wpg="http://schemas.microsoft.com/office/word/2010/wordprocessingGroup" xmlns:wpi="http://schemas.microsoft.com/office/word/2010/wordprocessingInk" xmlns:wne="http://schemas.microsoft.com/office/word/2006/wordml" xmlns:wps="http://schemas.microsoft.com/office/word/2010/wordprocessingShape" mc:Ignorable="w14 w15 w16se w16cid w16 w16cex w16sdtdh w16sdtfl w16du wp14">
   <w:p>
     <w:pPr>
       <w:pStyle w:val="Footer"/>
@@ -15877,7 +17372,7 @@
         <w:szCs w:val="24"/>
         <w:lang w:eastAsia="en-US"/>
       </w:rPr>
-      <w:t>24</w:t>
+      <w:t>10</w:t>
     </w:r>
     <w:r>
       <w:rPr>
@@ -15898,15 +17393,15 @@
 </file>
 
 <file path=word/footnotes.xml><?xml version="1.0" encoding="utf-8"?>
-<w:footnotes xmlns:ve="http://schemas.openxmlformats.org/markup-compatibility/2006" xmlns:o="urn:schemas-microsoft-com:office:office" xmlns:r="http://schemas.openxmlformats.org/officeDocument/2006/relationships" xmlns:m="http://schemas.openxmlformats.org/officeDocument/2006/math" xmlns:v="urn:schemas-microsoft-com:vml" xmlns:wp="http://schemas.openxmlformats.org/drawingml/2006/wordprocessingDrawing" xmlns:w10="urn:schemas-microsoft-com:office:word" xmlns:w="http://schemas.openxmlformats.org/wordprocessingml/2006/main" xmlns:wne="http://schemas.microsoft.com/office/word/2006/wordml">
-  <w:footnote w:type="separator" w:id="0">
+<w:footnotes xmlns:wpc="http://schemas.microsoft.com/office/word/2010/wordprocessingCanvas" xmlns:cx="http://schemas.microsoft.com/office/drawing/2014/chartex" xmlns:cx1="http://schemas.microsoft.com/office/drawing/2015/9/8/chartex" xmlns:cx2="http://schemas.microsoft.com/office/drawing/2015/10/21/chartex" xmlns:cx3="http://schemas.microsoft.com/office/drawing/2016/5/9/chartex" xmlns:cx4="http://schemas.microsoft.com/office/drawing/2016/5/10/chartex" xmlns:cx5="http://schemas.microsoft.com/office/drawing/2016/5/11/chartex" xmlns:cx6="http://schemas.microsoft.com/office/drawing/2016/5/12/chartex" xmlns:cx7="http://schemas.microsoft.com/office/drawing/2016/5/13/chartex" xmlns:cx8="http://schemas.microsoft.com/office/drawing/2016/5/14/chartex" xmlns:mc="http://schemas.openxmlformats.org/markup-compatibility/2006" xmlns:aink="http://schemas.microsoft.com/office/drawing/2016/ink" xmlns:am3d="http://schemas.microsoft.com/office/drawing/2017/model3d" xmlns:o="urn:schemas-microsoft-com:office:office" xmlns:oel="http://schemas.microsoft.com/office/2019/extlst" xmlns:r="http://schemas.openxmlformats.org/officeDocument/2006/relationships" xmlns:m="http://schemas.openxmlformats.org/officeDocument/2006/math" xmlns:v="urn:schemas-microsoft-com:vml" xmlns:wp14="http://schemas.microsoft.com/office/word/2010/wordprocessingDrawing" xmlns:wp="http://schemas.openxmlformats.org/drawingml/2006/wordprocessingDrawing" xmlns:w10="urn:schemas-microsoft-com:office:word" xmlns:w="http://schemas.openxmlformats.org/wordprocessingml/2006/main" xmlns:w14="http://schemas.microsoft.com/office/word/2010/wordml" xmlns:w15="http://schemas.microsoft.com/office/word/2012/wordml" xmlns:w16cex="http://schemas.microsoft.com/office/word/2018/wordml/cex" xmlns:w16cid="http://schemas.microsoft.com/office/word/2016/wordml/cid" xmlns:w16="http://schemas.microsoft.com/office/word/2018/wordml" xmlns:w16du="http://schemas.microsoft.com/office/word/2023/wordml/word16du" xmlns:w16sdtdh="http://schemas.microsoft.com/office/word/2020/wordml/sdtdatahash" xmlns:w16sdtfl="http://schemas.microsoft.com/office/word/2024/wordml/sdtformatlock" xmlns:w16se="http://schemas.microsoft.com/office/word/2015/wordml/symex" xmlns:wpg="http://schemas.microsoft.com/office/word/2010/wordprocessingGroup" xmlns:wpi="http://schemas.microsoft.com/office/word/2010/wordprocessingInk" xmlns:wne="http://schemas.microsoft.com/office/word/2006/wordml" xmlns:wps="http://schemas.microsoft.com/office/word/2010/wordprocessingShape" mc:Ignorable="w14 w15 w16se w16cid w16 w16cex w16sdtdh w16sdtfl w16du wp14">
+  <w:footnote w:type="separator" w:id="-1">
     <w:p>
       <w:r>
         <w:separator/>
       </w:r>
     </w:p>
   </w:footnote>
-  <w:footnote w:type="continuationSeparator" w:id="1">
+  <w:footnote w:type="continuationSeparator" w:id="0">
     <w:p>
       <w:r>
         <w:continuationSeparator/>
@@ -15917,8 +17412,8 @@
 </file>
 
 <file path=word/numbering.xml><?xml version="1.0" encoding="utf-8"?>
-<w:numbering xmlns:ve="http://schemas.openxmlformats.org/markup-compatibility/2006" xmlns:o="urn:schemas-microsoft-com:office:office" xmlns:r="http://schemas.openxmlformats.org/officeDocument/2006/relationships" xmlns:m="http://schemas.openxmlformats.org/officeDocument/2006/math" xmlns:v="urn:schemas-microsoft-com:vml" xmlns:wp="http://schemas.openxmlformats.org/drawingml/2006/wordprocessingDrawing" xmlns:w10="urn:schemas-microsoft-com:office:word" xmlns:w="http://schemas.openxmlformats.org/wordprocessingml/2006/main" xmlns:wne="http://schemas.microsoft.com/office/word/2006/wordml">
-  <w:abstractNum w:abstractNumId="0">
+<w:numbering xmlns:wpc="http://schemas.microsoft.com/office/word/2010/wordprocessingCanvas" xmlns:cx="http://schemas.microsoft.com/office/drawing/2014/chartex" xmlns:cx1="http://schemas.microsoft.com/office/drawing/2015/9/8/chartex" xmlns:cx2="http://schemas.microsoft.com/office/drawing/2015/10/21/chartex" xmlns:cx3="http://schemas.microsoft.com/office/drawing/2016/5/9/chartex" xmlns:cx4="http://schemas.microsoft.com/office/drawing/2016/5/10/chartex" xmlns:cx5="http://schemas.microsoft.com/office/drawing/2016/5/11/chartex" xmlns:cx6="http://schemas.microsoft.com/office/drawing/2016/5/12/chartex" xmlns:cx7="http://schemas.microsoft.com/office/drawing/2016/5/13/chartex" xmlns:cx8="http://schemas.microsoft.com/office/drawing/2016/5/14/chartex" xmlns:mc="http://schemas.openxmlformats.org/markup-compatibility/2006" xmlns:aink="http://schemas.microsoft.com/office/drawing/2016/ink" xmlns:am3d="http://schemas.microsoft.com/office/drawing/2017/model3d" xmlns:o="urn:schemas-microsoft-com:office:office" xmlns:oel="http://schemas.microsoft.com/office/2019/extlst" xmlns:r="http://schemas.openxmlformats.org/officeDocument/2006/relationships" xmlns:m="http://schemas.openxmlformats.org/officeDocument/2006/math" xmlns:v="urn:schemas-microsoft-com:vml" xmlns:wp14="http://schemas.microsoft.com/office/word/2010/wordprocessingDrawing" xmlns:wp="http://schemas.openxmlformats.org/drawingml/2006/wordprocessingDrawing" xmlns:w10="urn:schemas-microsoft-com:office:word" xmlns:w="http://schemas.openxmlformats.org/wordprocessingml/2006/main" xmlns:w14="http://schemas.microsoft.com/office/word/2010/wordml" xmlns:w15="http://schemas.microsoft.com/office/word/2012/wordml" xmlns:w16cex="http://schemas.microsoft.com/office/word/2018/wordml/cex" xmlns:w16cid="http://schemas.microsoft.com/office/word/2016/wordml/cid" xmlns:w16="http://schemas.microsoft.com/office/word/2018/wordml" xmlns:w16du="http://schemas.microsoft.com/office/word/2023/wordml/word16du" xmlns:w16sdtdh="http://schemas.microsoft.com/office/word/2020/wordml/sdtdatahash" xmlns:w16sdtfl="http://schemas.microsoft.com/office/word/2024/wordml/sdtformatlock" xmlns:w16se="http://schemas.microsoft.com/office/word/2015/wordml/symex" xmlns:wpg="http://schemas.microsoft.com/office/word/2010/wordprocessingGroup" xmlns:wpi="http://schemas.microsoft.com/office/word/2010/wordprocessingInk" xmlns:wne="http://schemas.microsoft.com/office/word/2006/wordml" xmlns:wps="http://schemas.microsoft.com/office/word/2010/wordprocessingShape" mc:Ignorable="w14 w15 w16se w16cid w16 w16cex w16sdtdh w16sdtfl w16du wp14">
+  <w:abstractNum w:abstractNumId="0" w15:restartNumberingAfterBreak="0">
     <w:nsid w:val="013750CF"/>
     <w:multiLevelType w:val="hybridMultilevel"/>
     <w:tmpl w:val="D10C7654"/>
@@ -16004,7 +17499,7 @@
       </w:pPr>
     </w:lvl>
   </w:abstractNum>
-  <w:abstractNum w:abstractNumId="1">
+  <w:abstractNum w:abstractNumId="1" w15:restartNumberingAfterBreak="0">
     <w:nsid w:val="054713D1"/>
     <w:multiLevelType w:val="hybridMultilevel"/>
     <w:tmpl w:val="E7D210CA"/>
@@ -16090,7 +17585,120 @@
       </w:pPr>
     </w:lvl>
   </w:abstractNum>
-  <w:abstractNum w:abstractNumId="2">
+  <w:abstractNum w:abstractNumId="2" w15:restartNumberingAfterBreak="0">
+    <w:nsid w:val="056B05C9"/>
+    <w:multiLevelType w:val="hybridMultilevel"/>
+    <w:tmpl w:val="2C80A2CE"/>
+    <w:lvl w:ilvl="0" w:tplc="04090001">
+      <w:start w:val="1"/>
+      <w:numFmt w:val="bullet"/>
+      <w:lvlText w:val=""/>
+      <w:lvlJc w:val="left"/>
+      <w:pPr>
+        <w:ind w:left="1440" w:hanging="360"/>
+      </w:pPr>
+      <w:rPr>
+        <w:rFonts w:ascii="Symbol" w:hAnsi="Symbol" w:hint="default"/>
+      </w:rPr>
+    </w:lvl>
+    <w:lvl w:ilvl="1" w:tplc="04090003" w:tentative="1">
+      <w:start w:val="1"/>
+      <w:numFmt w:val="bullet"/>
+      <w:lvlText w:val="o"/>
+      <w:lvlJc w:val="left"/>
+      <w:pPr>
+        <w:ind w:left="2160" w:hanging="360"/>
+      </w:pPr>
+      <w:rPr>
+        <w:rFonts w:ascii="Courier New" w:hAnsi="Courier New" w:cs="Courier New" w:hint="default"/>
+      </w:rPr>
+    </w:lvl>
+    <w:lvl w:ilvl="2" w:tplc="04090005" w:tentative="1">
+      <w:start w:val="1"/>
+      <w:numFmt w:val="bullet"/>
+      <w:lvlText w:val=""/>
+      <w:lvlJc w:val="left"/>
+      <w:pPr>
+        <w:ind w:left="2880" w:hanging="360"/>
+      </w:pPr>
+      <w:rPr>
+        <w:rFonts w:ascii="Wingdings" w:hAnsi="Wingdings" w:hint="default"/>
+      </w:rPr>
+    </w:lvl>
+    <w:lvl w:ilvl="3" w:tplc="04090001" w:tentative="1">
+      <w:start w:val="1"/>
+      <w:numFmt w:val="bullet"/>
+      <w:lvlText w:val=""/>
+      <w:lvlJc w:val="left"/>
+      <w:pPr>
+        <w:ind w:left="3600" w:hanging="360"/>
+      </w:pPr>
+      <w:rPr>
+        <w:rFonts w:ascii="Symbol" w:hAnsi="Symbol" w:hint="default"/>
+      </w:rPr>
+    </w:lvl>
+    <w:lvl w:ilvl="4" w:tplc="04090003" w:tentative="1">
+      <w:start w:val="1"/>
+      <w:numFmt w:val="bullet"/>
+      <w:lvlText w:val="o"/>
+      <w:lvlJc w:val="left"/>
+      <w:pPr>
+        <w:ind w:left="4320" w:hanging="360"/>
+      </w:pPr>
+      <w:rPr>
+        <w:rFonts w:ascii="Courier New" w:hAnsi="Courier New" w:cs="Courier New" w:hint="default"/>
+      </w:rPr>
+    </w:lvl>
+    <w:lvl w:ilvl="5" w:tplc="04090005" w:tentative="1">
+      <w:start w:val="1"/>
+      <w:numFmt w:val="bullet"/>
+      <w:lvlText w:val=""/>
+      <w:lvlJc w:val="left"/>
+      <w:pPr>
+        <w:ind w:left="5040" w:hanging="360"/>
+      </w:pPr>
+      <w:rPr>
+        <w:rFonts w:ascii="Wingdings" w:hAnsi="Wingdings" w:hint="default"/>
+      </w:rPr>
+    </w:lvl>
+    <w:lvl w:ilvl="6" w:tplc="04090001" w:tentative="1">
+      <w:start w:val="1"/>
+      <w:numFmt w:val="bullet"/>
+      <w:lvlText w:val=""/>
+      <w:lvlJc w:val="left"/>
+      <w:pPr>
+        <w:ind w:left="5760" w:hanging="360"/>
+      </w:pPr>
+      <w:rPr>
+        <w:rFonts w:ascii="Symbol" w:hAnsi="Symbol" w:hint="default"/>
+      </w:rPr>
+    </w:lvl>
+    <w:lvl w:ilvl="7" w:tplc="04090003" w:tentative="1">
+      <w:start w:val="1"/>
+      <w:numFmt w:val="bullet"/>
+      <w:lvlText w:val="o"/>
+      <w:lvlJc w:val="left"/>
+      <w:pPr>
+        <w:ind w:left="6480" w:hanging="360"/>
+      </w:pPr>
+      <w:rPr>
+        <w:rFonts w:ascii="Courier New" w:hAnsi="Courier New" w:cs="Courier New" w:hint="default"/>
+      </w:rPr>
+    </w:lvl>
+    <w:lvl w:ilvl="8" w:tplc="04090005" w:tentative="1">
+      <w:start w:val="1"/>
+      <w:numFmt w:val="bullet"/>
+      <w:lvlText w:val=""/>
+      <w:lvlJc w:val="left"/>
+      <w:pPr>
+        <w:ind w:left="7200" w:hanging="360"/>
+      </w:pPr>
+      <w:rPr>
+        <w:rFonts w:ascii="Wingdings" w:hAnsi="Wingdings" w:hint="default"/>
+      </w:rPr>
+    </w:lvl>
+  </w:abstractNum>
+  <w:abstractNum w:abstractNumId="3" w15:restartNumberingAfterBreak="0">
     <w:nsid w:val="1405286F"/>
     <w:multiLevelType w:val="hybridMultilevel"/>
     <w:tmpl w:val="7E2E17D6"/>
@@ -16179,7 +17787,7 @@
       </w:pPr>
     </w:lvl>
   </w:abstractNum>
-  <w:abstractNum w:abstractNumId="3">
+  <w:abstractNum w:abstractNumId="4" w15:restartNumberingAfterBreak="0">
     <w:nsid w:val="163115D9"/>
     <w:multiLevelType w:val="hybridMultilevel"/>
     <w:tmpl w:val="97DAFCAE"/>
@@ -16293,7 +17901,7 @@
       </w:rPr>
     </w:lvl>
   </w:abstractNum>
-  <w:abstractNum w:abstractNumId="4">
+  <w:abstractNum w:abstractNumId="5" w15:restartNumberingAfterBreak="0">
     <w:nsid w:val="18E53416"/>
     <w:multiLevelType w:val="hybridMultilevel"/>
     <w:tmpl w:val="609492D8"/>
@@ -16382,7 +17990,7 @@
       </w:pPr>
     </w:lvl>
   </w:abstractNum>
-  <w:abstractNum w:abstractNumId="5">
+  <w:abstractNum w:abstractNumId="6" w15:restartNumberingAfterBreak="0">
     <w:nsid w:val="1D980FED"/>
     <w:multiLevelType w:val="hybridMultilevel"/>
     <w:tmpl w:val="7AA22E22"/>
@@ -16468,7 +18076,7 @@
       </w:pPr>
     </w:lvl>
   </w:abstractNum>
-  <w:abstractNum w:abstractNumId="6">
+  <w:abstractNum w:abstractNumId="7" w15:restartNumberingAfterBreak="0">
     <w:nsid w:val="1DD236C9"/>
     <w:multiLevelType w:val="hybridMultilevel"/>
     <w:tmpl w:val="3F202548"/>
@@ -16557,7 +18165,7 @@
       </w:pPr>
     </w:lvl>
   </w:abstractNum>
-  <w:abstractNum w:abstractNumId="7">
+  <w:abstractNum w:abstractNumId="8" w15:restartNumberingAfterBreak="0">
     <w:nsid w:val="1E6A0613"/>
     <w:multiLevelType w:val="hybridMultilevel"/>
     <w:tmpl w:val="7A9041E8"/>
@@ -16643,7 +18251,7 @@
       </w:pPr>
     </w:lvl>
   </w:abstractNum>
-  <w:abstractNum w:abstractNumId="8">
+  <w:abstractNum w:abstractNumId="9" w15:restartNumberingAfterBreak="0">
     <w:nsid w:val="216A24BC"/>
     <w:multiLevelType w:val="hybridMultilevel"/>
     <w:tmpl w:val="AC1E665A"/>
@@ -16729,7 +18337,7 @@
       </w:pPr>
     </w:lvl>
   </w:abstractNum>
-  <w:abstractNum w:abstractNumId="9">
+  <w:abstractNum w:abstractNumId="10" w15:restartNumberingAfterBreak="0">
     <w:nsid w:val="266A701D"/>
     <w:multiLevelType w:val="hybridMultilevel"/>
     <w:tmpl w:val="97D8B736"/>
@@ -16842,7 +18450,7 @@
       </w:rPr>
     </w:lvl>
   </w:abstractNum>
-  <w:abstractNum w:abstractNumId="10">
+  <w:abstractNum w:abstractNumId="11" w15:restartNumberingAfterBreak="0">
     <w:nsid w:val="2FF46446"/>
     <w:multiLevelType w:val="hybridMultilevel"/>
     <w:tmpl w:val="AC1E665A"/>
@@ -16928,7 +18536,7 @@
       </w:pPr>
     </w:lvl>
   </w:abstractNum>
-  <w:abstractNum w:abstractNumId="11">
+  <w:abstractNum w:abstractNumId="12" w15:restartNumberingAfterBreak="0">
     <w:nsid w:val="327C0ACA"/>
     <w:multiLevelType w:val="hybridMultilevel"/>
     <w:tmpl w:val="AC1E665A"/>
@@ -17014,7 +18622,7 @@
       </w:pPr>
     </w:lvl>
   </w:abstractNum>
-  <w:abstractNum w:abstractNumId="12">
+  <w:abstractNum w:abstractNumId="13" w15:restartNumberingAfterBreak="0">
     <w:nsid w:val="345028FA"/>
     <w:multiLevelType w:val="hybridMultilevel"/>
     <w:tmpl w:val="38C67E34"/>
@@ -17103,7 +18711,7 @@
       </w:pPr>
     </w:lvl>
   </w:abstractNum>
-  <w:abstractNum w:abstractNumId="13">
+  <w:abstractNum w:abstractNumId="14" w15:restartNumberingAfterBreak="0">
     <w:nsid w:val="3D3B424D"/>
     <w:multiLevelType w:val="hybridMultilevel"/>
     <w:tmpl w:val="58C8616C"/>
@@ -17217,7 +18825,7 @@
       </w:rPr>
     </w:lvl>
   </w:abstractNum>
-  <w:abstractNum w:abstractNumId="14">
+  <w:abstractNum w:abstractNumId="15" w15:restartNumberingAfterBreak="0">
     <w:nsid w:val="41936094"/>
     <w:multiLevelType w:val="hybridMultilevel"/>
     <w:tmpl w:val="D0107CD2"/>
@@ -17331,7 +18939,7 @@
       </w:rPr>
     </w:lvl>
   </w:abstractNum>
-  <w:abstractNum w:abstractNumId="15">
+  <w:abstractNum w:abstractNumId="16" w15:restartNumberingAfterBreak="0">
     <w:nsid w:val="42E80F5A"/>
     <w:multiLevelType w:val="hybridMultilevel"/>
     <w:tmpl w:val="84B6DDA2"/>
@@ -17417,7 +19025,7 @@
       </w:pPr>
     </w:lvl>
   </w:abstractNum>
-  <w:abstractNum w:abstractNumId="16">
+  <w:abstractNum w:abstractNumId="17" w15:restartNumberingAfterBreak="0">
     <w:nsid w:val="42FF05A0"/>
     <w:multiLevelType w:val="hybridMultilevel"/>
     <w:tmpl w:val="FB98B948"/>
@@ -17503,7 +19111,120 @@
       </w:pPr>
     </w:lvl>
   </w:abstractNum>
-  <w:abstractNum w:abstractNumId="17">
+  <w:abstractNum w:abstractNumId="18" w15:restartNumberingAfterBreak="0">
+    <w:nsid w:val="45B57794"/>
+    <w:multiLevelType w:val="hybridMultilevel"/>
+    <w:tmpl w:val="8158A2AE"/>
+    <w:lvl w:ilvl="0" w:tplc="04090001">
+      <w:start w:val="1"/>
+      <w:numFmt w:val="bullet"/>
+      <w:lvlText w:val=""/>
+      <w:lvlJc w:val="left"/>
+      <w:pPr>
+        <w:ind w:left="1440" w:hanging="360"/>
+      </w:pPr>
+      <w:rPr>
+        <w:rFonts w:ascii="Symbol" w:hAnsi="Symbol" w:hint="default"/>
+      </w:rPr>
+    </w:lvl>
+    <w:lvl w:ilvl="1" w:tplc="04090003" w:tentative="1">
+      <w:start w:val="1"/>
+      <w:numFmt w:val="bullet"/>
+      <w:lvlText w:val="o"/>
+      <w:lvlJc w:val="left"/>
+      <w:pPr>
+        <w:ind w:left="2160" w:hanging="360"/>
+      </w:pPr>
+      <w:rPr>
+        <w:rFonts w:ascii="Courier New" w:hAnsi="Courier New" w:cs="Courier New" w:hint="default"/>
+      </w:rPr>
+    </w:lvl>
+    <w:lvl w:ilvl="2" w:tplc="04090005" w:tentative="1">
+      <w:start w:val="1"/>
+      <w:numFmt w:val="bullet"/>
+      <w:lvlText w:val=""/>
+      <w:lvlJc w:val="left"/>
+      <w:pPr>
+        <w:ind w:left="2880" w:hanging="360"/>
+      </w:pPr>
+      <w:rPr>
+        <w:rFonts w:ascii="Wingdings" w:hAnsi="Wingdings" w:hint="default"/>
+      </w:rPr>
+    </w:lvl>
+    <w:lvl w:ilvl="3" w:tplc="04090001" w:tentative="1">
+      <w:start w:val="1"/>
+      <w:numFmt w:val="bullet"/>
+      <w:lvlText w:val=""/>
+      <w:lvlJc w:val="left"/>
+      <w:pPr>
+        <w:ind w:left="3600" w:hanging="360"/>
+      </w:pPr>
+      <w:rPr>
+        <w:rFonts w:ascii="Symbol" w:hAnsi="Symbol" w:hint="default"/>
+      </w:rPr>
+    </w:lvl>
+    <w:lvl w:ilvl="4" w:tplc="04090003" w:tentative="1">
+      <w:start w:val="1"/>
+      <w:numFmt w:val="bullet"/>
+      <w:lvlText w:val="o"/>
+      <w:lvlJc w:val="left"/>
+      <w:pPr>
+        <w:ind w:left="4320" w:hanging="360"/>
+      </w:pPr>
+      <w:rPr>
+        <w:rFonts w:ascii="Courier New" w:hAnsi="Courier New" w:cs="Courier New" w:hint="default"/>
+      </w:rPr>
+    </w:lvl>
+    <w:lvl w:ilvl="5" w:tplc="04090005" w:tentative="1">
+      <w:start w:val="1"/>
+      <w:numFmt w:val="bullet"/>
+      <w:lvlText w:val=""/>
+      <w:lvlJc w:val="left"/>
+      <w:pPr>
+        <w:ind w:left="5040" w:hanging="360"/>
+      </w:pPr>
+      <w:rPr>
+        <w:rFonts w:ascii="Wingdings" w:hAnsi="Wingdings" w:hint="default"/>
+      </w:rPr>
+    </w:lvl>
+    <w:lvl w:ilvl="6" w:tplc="04090001" w:tentative="1">
+      <w:start w:val="1"/>
+      <w:numFmt w:val="bullet"/>
+      <w:lvlText w:val=""/>
+      <w:lvlJc w:val="left"/>
+      <w:pPr>
+        <w:ind w:left="5760" w:hanging="360"/>
+      </w:pPr>
+      <w:rPr>
+        <w:rFonts w:ascii="Symbol" w:hAnsi="Symbol" w:hint="default"/>
+      </w:rPr>
+    </w:lvl>
+    <w:lvl w:ilvl="7" w:tplc="04090003" w:tentative="1">
+      <w:start w:val="1"/>
+      <w:numFmt w:val="bullet"/>
+      <w:lvlText w:val="o"/>
+      <w:lvlJc w:val="left"/>
+      <w:pPr>
+        <w:ind w:left="6480" w:hanging="360"/>
+      </w:pPr>
+      <w:rPr>
+        <w:rFonts w:ascii="Courier New" w:hAnsi="Courier New" w:cs="Courier New" w:hint="default"/>
+      </w:rPr>
+    </w:lvl>
+    <w:lvl w:ilvl="8" w:tplc="04090005" w:tentative="1">
+      <w:start w:val="1"/>
+      <w:numFmt w:val="bullet"/>
+      <w:lvlText w:val=""/>
+      <w:lvlJc w:val="left"/>
+      <w:pPr>
+        <w:ind w:left="7200" w:hanging="360"/>
+      </w:pPr>
+      <w:rPr>
+        <w:rFonts w:ascii="Wingdings" w:hAnsi="Wingdings" w:hint="default"/>
+      </w:rPr>
+    </w:lvl>
+  </w:abstractNum>
+  <w:abstractNum w:abstractNumId="19" w15:restartNumberingAfterBreak="0">
     <w:nsid w:val="4D6431E7"/>
     <w:multiLevelType w:val="hybridMultilevel"/>
     <w:tmpl w:val="066E09E4"/>
@@ -17589,7 +19310,120 @@
       </w:pPr>
     </w:lvl>
   </w:abstractNum>
-  <w:abstractNum w:abstractNumId="18">
+  <w:abstractNum w:abstractNumId="20" w15:restartNumberingAfterBreak="0">
+    <w:nsid w:val="4DB85D1B"/>
+    <w:multiLevelType w:val="hybridMultilevel"/>
+    <w:tmpl w:val="405ED52C"/>
+    <w:lvl w:ilvl="0" w:tplc="04090001">
+      <w:start w:val="1"/>
+      <w:numFmt w:val="bullet"/>
+      <w:lvlText w:val=""/>
+      <w:lvlJc w:val="left"/>
+      <w:pPr>
+        <w:ind w:left="1440" w:hanging="360"/>
+      </w:pPr>
+      <w:rPr>
+        <w:rFonts w:ascii="Symbol" w:hAnsi="Symbol" w:hint="default"/>
+      </w:rPr>
+    </w:lvl>
+    <w:lvl w:ilvl="1" w:tplc="04090003" w:tentative="1">
+      <w:start w:val="1"/>
+      <w:numFmt w:val="bullet"/>
+      <w:lvlText w:val="o"/>
+      <w:lvlJc w:val="left"/>
+      <w:pPr>
+        <w:ind w:left="2160" w:hanging="360"/>
+      </w:pPr>
+      <w:rPr>
+        <w:rFonts w:ascii="Courier New" w:hAnsi="Courier New" w:cs="Courier New" w:hint="default"/>
+      </w:rPr>
+    </w:lvl>
+    <w:lvl w:ilvl="2" w:tplc="04090005" w:tentative="1">
+      <w:start w:val="1"/>
+      <w:numFmt w:val="bullet"/>
+      <w:lvlText w:val=""/>
+      <w:lvlJc w:val="left"/>
+      <w:pPr>
+        <w:ind w:left="2880" w:hanging="360"/>
+      </w:pPr>
+      <w:rPr>
+        <w:rFonts w:ascii="Wingdings" w:hAnsi="Wingdings" w:hint="default"/>
+      </w:rPr>
+    </w:lvl>
+    <w:lvl w:ilvl="3" w:tplc="04090001" w:tentative="1">
+      <w:start w:val="1"/>
+      <w:numFmt w:val="bullet"/>
+      <w:lvlText w:val=""/>
+      <w:lvlJc w:val="left"/>
+      <w:pPr>
+        <w:ind w:left="3600" w:hanging="360"/>
+      </w:pPr>
+      <w:rPr>
+        <w:rFonts w:ascii="Symbol" w:hAnsi="Symbol" w:hint="default"/>
+      </w:rPr>
+    </w:lvl>
+    <w:lvl w:ilvl="4" w:tplc="04090003" w:tentative="1">
+      <w:start w:val="1"/>
+      <w:numFmt w:val="bullet"/>
+      <w:lvlText w:val="o"/>
+      <w:lvlJc w:val="left"/>
+      <w:pPr>
+        <w:ind w:left="4320" w:hanging="360"/>
+      </w:pPr>
+      <w:rPr>
+        <w:rFonts w:ascii="Courier New" w:hAnsi="Courier New" w:cs="Courier New" w:hint="default"/>
+      </w:rPr>
+    </w:lvl>
+    <w:lvl w:ilvl="5" w:tplc="04090005" w:tentative="1">
+      <w:start w:val="1"/>
+      <w:numFmt w:val="bullet"/>
+      <w:lvlText w:val=""/>
+      <w:lvlJc w:val="left"/>
+      <w:pPr>
+        <w:ind w:left="5040" w:hanging="360"/>
+      </w:pPr>
+      <w:rPr>
+        <w:rFonts w:ascii="Wingdings" w:hAnsi="Wingdings" w:hint="default"/>
+      </w:rPr>
+    </w:lvl>
+    <w:lvl w:ilvl="6" w:tplc="04090001" w:tentative="1">
+      <w:start w:val="1"/>
+      <w:numFmt w:val="bullet"/>
+      <w:lvlText w:val=""/>
+      <w:lvlJc w:val="left"/>
+      <w:pPr>
+        <w:ind w:left="5760" w:hanging="360"/>
+      </w:pPr>
+      <w:rPr>
+        <w:rFonts w:ascii="Symbol" w:hAnsi="Symbol" w:hint="default"/>
+      </w:rPr>
+    </w:lvl>
+    <w:lvl w:ilvl="7" w:tplc="04090003" w:tentative="1">
+      <w:start w:val="1"/>
+      <w:numFmt w:val="bullet"/>
+      <w:lvlText w:val="o"/>
+      <w:lvlJc w:val="left"/>
+      <w:pPr>
+        <w:ind w:left="6480" w:hanging="360"/>
+      </w:pPr>
+      <w:rPr>
+        <w:rFonts w:ascii="Courier New" w:hAnsi="Courier New" w:cs="Courier New" w:hint="default"/>
+      </w:rPr>
+    </w:lvl>
+    <w:lvl w:ilvl="8" w:tplc="04090005" w:tentative="1">
+      <w:start w:val="1"/>
+      <w:numFmt w:val="bullet"/>
+      <w:lvlText w:val=""/>
+      <w:lvlJc w:val="left"/>
+      <w:pPr>
+        <w:ind w:left="7200" w:hanging="360"/>
+      </w:pPr>
+      <w:rPr>
+        <w:rFonts w:ascii="Wingdings" w:hAnsi="Wingdings" w:hint="default"/>
+      </w:rPr>
+    </w:lvl>
+  </w:abstractNum>
+  <w:abstractNum w:abstractNumId="21" w15:restartNumberingAfterBreak="0">
     <w:nsid w:val="4F012578"/>
     <w:multiLevelType w:val="hybridMultilevel"/>
     <w:tmpl w:val="E7D210CA"/>
@@ -17675,7 +19509,7 @@
       </w:pPr>
     </w:lvl>
   </w:abstractNum>
-  <w:abstractNum w:abstractNumId="19">
+  <w:abstractNum w:abstractNumId="22" w15:restartNumberingAfterBreak="0">
     <w:nsid w:val="5E1F1226"/>
     <w:multiLevelType w:val="hybridMultilevel"/>
     <w:tmpl w:val="D4DC7434"/>
@@ -17761,7 +19595,7 @@
       </w:pPr>
     </w:lvl>
   </w:abstractNum>
-  <w:abstractNum w:abstractNumId="20">
+  <w:abstractNum w:abstractNumId="23" w15:restartNumberingAfterBreak="0">
     <w:nsid w:val="604620B9"/>
     <w:multiLevelType w:val="hybridMultilevel"/>
     <w:tmpl w:val="7E2E17D6"/>
@@ -17850,7 +19684,7 @@
       </w:pPr>
     </w:lvl>
   </w:abstractNum>
-  <w:abstractNum w:abstractNumId="21">
+  <w:abstractNum w:abstractNumId="24" w15:restartNumberingAfterBreak="0">
     <w:nsid w:val="62193609"/>
     <w:multiLevelType w:val="hybridMultilevel"/>
     <w:tmpl w:val="07A45704"/>
@@ -17939,7 +19773,7 @@
       </w:pPr>
     </w:lvl>
   </w:abstractNum>
-  <w:abstractNum w:abstractNumId="22">
+  <w:abstractNum w:abstractNumId="25" w15:restartNumberingAfterBreak="0">
     <w:nsid w:val="67B54F56"/>
     <w:multiLevelType w:val="hybridMultilevel"/>
     <w:tmpl w:val="E7D210CA"/>
@@ -18025,81 +19859,90 @@
       </w:pPr>
     </w:lvl>
   </w:abstractNum>
-  <w:num w:numId="1">
+  <w:num w:numId="1" w16cid:durableId="1440950808">
+    <w:abstractNumId w:val="14"/>
+  </w:num>
+  <w:num w:numId="2" w16cid:durableId="577789623">
+    <w:abstractNumId w:val="15"/>
+  </w:num>
+  <w:num w:numId="3" w16cid:durableId="139924608">
+    <w:abstractNumId w:val="4"/>
+  </w:num>
+  <w:num w:numId="4" w16cid:durableId="1201498">
+    <w:abstractNumId w:val="19"/>
+  </w:num>
+  <w:num w:numId="5" w16cid:durableId="162816621">
+    <w:abstractNumId w:val="6"/>
+  </w:num>
+  <w:num w:numId="6" w16cid:durableId="1161628388">
+    <w:abstractNumId w:val="21"/>
+  </w:num>
+  <w:num w:numId="7" w16cid:durableId="270743131">
+    <w:abstractNumId w:val="8"/>
+  </w:num>
+  <w:num w:numId="8" w16cid:durableId="1823693270">
+    <w:abstractNumId w:val="9"/>
+  </w:num>
+  <w:num w:numId="9" w16cid:durableId="1039167940">
+    <w:abstractNumId w:val="11"/>
+  </w:num>
+  <w:num w:numId="10" w16cid:durableId="644697831">
+    <w:abstractNumId w:val="12"/>
+  </w:num>
+  <w:num w:numId="11" w16cid:durableId="543830130">
+    <w:abstractNumId w:val="16"/>
+  </w:num>
+  <w:num w:numId="12" w16cid:durableId="707533493">
+    <w:abstractNumId w:val="5"/>
+  </w:num>
+  <w:num w:numId="13" w16cid:durableId="1881043005">
     <w:abstractNumId w:val="13"/>
   </w:num>
-  <w:num w:numId="2">
-    <w:abstractNumId w:val="14"/>
+  <w:num w:numId="14" w16cid:durableId="1809782606">
+    <w:abstractNumId w:val="17"/>
   </w:num>
-  <w:num w:numId="3">
+  <w:num w:numId="15" w16cid:durableId="501357057">
     <w:abstractNumId w:val="3"/>
   </w:num>
-  <w:num w:numId="4">
-    <w:abstractNumId w:val="17"/>
+  <w:num w:numId="16" w16cid:durableId="1496846479">
+    <w:abstractNumId w:val="23"/>
   </w:num>
-  <w:num w:numId="5">
-    <w:abstractNumId w:val="5"/>
+  <w:num w:numId="17" w16cid:durableId="400757812">
+    <w:abstractNumId w:val="7"/>
   </w:num>
-  <w:num w:numId="6">
+  <w:num w:numId="18" w16cid:durableId="1721974673">
+    <w:abstractNumId w:val="24"/>
+  </w:num>
+  <w:num w:numId="19" w16cid:durableId="53429675">
+    <w:abstractNumId w:val="1"/>
+  </w:num>
+  <w:num w:numId="20" w16cid:durableId="380397197">
+    <w:abstractNumId w:val="25"/>
+  </w:num>
+  <w:num w:numId="21" w16cid:durableId="1410039633">
+    <w:abstractNumId w:val="10"/>
+  </w:num>
+  <w:num w:numId="22" w16cid:durableId="1806775880">
+    <w:abstractNumId w:val="0"/>
+  </w:num>
+  <w:num w:numId="23" w16cid:durableId="515002022">
+    <w:abstractNumId w:val="22"/>
+  </w:num>
+  <w:num w:numId="24" w16cid:durableId="212933276">
+    <w:abstractNumId w:val="2"/>
+  </w:num>
+  <w:num w:numId="25" w16cid:durableId="444422928">
     <w:abstractNumId w:val="18"/>
   </w:num>
-  <w:num w:numId="7">
-    <w:abstractNumId w:val="7"/>
-  </w:num>
-  <w:num w:numId="8">
-    <w:abstractNumId w:val="8"/>
-  </w:num>
-  <w:num w:numId="9">
-    <w:abstractNumId w:val="10"/>
-  </w:num>
-  <w:num w:numId="10">
-    <w:abstractNumId w:val="11"/>
-  </w:num>
-  <w:num w:numId="11">
-    <w:abstractNumId w:val="15"/>
-  </w:num>
-  <w:num w:numId="12">
-    <w:abstractNumId w:val="4"/>
-  </w:num>
-  <w:num w:numId="13">
-    <w:abstractNumId w:val="12"/>
-  </w:num>
-  <w:num w:numId="14">
-    <w:abstractNumId w:val="16"/>
-  </w:num>
-  <w:num w:numId="15">
-    <w:abstractNumId w:val="2"/>
-  </w:num>
-  <w:num w:numId="16">
+  <w:num w:numId="26" w16cid:durableId="1824658708">
     <w:abstractNumId w:val="20"/>
-  </w:num>
-  <w:num w:numId="17">
-    <w:abstractNumId w:val="6"/>
-  </w:num>
-  <w:num w:numId="18">
-    <w:abstractNumId w:val="21"/>
-  </w:num>
-  <w:num w:numId="19">
-    <w:abstractNumId w:val="1"/>
-  </w:num>
-  <w:num w:numId="20">
-    <w:abstractNumId w:val="22"/>
-  </w:num>
-  <w:num w:numId="21">
-    <w:abstractNumId w:val="9"/>
-  </w:num>
-  <w:num w:numId="22">
-    <w:abstractNumId w:val="0"/>
-  </w:num>
-  <w:num w:numId="23">
-    <w:abstractNumId w:val="19"/>
   </w:num>
   <w:numIdMacAtCleanup w:val="11"/>
 </w:numbering>
 </file>
 
 <file path=word/styles.xml><?xml version="1.0" encoding="utf-8"?>
-<w:styles xmlns:r="http://schemas.openxmlformats.org/officeDocument/2006/relationships" xmlns:w="http://schemas.openxmlformats.org/wordprocessingml/2006/main">
+<w:styles xmlns:mc="http://schemas.openxmlformats.org/markup-compatibility/2006" xmlns:r="http://schemas.openxmlformats.org/officeDocument/2006/relationships" xmlns:w="http://schemas.openxmlformats.org/wordprocessingml/2006/main" xmlns:w14="http://schemas.microsoft.com/office/word/2010/wordml" xmlns:w15="http://schemas.microsoft.com/office/word/2012/wordml" xmlns:w16cex="http://schemas.microsoft.com/office/word/2018/wordml/cex" xmlns:w16cid="http://schemas.microsoft.com/office/word/2016/wordml/cid" xmlns:w16="http://schemas.microsoft.com/office/word/2018/wordml" xmlns:w16du="http://schemas.microsoft.com/office/word/2023/wordml/word16du" xmlns:w16sdtdh="http://schemas.microsoft.com/office/word/2020/wordml/sdtdatahash" xmlns:w16sdtfl="http://schemas.microsoft.com/office/word/2024/wordml/sdtformatlock" xmlns:w16se="http://schemas.microsoft.com/office/word/2015/wordml/symex" mc:Ignorable="w14 w15 w16se w16cid w16 w16cex w16sdtdh w16sdtfl w16du">
   <w:docDefaults>
     <w:rPrDefault>
       <w:rPr>
@@ -18113,145 +19956,383 @@
       </w:pPr>
     </w:pPrDefault>
   </w:docDefaults>
-  <w:latentStyles w:defLockedState="0" w:defUIPriority="99" w:defSemiHidden="1" w:defUnhideWhenUsed="1" w:defQFormat="0" w:count="267">
-    <w:lsdException w:name="Normal" w:semiHidden="0" w:uiPriority="0" w:unhideWhenUsed="0" w:qFormat="1"/>
-    <w:lsdException w:name="heading 1" w:semiHidden="0" w:uiPriority="0" w:unhideWhenUsed="0" w:qFormat="1"/>
-    <w:lsdException w:name="heading 2" w:uiPriority="0" w:qFormat="1"/>
-    <w:lsdException w:name="heading 3" w:uiPriority="0" w:qFormat="1"/>
-    <w:lsdException w:name="heading 4" w:uiPriority="9" w:qFormat="1"/>
-    <w:lsdException w:name="heading 5" w:uiPriority="9" w:qFormat="1"/>
-    <w:lsdException w:name="heading 6" w:uiPriority="9" w:qFormat="1"/>
-    <w:lsdException w:name="heading 7" w:uiPriority="9" w:qFormat="1"/>
-    <w:lsdException w:name="heading 8" w:uiPriority="9" w:qFormat="1"/>
-    <w:lsdException w:name="heading 9" w:uiPriority="9" w:qFormat="1"/>
-    <w:lsdException w:name="toc 1" w:uiPriority="39" w:qFormat="1"/>
-    <w:lsdException w:name="toc 2" w:uiPriority="39" w:qFormat="1"/>
-    <w:lsdException w:name="toc 3" w:uiPriority="39" w:qFormat="1"/>
-    <w:lsdException w:name="toc 4" w:uiPriority="39"/>
-    <w:lsdException w:name="toc 5" w:uiPriority="39"/>
-    <w:lsdException w:name="toc 6" w:uiPriority="39"/>
-    <w:lsdException w:name="toc 7" w:uiPriority="39"/>
-    <w:lsdException w:name="toc 8" w:uiPriority="39"/>
-    <w:lsdException w:name="toc 9" w:uiPriority="39"/>
-    <w:lsdException w:name="footer" w:uiPriority="0"/>
-    <w:lsdException w:name="caption" w:uiPriority="0" w:qFormat="1"/>
-    <w:lsdException w:name="Title" w:semiHidden="0" w:uiPriority="10" w:unhideWhenUsed="0" w:qFormat="1"/>
-    <w:lsdException w:name="Default Paragraph Font" w:uiPriority="1"/>
-    <w:lsdException w:name="Subtitle" w:semiHidden="0" w:uiPriority="11" w:unhideWhenUsed="0" w:qFormat="1"/>
-    <w:lsdException w:name="Strong" w:semiHidden="0" w:uiPriority="22" w:unhideWhenUsed="0" w:qFormat="1"/>
-    <w:lsdException w:name="Emphasis" w:semiHidden="0" w:uiPriority="20" w:unhideWhenUsed="0" w:qFormat="1"/>
-    <w:lsdException w:name="Table Grid" w:semiHidden="0" w:uiPriority="59" w:unhideWhenUsed="0"/>
-    <w:lsdException w:name="Placeholder Text" w:unhideWhenUsed="0"/>
-    <w:lsdException w:name="No Spacing" w:semiHidden="0" w:uiPriority="1" w:unhideWhenUsed="0" w:qFormat="1"/>
-    <w:lsdException w:name="Light Shading" w:semiHidden="0" w:uiPriority="60" w:unhideWhenUsed="0"/>
-    <w:lsdException w:name="Light List" w:semiHidden="0" w:uiPriority="61" w:unhideWhenUsed="0"/>
-    <w:lsdException w:name="Light Grid" w:semiHidden="0" w:uiPriority="62" w:unhideWhenUsed="0"/>
-    <w:lsdException w:name="Medium Shading 1" w:semiHidden="0" w:uiPriority="63" w:unhideWhenUsed="0"/>
-    <w:lsdException w:name="Medium Shading 2" w:semiHidden="0" w:uiPriority="64" w:unhideWhenUsed="0"/>
-    <w:lsdException w:name="Medium List 1" w:semiHidden="0" w:uiPriority="65" w:unhideWhenUsed="0"/>
-    <w:lsdException w:name="Medium List 2" w:semiHidden="0" w:uiPriority="66" w:unhideWhenUsed="0"/>
-    <w:lsdException w:name="Medium Grid 1" w:semiHidden="0" w:uiPriority="67" w:unhideWhenUsed="0"/>
-    <w:lsdException w:name="Medium Grid 2" w:semiHidden="0" w:uiPriority="68" w:unhideWhenUsed="0"/>
-    <w:lsdException w:name="Medium Grid 3" w:semiHidden="0" w:uiPriority="69" w:unhideWhenUsed="0"/>
-    <w:lsdException w:name="Dark List" w:semiHidden="0" w:uiPriority="70" w:unhideWhenUsed="0"/>
-    <w:lsdException w:name="Colorful Shading" w:semiHidden="0" w:uiPriority="71" w:unhideWhenUsed="0"/>
-    <w:lsdException w:name="Colorful List" w:semiHidden="0" w:uiPriority="72" w:unhideWhenUsed="0"/>
-    <w:lsdException w:name="Colorful Grid" w:semiHidden="0" w:uiPriority="73" w:unhideWhenUsed="0"/>
-    <w:lsdException w:name="Light Shading Accent 1" w:semiHidden="0" w:uiPriority="60" w:unhideWhenUsed="0"/>
-    <w:lsdException w:name="Light List Accent 1" w:semiHidden="0" w:uiPriority="61" w:unhideWhenUsed="0"/>
-    <w:lsdException w:name="Light Grid Accent 1" w:semiHidden="0" w:uiPriority="62" w:unhideWhenUsed="0"/>
-    <w:lsdException w:name="Medium Shading 1 Accent 1" w:semiHidden="0" w:uiPriority="63" w:unhideWhenUsed="0"/>
-    <w:lsdException w:name="Medium Shading 2 Accent 1" w:semiHidden="0" w:uiPriority="64" w:unhideWhenUsed="0"/>
-    <w:lsdException w:name="Medium List 1 Accent 1" w:semiHidden="0" w:uiPriority="65" w:unhideWhenUsed="0"/>
-    <w:lsdException w:name="Revision" w:unhideWhenUsed="0"/>
-    <w:lsdException w:name="List Paragraph" w:semiHidden="0" w:uiPriority="34" w:unhideWhenUsed="0" w:qFormat="1"/>
-    <w:lsdException w:name="Quote" w:semiHidden="0" w:uiPriority="29" w:unhideWhenUsed="0" w:qFormat="1"/>
-    <w:lsdException w:name="Intense Quote" w:semiHidden="0" w:uiPriority="30" w:unhideWhenUsed="0" w:qFormat="1"/>
-    <w:lsdException w:name="Medium List 2 Accent 1" w:semiHidden="0" w:uiPriority="66" w:unhideWhenUsed="0"/>
-    <w:lsdException w:name="Medium Grid 1 Accent 1" w:semiHidden="0" w:uiPriority="67" w:unhideWhenUsed="0"/>
-    <w:lsdException w:name="Medium Grid 2 Accent 1" w:semiHidden="0" w:uiPriority="68" w:unhideWhenUsed="0"/>
-    <w:lsdException w:name="Medium Grid 3 Accent 1" w:semiHidden="0" w:uiPriority="69" w:unhideWhenUsed="0"/>
-    <w:lsdException w:name="Dark List Accent 1" w:semiHidden="0" w:uiPriority="70" w:unhideWhenUsed="0"/>
-    <w:lsdException w:name="Colorful Shading Accent 1" w:semiHidden="0" w:uiPriority="71" w:unhideWhenUsed="0"/>
-    <w:lsdException w:name="Colorful List Accent 1" w:semiHidden="0" w:uiPriority="72" w:unhideWhenUsed="0"/>
-    <w:lsdException w:name="Colorful Grid Accent 1" w:semiHidden="0" w:uiPriority="73" w:unhideWhenUsed="0"/>
-    <w:lsdException w:name="Light Shading Accent 2" w:semiHidden="0" w:uiPriority="60" w:unhideWhenUsed="0"/>
-    <w:lsdException w:name="Light List Accent 2" w:semiHidden="0" w:uiPriority="61" w:unhideWhenUsed="0"/>
-    <w:lsdException w:name="Light Grid Accent 2" w:semiHidden="0" w:uiPriority="62" w:unhideWhenUsed="0"/>
-    <w:lsdException w:name="Medium Shading 1 Accent 2" w:semiHidden="0" w:uiPriority="63" w:unhideWhenUsed="0"/>
-    <w:lsdException w:name="Medium Shading 2 Accent 2" w:semiHidden="0" w:uiPriority="64" w:unhideWhenUsed="0"/>
-    <w:lsdException w:name="Medium List 1 Accent 2" w:semiHidden="0" w:uiPriority="65" w:unhideWhenUsed="0"/>
-    <w:lsdException w:name="Medium List 2 Accent 2" w:semiHidden="0" w:uiPriority="66" w:unhideWhenUsed="0"/>
-    <w:lsdException w:name="Medium Grid 1 Accent 2" w:semiHidden="0" w:uiPriority="67" w:unhideWhenUsed="0"/>
-    <w:lsdException w:name="Medium Grid 2 Accent 2" w:semiHidden="0" w:uiPriority="68" w:unhideWhenUsed="0"/>
-    <w:lsdException w:name="Medium Grid 3 Accent 2" w:semiHidden="0" w:uiPriority="69" w:unhideWhenUsed="0"/>
-    <w:lsdException w:name="Dark List Accent 2" w:semiHidden="0" w:uiPriority="70" w:unhideWhenUsed="0"/>
-    <w:lsdException w:name="Colorful Shading Accent 2" w:semiHidden="0" w:uiPriority="71" w:unhideWhenUsed="0"/>
-    <w:lsdException w:name="Colorful List Accent 2" w:semiHidden="0" w:uiPriority="72" w:unhideWhenUsed="0"/>
-    <w:lsdException w:name="Colorful Grid Accent 2" w:semiHidden="0" w:uiPriority="73" w:unhideWhenUsed="0"/>
-    <w:lsdException w:name="Light Shading Accent 3" w:semiHidden="0" w:uiPriority="60" w:unhideWhenUsed="0"/>
-    <w:lsdException w:name="Light List Accent 3" w:semiHidden="0" w:uiPriority="61" w:unhideWhenUsed="0"/>
-    <w:lsdException w:name="Light Grid Accent 3" w:semiHidden="0" w:uiPriority="62" w:unhideWhenUsed="0"/>
-    <w:lsdException w:name="Medium Shading 1 Accent 3" w:semiHidden="0" w:uiPriority="63" w:unhideWhenUsed="0"/>
-    <w:lsdException w:name="Medium Shading 2 Accent 3" w:semiHidden="0" w:uiPriority="64" w:unhideWhenUsed="0"/>
-    <w:lsdException w:name="Medium List 1 Accent 3" w:semiHidden="0" w:uiPriority="65" w:unhideWhenUsed="0"/>
-    <w:lsdException w:name="Medium List 2 Accent 3" w:semiHidden="0" w:uiPriority="66" w:unhideWhenUsed="0"/>
-    <w:lsdException w:name="Medium Grid 1 Accent 3" w:semiHidden="0" w:uiPriority="67" w:unhideWhenUsed="0"/>
-    <w:lsdException w:name="Medium Grid 2 Accent 3" w:semiHidden="0" w:uiPriority="68" w:unhideWhenUsed="0"/>
-    <w:lsdException w:name="Medium Grid 3 Accent 3" w:semiHidden="0" w:uiPriority="69" w:unhideWhenUsed="0"/>
-    <w:lsdException w:name="Dark List Accent 3" w:semiHidden="0" w:uiPriority="70" w:unhideWhenUsed="0"/>
-    <w:lsdException w:name="Colorful Shading Accent 3" w:semiHidden="0" w:uiPriority="71" w:unhideWhenUsed="0"/>
-    <w:lsdException w:name="Colorful List Accent 3" w:semiHidden="0" w:uiPriority="72" w:unhideWhenUsed="0"/>
-    <w:lsdException w:name="Colorful Grid Accent 3" w:semiHidden="0" w:uiPriority="73" w:unhideWhenUsed="0"/>
-    <w:lsdException w:name="Light Shading Accent 4" w:semiHidden="0" w:uiPriority="60" w:unhideWhenUsed="0"/>
-    <w:lsdException w:name="Light List Accent 4" w:semiHidden="0" w:uiPriority="61" w:unhideWhenUsed="0"/>
-    <w:lsdException w:name="Light Grid Accent 4" w:semiHidden="0" w:uiPriority="62" w:unhideWhenUsed="0"/>
-    <w:lsdException w:name="Medium Shading 1 Accent 4" w:semiHidden="0" w:uiPriority="63" w:unhideWhenUsed="0"/>
-    <w:lsdException w:name="Medium Shading 2 Accent 4" w:semiHidden="0" w:uiPriority="64" w:unhideWhenUsed="0"/>
-    <w:lsdException w:name="Medium List 1 Accent 4" w:semiHidden="0" w:uiPriority="65" w:unhideWhenUsed="0"/>
-    <w:lsdException w:name="Medium List 2 Accent 4" w:semiHidden="0" w:uiPriority="66" w:unhideWhenUsed="0"/>
-    <w:lsdException w:name="Medium Grid 1 Accent 4" w:semiHidden="0" w:uiPriority="67" w:unhideWhenUsed="0"/>
-    <w:lsdException w:name="Medium Grid 2 Accent 4" w:semiHidden="0" w:uiPriority="68" w:unhideWhenUsed="0"/>
-    <w:lsdException w:name="Medium Grid 3 Accent 4" w:semiHidden="0" w:uiPriority="69" w:unhideWhenUsed="0"/>
-    <w:lsdException w:name="Dark List Accent 4" w:semiHidden="0" w:uiPriority="70" w:unhideWhenUsed="0"/>
-    <w:lsdException w:name="Colorful Shading Accent 4" w:semiHidden="0" w:uiPriority="71" w:unhideWhenUsed="0"/>
-    <w:lsdException w:name="Colorful List Accent 4" w:semiHidden="0" w:uiPriority="72" w:unhideWhenUsed="0"/>
-    <w:lsdException w:name="Colorful Grid Accent 4" w:semiHidden="0" w:uiPriority="73" w:unhideWhenUsed="0"/>
-    <w:lsdException w:name="Light Shading Accent 5" w:semiHidden="0" w:uiPriority="60" w:unhideWhenUsed="0"/>
-    <w:lsdException w:name="Light List Accent 5" w:semiHidden="0" w:uiPriority="61" w:unhideWhenUsed="0"/>
-    <w:lsdException w:name="Light Grid Accent 5" w:semiHidden="0" w:uiPriority="62" w:unhideWhenUsed="0"/>
-    <w:lsdException w:name="Medium Shading 1 Accent 5" w:semiHidden="0" w:uiPriority="63" w:unhideWhenUsed="0"/>
-    <w:lsdException w:name="Medium Shading 2 Accent 5" w:semiHidden="0" w:uiPriority="64" w:unhideWhenUsed="0"/>
-    <w:lsdException w:name="Medium List 1 Accent 5" w:semiHidden="0" w:uiPriority="65" w:unhideWhenUsed="0"/>
-    <w:lsdException w:name="Medium List 2 Accent 5" w:semiHidden="0" w:uiPriority="66" w:unhideWhenUsed="0"/>
-    <w:lsdException w:name="Medium Grid 1 Accent 5" w:semiHidden="0" w:uiPriority="67" w:unhideWhenUsed="0"/>
-    <w:lsdException w:name="Medium Grid 2 Accent 5" w:semiHidden="0" w:uiPriority="68" w:unhideWhenUsed="0"/>
-    <w:lsdException w:name="Medium Grid 3 Accent 5" w:semiHidden="0" w:uiPriority="69" w:unhideWhenUsed="0"/>
-    <w:lsdException w:name="Dark List Accent 5" w:semiHidden="0" w:uiPriority="70" w:unhideWhenUsed="0"/>
-    <w:lsdException w:name="Colorful Shading Accent 5" w:semiHidden="0" w:uiPriority="71" w:unhideWhenUsed="0"/>
-    <w:lsdException w:name="Colorful List Accent 5" w:semiHidden="0" w:uiPriority="72" w:unhideWhenUsed="0"/>
-    <w:lsdException w:name="Colorful Grid Accent 5" w:semiHidden="0" w:uiPriority="73" w:unhideWhenUsed="0"/>
-    <w:lsdException w:name="Light Shading Accent 6" w:semiHidden="0" w:uiPriority="60" w:unhideWhenUsed="0"/>
-    <w:lsdException w:name="Light List Accent 6" w:semiHidden="0" w:uiPriority="61" w:unhideWhenUsed="0"/>
-    <w:lsdException w:name="Light Grid Accent 6" w:semiHidden="0" w:uiPriority="62" w:unhideWhenUsed="0"/>
-    <w:lsdException w:name="Medium Shading 1 Accent 6" w:semiHidden="0" w:uiPriority="63" w:unhideWhenUsed="0"/>
-    <w:lsdException w:name="Medium Shading 2 Accent 6" w:semiHidden="0" w:uiPriority="64" w:unhideWhenUsed="0"/>
-    <w:lsdException w:name="Medium List 1 Accent 6" w:semiHidden="0" w:uiPriority="65" w:unhideWhenUsed="0"/>
-    <w:lsdException w:name="Medium List 2 Accent 6" w:semiHidden="0" w:uiPriority="66" w:unhideWhenUsed="0"/>
-    <w:lsdException w:name="Medium Grid 1 Accent 6" w:semiHidden="0" w:uiPriority="67" w:unhideWhenUsed="0"/>
-    <w:lsdException w:name="Medium Grid 2 Accent 6" w:semiHidden="0" w:uiPriority="68" w:unhideWhenUsed="0"/>
-    <w:lsdException w:name="Medium Grid 3 Accent 6" w:semiHidden="0" w:uiPriority="69" w:unhideWhenUsed="0"/>
-    <w:lsdException w:name="Dark List Accent 6" w:semiHidden="0" w:uiPriority="70" w:unhideWhenUsed="0"/>
-    <w:lsdException w:name="Colorful Shading Accent 6" w:semiHidden="0" w:uiPriority="71" w:unhideWhenUsed="0"/>
-    <w:lsdException w:name="Colorful List Accent 6" w:semiHidden="0" w:uiPriority="72" w:unhideWhenUsed="0"/>
-    <w:lsdException w:name="Colorful Grid Accent 6" w:semiHidden="0" w:uiPriority="73" w:unhideWhenUsed="0"/>
-    <w:lsdException w:name="Subtle Emphasis" w:semiHidden="0" w:uiPriority="19" w:unhideWhenUsed="0" w:qFormat="1"/>
-    <w:lsdException w:name="Intense Emphasis" w:semiHidden="0" w:uiPriority="21" w:unhideWhenUsed="0" w:qFormat="1"/>
-    <w:lsdException w:name="Subtle Reference" w:semiHidden="0" w:uiPriority="31" w:unhideWhenUsed="0" w:qFormat="1"/>
-    <w:lsdException w:name="Intense Reference" w:semiHidden="0" w:uiPriority="32" w:unhideWhenUsed="0" w:qFormat="1"/>
-    <w:lsdException w:name="Book Title" w:semiHidden="0" w:uiPriority="33" w:unhideWhenUsed="0" w:qFormat="1"/>
-    <w:lsdException w:name="Bibliography" w:uiPriority="37"/>
-    <w:lsdException w:name="TOC Heading" w:uiPriority="39" w:qFormat="1"/>
+  <w:latentStyles w:defLockedState="0" w:defUIPriority="99" w:defSemiHidden="0" w:defUnhideWhenUsed="0" w:defQFormat="0" w:count="376">
+    <w:lsdException w:name="Normal" w:uiPriority="0" w:qFormat="1"/>
+    <w:lsdException w:name="heading 1" w:uiPriority="0" w:qFormat="1"/>
+    <w:lsdException w:name="heading 2" w:semiHidden="1" w:uiPriority="0" w:unhideWhenUsed="1" w:qFormat="1"/>
+    <w:lsdException w:name="heading 3" w:semiHidden="1" w:uiPriority="0" w:unhideWhenUsed="1" w:qFormat="1"/>
+    <w:lsdException w:name="heading 4" w:semiHidden="1" w:uiPriority="9" w:unhideWhenUsed="1" w:qFormat="1"/>
+    <w:lsdException w:name="heading 5" w:semiHidden="1" w:uiPriority="9" w:unhideWhenUsed="1" w:qFormat="1"/>
+    <w:lsdException w:name="heading 6" w:semiHidden="1" w:uiPriority="9" w:unhideWhenUsed="1" w:qFormat="1"/>
+    <w:lsdException w:name="heading 7" w:semiHidden="1" w:uiPriority="9" w:unhideWhenUsed="1" w:qFormat="1"/>
+    <w:lsdException w:name="heading 8" w:semiHidden="1" w:uiPriority="9" w:unhideWhenUsed="1" w:qFormat="1"/>
+    <w:lsdException w:name="heading 9" w:semiHidden="1" w:uiPriority="9" w:unhideWhenUsed="1" w:qFormat="1"/>
+    <w:lsdException w:name="index 1" w:semiHidden="1" w:unhideWhenUsed="1"/>
+    <w:lsdException w:name="index 2" w:semiHidden="1" w:unhideWhenUsed="1"/>
+    <w:lsdException w:name="index 3" w:semiHidden="1" w:unhideWhenUsed="1"/>
+    <w:lsdException w:name="index 4" w:semiHidden="1" w:unhideWhenUsed="1"/>
+    <w:lsdException w:name="index 5" w:semiHidden="1" w:unhideWhenUsed="1"/>
+    <w:lsdException w:name="index 6" w:semiHidden="1" w:unhideWhenUsed="1"/>
+    <w:lsdException w:name="index 7" w:semiHidden="1" w:unhideWhenUsed="1"/>
+    <w:lsdException w:name="index 8" w:semiHidden="1" w:unhideWhenUsed="1"/>
+    <w:lsdException w:name="index 9" w:semiHidden="1" w:unhideWhenUsed="1"/>
+    <w:lsdException w:name="toc 1" w:semiHidden="1" w:uiPriority="39" w:unhideWhenUsed="1" w:qFormat="1"/>
+    <w:lsdException w:name="toc 2" w:semiHidden="1" w:uiPriority="39" w:unhideWhenUsed="1" w:qFormat="1"/>
+    <w:lsdException w:name="toc 3" w:semiHidden="1" w:uiPriority="39" w:unhideWhenUsed="1" w:qFormat="1"/>
+    <w:lsdException w:name="toc 4" w:semiHidden="1" w:uiPriority="39" w:unhideWhenUsed="1"/>
+    <w:lsdException w:name="toc 5" w:semiHidden="1" w:uiPriority="39" w:unhideWhenUsed="1"/>
+    <w:lsdException w:name="toc 6" w:semiHidden="1" w:uiPriority="39" w:unhideWhenUsed="1"/>
+    <w:lsdException w:name="toc 7" w:semiHidden="1" w:uiPriority="39" w:unhideWhenUsed="1"/>
+    <w:lsdException w:name="toc 8" w:semiHidden="1" w:uiPriority="39" w:unhideWhenUsed="1"/>
+    <w:lsdException w:name="toc 9" w:semiHidden="1" w:uiPriority="39" w:unhideWhenUsed="1"/>
+    <w:lsdException w:name="Normal Indent" w:semiHidden="1" w:unhideWhenUsed="1"/>
+    <w:lsdException w:name="footnote text" w:semiHidden="1" w:unhideWhenUsed="1"/>
+    <w:lsdException w:name="annotation text" w:semiHidden="1" w:unhideWhenUsed="1"/>
+    <w:lsdException w:name="header" w:semiHidden="1" w:unhideWhenUsed="1"/>
+    <w:lsdException w:name="footer" w:semiHidden="1" w:uiPriority="0" w:unhideWhenUsed="1"/>
+    <w:lsdException w:name="index heading" w:semiHidden="1" w:unhideWhenUsed="1"/>
+    <w:lsdException w:name="caption" w:semiHidden="1" w:uiPriority="0" w:unhideWhenUsed="1" w:qFormat="1"/>
+    <w:lsdException w:name="table of figures" w:semiHidden="1" w:unhideWhenUsed="1"/>
+    <w:lsdException w:name="envelope address" w:semiHidden="1" w:unhideWhenUsed="1"/>
+    <w:lsdException w:name="envelope return" w:semiHidden="1" w:unhideWhenUsed="1"/>
+    <w:lsdException w:name="footnote reference" w:semiHidden="1" w:unhideWhenUsed="1"/>
+    <w:lsdException w:name="annotation reference" w:semiHidden="1" w:unhideWhenUsed="1"/>
+    <w:lsdException w:name="line number" w:semiHidden="1" w:unhideWhenUsed="1"/>
+    <w:lsdException w:name="page number" w:semiHidden="1" w:unhideWhenUsed="1"/>
+    <w:lsdException w:name="endnote reference" w:semiHidden="1" w:unhideWhenUsed="1"/>
+    <w:lsdException w:name="endnote text" w:semiHidden="1" w:unhideWhenUsed="1"/>
+    <w:lsdException w:name="table of authorities" w:semiHidden="1" w:unhideWhenUsed="1"/>
+    <w:lsdException w:name="macro" w:semiHidden="1" w:unhideWhenUsed="1"/>
+    <w:lsdException w:name="toa heading" w:semiHidden="1" w:unhideWhenUsed="1"/>
+    <w:lsdException w:name="List" w:semiHidden="1" w:unhideWhenUsed="1"/>
+    <w:lsdException w:name="List Bullet" w:semiHidden="1" w:unhideWhenUsed="1"/>
+    <w:lsdException w:name="List Number" w:semiHidden="1" w:unhideWhenUsed="1"/>
+    <w:lsdException w:name="List 2" w:semiHidden="1" w:unhideWhenUsed="1"/>
+    <w:lsdException w:name="List 3" w:semiHidden="1" w:unhideWhenUsed="1"/>
+    <w:lsdException w:name="List 4" w:semiHidden="1" w:unhideWhenUsed="1"/>
+    <w:lsdException w:name="List 5" w:semiHidden="1" w:unhideWhenUsed="1"/>
+    <w:lsdException w:name="List Bullet 2" w:semiHidden="1" w:unhideWhenUsed="1"/>
+    <w:lsdException w:name="List Bullet 3" w:semiHidden="1" w:unhideWhenUsed="1"/>
+    <w:lsdException w:name="List Bullet 4" w:semiHidden="1" w:unhideWhenUsed="1"/>
+    <w:lsdException w:name="List Bullet 5" w:semiHidden="1" w:unhideWhenUsed="1"/>
+    <w:lsdException w:name="List Number 2" w:semiHidden="1" w:unhideWhenUsed="1"/>
+    <w:lsdException w:name="List Number 3" w:semiHidden="1" w:unhideWhenUsed="1"/>
+    <w:lsdException w:name="List Number 4" w:semiHidden="1" w:unhideWhenUsed="1"/>
+    <w:lsdException w:name="List Number 5" w:semiHidden="1" w:unhideWhenUsed="1"/>
+    <w:lsdException w:name="Title" w:uiPriority="10" w:qFormat="1"/>
+    <w:lsdException w:name="Closing" w:semiHidden="1" w:unhideWhenUsed="1"/>
+    <w:lsdException w:name="Signature" w:semiHidden="1" w:unhideWhenUsed="1"/>
+    <w:lsdException w:name="Default Paragraph Font" w:semiHidden="1" w:uiPriority="1" w:unhideWhenUsed="1"/>
+    <w:lsdException w:name="Body Text" w:semiHidden="1" w:unhideWhenUsed="1"/>
+    <w:lsdException w:name="Body Text Indent" w:semiHidden="1" w:unhideWhenUsed="1"/>
+    <w:lsdException w:name="List Continue" w:semiHidden="1" w:unhideWhenUsed="1"/>
+    <w:lsdException w:name="List Continue 2" w:semiHidden="1" w:unhideWhenUsed="1"/>
+    <w:lsdException w:name="List Continue 3" w:semiHidden="1" w:unhideWhenUsed="1"/>
+    <w:lsdException w:name="List Continue 4" w:semiHidden="1" w:unhideWhenUsed="1"/>
+    <w:lsdException w:name="List Continue 5" w:semiHidden="1" w:unhideWhenUsed="1"/>
+    <w:lsdException w:name="Message Header" w:semiHidden="1" w:unhideWhenUsed="1"/>
+    <w:lsdException w:name="Subtitle" w:uiPriority="11" w:qFormat="1"/>
+    <w:lsdException w:name="Salutation" w:semiHidden="1" w:unhideWhenUsed="1"/>
+    <w:lsdException w:name="Date" w:semiHidden="1" w:unhideWhenUsed="1"/>
+    <w:lsdException w:name="Body Text First Indent" w:semiHidden="1" w:unhideWhenUsed="1"/>
+    <w:lsdException w:name="Body Text First Indent 2" w:semiHidden="1" w:unhideWhenUsed="1"/>
+    <w:lsdException w:name="Note Heading" w:semiHidden="1" w:unhideWhenUsed="1"/>
+    <w:lsdException w:name="Body Text 2" w:semiHidden="1" w:unhideWhenUsed="1"/>
+    <w:lsdException w:name="Body Text 3" w:semiHidden="1" w:unhideWhenUsed="1"/>
+    <w:lsdException w:name="Body Text Indent 2" w:semiHidden="1" w:unhideWhenUsed="1"/>
+    <w:lsdException w:name="Body Text Indent 3" w:semiHidden="1" w:unhideWhenUsed="1"/>
+    <w:lsdException w:name="Block Text" w:semiHidden="1" w:unhideWhenUsed="1"/>
+    <w:lsdException w:name="Hyperlink" w:semiHidden="1" w:unhideWhenUsed="1"/>
+    <w:lsdException w:name="FollowedHyperlink" w:semiHidden="1" w:unhideWhenUsed="1"/>
+    <w:lsdException w:name="Strong" w:uiPriority="22" w:qFormat="1"/>
+    <w:lsdException w:name="Emphasis" w:uiPriority="20" w:qFormat="1"/>
+    <w:lsdException w:name="Document Map" w:semiHidden="1" w:unhideWhenUsed="1"/>
+    <w:lsdException w:name="Plain Text" w:semiHidden="1" w:unhideWhenUsed="1"/>
+    <w:lsdException w:name="E-mail Signature" w:semiHidden="1" w:unhideWhenUsed="1"/>
+    <w:lsdException w:name="HTML Top of Form" w:semiHidden="1" w:unhideWhenUsed="1"/>
+    <w:lsdException w:name="HTML Bottom of Form" w:semiHidden="1" w:unhideWhenUsed="1"/>
+    <w:lsdException w:name="Normal (Web)" w:semiHidden="1" w:unhideWhenUsed="1"/>
+    <w:lsdException w:name="HTML Acronym" w:semiHidden="1" w:unhideWhenUsed="1"/>
+    <w:lsdException w:name="HTML Address" w:semiHidden="1" w:unhideWhenUsed="1"/>
+    <w:lsdException w:name="HTML Cite" w:semiHidden="1" w:unhideWhenUsed="1"/>
+    <w:lsdException w:name="HTML Code" w:semiHidden="1" w:unhideWhenUsed="1"/>
+    <w:lsdException w:name="HTML Definition" w:semiHidden="1" w:unhideWhenUsed="1"/>
+    <w:lsdException w:name="HTML Keyboard" w:semiHidden="1" w:unhideWhenUsed="1"/>
+    <w:lsdException w:name="HTML Preformatted" w:semiHidden="1" w:unhideWhenUsed="1"/>
+    <w:lsdException w:name="HTML Sample" w:semiHidden="1" w:unhideWhenUsed="1"/>
+    <w:lsdException w:name="HTML Typewriter" w:semiHidden="1" w:unhideWhenUsed="1"/>
+    <w:lsdException w:name="HTML Variable" w:semiHidden="1" w:unhideWhenUsed="1"/>
+    <w:lsdException w:name="Normal Table" w:semiHidden="1" w:unhideWhenUsed="1"/>
+    <w:lsdException w:name="annotation subject" w:semiHidden="1" w:unhideWhenUsed="1"/>
+    <w:lsdException w:name="No List" w:semiHidden="1" w:unhideWhenUsed="1"/>
+    <w:lsdException w:name="Outline List 1" w:semiHidden="1" w:unhideWhenUsed="1"/>
+    <w:lsdException w:name="Outline List 2" w:semiHidden="1" w:unhideWhenUsed="1"/>
+    <w:lsdException w:name="Outline List 3" w:semiHidden="1" w:unhideWhenUsed="1"/>
+    <w:lsdException w:name="Table Simple 1" w:semiHidden="1" w:unhideWhenUsed="1"/>
+    <w:lsdException w:name="Table Simple 2" w:semiHidden="1" w:unhideWhenUsed="1"/>
+    <w:lsdException w:name="Table Simple 3" w:semiHidden="1" w:unhideWhenUsed="1"/>
+    <w:lsdException w:name="Table Classic 1" w:semiHidden="1" w:unhideWhenUsed="1"/>
+    <w:lsdException w:name="Table Classic 2" w:semiHidden="1" w:unhideWhenUsed="1"/>
+    <w:lsdException w:name="Table Classic 3" w:semiHidden="1" w:unhideWhenUsed="1"/>
+    <w:lsdException w:name="Table Classic 4" w:semiHidden="1" w:unhideWhenUsed="1"/>
+    <w:lsdException w:name="Table Colorful 1" w:semiHidden="1" w:unhideWhenUsed="1"/>
+    <w:lsdException w:name="Table Colorful 2" w:semiHidden="1" w:unhideWhenUsed="1"/>
+    <w:lsdException w:name="Table Colorful 3" w:semiHidden="1" w:unhideWhenUsed="1"/>
+    <w:lsdException w:name="Table Columns 1" w:semiHidden="1" w:unhideWhenUsed="1"/>
+    <w:lsdException w:name="Table Columns 2" w:semiHidden="1" w:unhideWhenUsed="1"/>
+    <w:lsdException w:name="Table Columns 3" w:semiHidden="1" w:unhideWhenUsed="1"/>
+    <w:lsdException w:name="Table Columns 4" w:semiHidden="1" w:unhideWhenUsed="1"/>
+    <w:lsdException w:name="Table Columns 5" w:semiHidden="1" w:unhideWhenUsed="1"/>
+    <w:lsdException w:name="Table Grid 1" w:semiHidden="1" w:unhideWhenUsed="1"/>
+    <w:lsdException w:name="Table Grid 2" w:semiHidden="1" w:unhideWhenUsed="1"/>
+    <w:lsdException w:name="Table Grid 3" w:semiHidden="1" w:unhideWhenUsed="1"/>
+    <w:lsdException w:name="Table Grid 4" w:semiHidden="1" w:unhideWhenUsed="1"/>
+    <w:lsdException w:name="Table Grid 5" w:semiHidden="1" w:unhideWhenUsed="1"/>
+    <w:lsdException w:name="Table Grid 6" w:semiHidden="1" w:unhideWhenUsed="1"/>
+    <w:lsdException w:name="Table Grid 7" w:semiHidden="1" w:unhideWhenUsed="1"/>
+    <w:lsdException w:name="Table Grid 8" w:semiHidden="1" w:unhideWhenUsed="1"/>
+    <w:lsdException w:name="Table List 1" w:semiHidden="1" w:unhideWhenUsed="1"/>
+    <w:lsdException w:name="Table List 2" w:semiHidden="1" w:unhideWhenUsed="1"/>
+    <w:lsdException w:name="Table List 3" w:semiHidden="1" w:unhideWhenUsed="1"/>
+    <w:lsdException w:name="Table List 4" w:semiHidden="1" w:unhideWhenUsed="1"/>
+    <w:lsdException w:name="Table List 5" w:semiHidden="1" w:unhideWhenUsed="1"/>
+    <w:lsdException w:name="Table List 6" w:semiHidden="1" w:unhideWhenUsed="1"/>
+    <w:lsdException w:name="Table List 7" w:semiHidden="1" w:unhideWhenUsed="1"/>
+    <w:lsdException w:name="Table List 8" w:semiHidden="1" w:unhideWhenUsed="1"/>
+    <w:lsdException w:name="Table 3D effects 1" w:semiHidden="1" w:unhideWhenUsed="1"/>
+    <w:lsdException w:name="Table 3D effects 2" w:semiHidden="1" w:unhideWhenUsed="1"/>
+    <w:lsdException w:name="Table 3D effects 3" w:semiHidden="1" w:unhideWhenUsed="1"/>
+    <w:lsdException w:name="Table Contemporary" w:semiHidden="1" w:unhideWhenUsed="1"/>
+    <w:lsdException w:name="Table Elegant" w:semiHidden="1" w:unhideWhenUsed="1"/>
+    <w:lsdException w:name="Table Professional" w:semiHidden="1" w:unhideWhenUsed="1"/>
+    <w:lsdException w:name="Table Subtle 1" w:semiHidden="1" w:unhideWhenUsed="1"/>
+    <w:lsdException w:name="Table Subtle 2" w:semiHidden="1" w:unhideWhenUsed="1"/>
+    <w:lsdException w:name="Table Web 1" w:semiHidden="1" w:unhideWhenUsed="1"/>
+    <w:lsdException w:name="Table Web 2" w:semiHidden="1" w:unhideWhenUsed="1"/>
+    <w:lsdException w:name="Table Web 3" w:semiHidden="1" w:unhideWhenUsed="1"/>
+    <w:lsdException w:name="Balloon Text" w:semiHidden="1" w:unhideWhenUsed="1"/>
+    <w:lsdException w:name="Table Grid" w:uiPriority="59"/>
+    <w:lsdException w:name="Table Theme" w:semiHidden="1" w:unhideWhenUsed="1"/>
+    <w:lsdException w:name="Placeholder Text" w:semiHidden="1"/>
+    <w:lsdException w:name="No Spacing" w:uiPriority="1" w:qFormat="1"/>
+    <w:lsdException w:name="Light Shading" w:uiPriority="60"/>
+    <w:lsdException w:name="Light List" w:uiPriority="61"/>
+    <w:lsdException w:name="Light Grid" w:uiPriority="62"/>
+    <w:lsdException w:name="Medium Shading 1" w:uiPriority="63"/>
+    <w:lsdException w:name="Medium Shading 2" w:uiPriority="64"/>
+    <w:lsdException w:name="Medium List 1" w:uiPriority="65"/>
+    <w:lsdException w:name="Medium List 2" w:uiPriority="66"/>
+    <w:lsdException w:name="Medium Grid 1" w:uiPriority="67"/>
+    <w:lsdException w:name="Medium Grid 2" w:uiPriority="68"/>
+    <w:lsdException w:name="Medium Grid 3" w:uiPriority="69"/>
+    <w:lsdException w:name="Dark List" w:uiPriority="70"/>
+    <w:lsdException w:name="Colorful Shading" w:uiPriority="71"/>
+    <w:lsdException w:name="Colorful List" w:uiPriority="72"/>
+    <w:lsdException w:name="Colorful Grid" w:uiPriority="73"/>
+    <w:lsdException w:name="Light Shading Accent 1" w:uiPriority="60"/>
+    <w:lsdException w:name="Light List Accent 1" w:uiPriority="61"/>
+    <w:lsdException w:name="Light Grid Accent 1" w:uiPriority="62"/>
+    <w:lsdException w:name="Medium Shading 1 Accent 1" w:uiPriority="63"/>
+    <w:lsdException w:name="Medium Shading 2 Accent 1" w:uiPriority="64"/>
+    <w:lsdException w:name="Medium List 1 Accent 1" w:uiPriority="65"/>
+    <w:lsdException w:name="Revision" w:semiHidden="1"/>
+    <w:lsdException w:name="List Paragraph" w:uiPriority="34" w:qFormat="1"/>
+    <w:lsdException w:name="Quote" w:uiPriority="29" w:qFormat="1"/>
+    <w:lsdException w:name="Intense Quote" w:uiPriority="30" w:qFormat="1"/>
+    <w:lsdException w:name="Medium List 2 Accent 1" w:uiPriority="66"/>
+    <w:lsdException w:name="Medium Grid 1 Accent 1" w:uiPriority="67"/>
+    <w:lsdException w:name="Medium Grid 2 Accent 1" w:uiPriority="68"/>
+    <w:lsdException w:name="Medium Grid 3 Accent 1" w:uiPriority="69"/>
+    <w:lsdException w:name="Dark List Accent 1" w:uiPriority="70"/>
+    <w:lsdException w:name="Colorful Shading Accent 1" w:uiPriority="71"/>
+    <w:lsdException w:name="Colorful List Accent 1" w:uiPriority="72"/>
+    <w:lsdException w:name="Colorful Grid Accent 1" w:uiPriority="73"/>
+    <w:lsdException w:name="Light Shading Accent 2" w:uiPriority="60"/>
+    <w:lsdException w:name="Light List Accent 2" w:uiPriority="61"/>
+    <w:lsdException w:name="Light Grid Accent 2" w:uiPriority="62"/>
+    <w:lsdException w:name="Medium Shading 1 Accent 2" w:uiPriority="63"/>
+    <w:lsdException w:name="Medium Shading 2 Accent 2" w:uiPriority="64"/>
+    <w:lsdException w:name="Medium List 1 Accent 2" w:uiPriority="65"/>
+    <w:lsdException w:name="Medium List 2 Accent 2" w:uiPriority="66"/>
+    <w:lsdException w:name="Medium Grid 1 Accent 2" w:uiPriority="67"/>
+    <w:lsdException w:name="Medium Grid 2 Accent 2" w:uiPriority="68"/>
+    <w:lsdException w:name="Medium Grid 3 Accent 2" w:uiPriority="69"/>
+    <w:lsdException w:name="Dark List Accent 2" w:uiPriority="70"/>
+    <w:lsdException w:name="Colorful Shading Accent 2" w:uiPriority="71"/>
+    <w:lsdException w:name="Colorful List Accent 2" w:uiPriority="72"/>
+    <w:lsdException w:name="Colorful Grid Accent 2" w:uiPriority="73"/>
+    <w:lsdException w:name="Light Shading Accent 3" w:uiPriority="60"/>
+    <w:lsdException w:name="Light List Accent 3" w:uiPriority="61"/>
+    <w:lsdException w:name="Light Grid Accent 3" w:uiPriority="62"/>
+    <w:lsdException w:name="Medium Shading 1 Accent 3" w:uiPriority="63"/>
+    <w:lsdException w:name="Medium Shading 2 Accent 3" w:uiPriority="64"/>
+    <w:lsdException w:name="Medium List 1 Accent 3" w:uiPriority="65"/>
+    <w:lsdException w:name="Medium List 2 Accent 3" w:uiPriority="66"/>
+    <w:lsdException w:name="Medium Grid 1 Accent 3" w:uiPriority="67"/>
+    <w:lsdException w:name="Medium Grid 2 Accent 3" w:uiPriority="68"/>
+    <w:lsdException w:name="Medium Grid 3 Accent 3" w:uiPriority="69"/>
+    <w:lsdException w:name="Dark List Accent 3" w:uiPriority="70"/>
+    <w:lsdException w:name="Colorful Shading Accent 3" w:uiPriority="71"/>
+    <w:lsdException w:name="Colorful List Accent 3" w:uiPriority="72"/>
+    <w:lsdException w:name="Colorful Grid Accent 3" w:uiPriority="73"/>
+    <w:lsdException w:name="Light Shading Accent 4" w:uiPriority="60"/>
+    <w:lsdException w:name="Light List Accent 4" w:uiPriority="61"/>
+    <w:lsdException w:name="Light Grid Accent 4" w:uiPriority="62"/>
+    <w:lsdException w:name="Medium Shading 1 Accent 4" w:uiPriority="63"/>
+    <w:lsdException w:name="Medium Shading 2 Accent 4" w:uiPriority="64"/>
+    <w:lsdException w:name="Medium List 1 Accent 4" w:uiPriority="65"/>
+    <w:lsdException w:name="Medium List 2 Accent 4" w:uiPriority="66"/>
+    <w:lsdException w:name="Medium Grid 1 Accent 4" w:uiPriority="67"/>
+    <w:lsdException w:name="Medium Grid 2 Accent 4" w:uiPriority="68"/>
+    <w:lsdException w:name="Medium Grid 3 Accent 4" w:uiPriority="69"/>
+    <w:lsdException w:name="Dark List Accent 4" w:uiPriority="70"/>
+    <w:lsdException w:name="Colorful Shading Accent 4" w:uiPriority="71"/>
+    <w:lsdException w:name="Colorful List Accent 4" w:uiPriority="72"/>
+    <w:lsdException w:name="Colorful Grid Accent 4" w:uiPriority="73"/>
+    <w:lsdException w:name="Light Shading Accent 5" w:uiPriority="60"/>
+    <w:lsdException w:name="Light List Accent 5" w:uiPriority="61"/>
+    <w:lsdException w:name="Light Grid Accent 5" w:uiPriority="62"/>
+    <w:lsdException w:name="Medium Shading 1 Accent 5" w:uiPriority="63"/>
+    <w:lsdException w:name="Medium Shading 2 Accent 5" w:uiPriority="64"/>
+    <w:lsdException w:name="Medium List 1 Accent 5" w:uiPriority="65"/>
+    <w:lsdException w:name="Medium List 2 Accent 5" w:uiPriority="66"/>
+    <w:lsdException w:name="Medium Grid 1 Accent 5" w:uiPriority="67"/>
+    <w:lsdException w:name="Medium Grid 2 Accent 5" w:uiPriority="68"/>
+    <w:lsdException w:name="Medium Grid 3 Accent 5" w:uiPriority="69"/>
+    <w:lsdException w:name="Dark List Accent 5" w:uiPriority="70"/>
+    <w:lsdException w:name="Colorful Shading Accent 5" w:uiPriority="71"/>
+    <w:lsdException w:name="Colorful List Accent 5" w:uiPriority="72"/>
+    <w:lsdException w:name="Colorful Grid Accent 5" w:uiPriority="73"/>
+    <w:lsdException w:name="Light Shading Accent 6" w:uiPriority="60"/>
+    <w:lsdException w:name="Light List Accent 6" w:uiPriority="61"/>
+    <w:lsdException w:name="Light Grid Accent 6" w:uiPriority="62"/>
+    <w:lsdException w:name="Medium Shading 1 Accent 6" w:uiPriority="63"/>
+    <w:lsdException w:name="Medium Shading 2 Accent 6" w:uiPriority="64"/>
+    <w:lsdException w:name="Medium List 1 Accent 6" w:uiPriority="65"/>
+    <w:lsdException w:name="Medium List 2 Accent 6" w:uiPriority="66"/>
+    <w:lsdException w:name="Medium Grid 1 Accent 6" w:uiPriority="67"/>
+    <w:lsdException w:name="Medium Grid 2 Accent 6" w:uiPriority="68"/>
+    <w:lsdException w:name="Medium Grid 3 Accent 6" w:uiPriority="69"/>
+    <w:lsdException w:name="Dark List Accent 6" w:uiPriority="70"/>
+    <w:lsdException w:name="Colorful Shading Accent 6" w:uiPriority="71"/>
+    <w:lsdException w:name="Colorful List Accent 6" w:uiPriority="72"/>
+    <w:lsdException w:name="Colorful Grid Accent 6" w:uiPriority="73"/>
+    <w:lsdException w:name="Subtle Emphasis" w:uiPriority="19" w:qFormat="1"/>
+    <w:lsdException w:name="Intense Emphasis" w:uiPriority="21" w:qFormat="1"/>
+    <w:lsdException w:name="Subtle Reference" w:uiPriority="31" w:qFormat="1"/>
+    <w:lsdException w:name="Intense Reference" w:uiPriority="32" w:qFormat="1"/>
+    <w:lsdException w:name="Book Title" w:uiPriority="33" w:qFormat="1"/>
+    <w:lsdException w:name="Bibliography" w:semiHidden="1" w:uiPriority="37" w:unhideWhenUsed="1"/>
+    <w:lsdException w:name="TOC Heading" w:semiHidden="1" w:uiPriority="39" w:unhideWhenUsed="1" w:qFormat="1"/>
+    <w:lsdException w:name="Plain Table 1" w:uiPriority="41"/>
+    <w:lsdException w:name="Plain Table 2" w:uiPriority="42"/>
+    <w:lsdException w:name="Plain Table 3" w:uiPriority="43"/>
+    <w:lsdException w:name="Plain Table 4" w:uiPriority="44"/>
+    <w:lsdException w:name="Plain Table 5" w:uiPriority="45"/>
+    <w:lsdException w:name="Grid Table Light" w:uiPriority="40"/>
+    <w:lsdException w:name="Grid Table 1 Light" w:uiPriority="46"/>
+    <w:lsdException w:name="Grid Table 2" w:uiPriority="47"/>
+    <w:lsdException w:name="Grid Table 3" w:uiPriority="48"/>
+    <w:lsdException w:name="Grid Table 4" w:uiPriority="49"/>
+    <w:lsdException w:name="Grid Table 5 Dark" w:uiPriority="50"/>
+    <w:lsdException w:name="Grid Table 6 Colorful" w:uiPriority="51"/>
+    <w:lsdException w:name="Grid Table 7 Colorful" w:uiPriority="52"/>
+    <w:lsdException w:name="Grid Table 1 Light Accent 1" w:uiPriority="46"/>
+    <w:lsdException w:name="Grid Table 2 Accent 1" w:uiPriority="47"/>
+    <w:lsdException w:name="Grid Table 3 Accent 1" w:uiPriority="48"/>
+    <w:lsdException w:name="Grid Table 4 Accent 1" w:uiPriority="49"/>
+    <w:lsdException w:name="Grid Table 5 Dark Accent 1" w:uiPriority="50"/>
+    <w:lsdException w:name="Grid Table 6 Colorful Accent 1" w:uiPriority="51"/>
+    <w:lsdException w:name="Grid Table 7 Colorful Accent 1" w:uiPriority="52"/>
+    <w:lsdException w:name="Grid Table 1 Light Accent 2" w:uiPriority="46"/>
+    <w:lsdException w:name="Grid Table 2 Accent 2" w:uiPriority="47"/>
+    <w:lsdException w:name="Grid Table 3 Accent 2" w:uiPriority="48"/>
+    <w:lsdException w:name="Grid Table 4 Accent 2" w:uiPriority="49"/>
+    <w:lsdException w:name="Grid Table 5 Dark Accent 2" w:uiPriority="50"/>
+    <w:lsdException w:name="Grid Table 6 Colorful Accent 2" w:uiPriority="51"/>
+    <w:lsdException w:name="Grid Table 7 Colorful Accent 2" w:uiPriority="52"/>
+    <w:lsdException w:name="Grid Table 1 Light Accent 3" w:uiPriority="46"/>
+    <w:lsdException w:name="Grid Table 2 Accent 3" w:uiPriority="47"/>
+    <w:lsdException w:name="Grid Table 3 Accent 3" w:uiPriority="48"/>
+    <w:lsdException w:name="Grid Table 4 Accent 3" w:uiPriority="49"/>
+    <w:lsdException w:name="Grid Table 5 Dark Accent 3" w:uiPriority="50"/>
+    <w:lsdException w:name="Grid Table 6 Colorful Accent 3" w:uiPriority="51"/>
+    <w:lsdException w:name="Grid Table 7 Colorful Accent 3" w:uiPriority="52"/>
+    <w:lsdException w:name="Grid Table 1 Light Accent 4" w:uiPriority="46"/>
+    <w:lsdException w:name="Grid Table 2 Accent 4" w:uiPriority="47"/>
+    <w:lsdException w:name="Grid Table 3 Accent 4" w:uiPriority="48"/>
+    <w:lsdException w:name="Grid Table 4 Accent 4" w:uiPriority="49"/>
+    <w:lsdException w:name="Grid Table 5 Dark Accent 4" w:uiPriority="50"/>
+    <w:lsdException w:name="Grid Table 6 Colorful Accent 4" w:uiPriority="51"/>
+    <w:lsdException w:name="Grid Table 7 Colorful Accent 4" w:uiPriority="52"/>
+    <w:lsdException w:name="Grid Table 1 Light Accent 5" w:uiPriority="46"/>
+    <w:lsdException w:name="Grid Table 2 Accent 5" w:uiPriority="47"/>
+    <w:lsdException w:name="Grid Table 3 Accent 5" w:uiPriority="48"/>
+    <w:lsdException w:name="Grid Table 4 Accent 5" w:uiPriority="49"/>
+    <w:lsdException w:name="Grid Table 5 Dark Accent 5" w:uiPriority="50"/>
+    <w:lsdException w:name="Grid Table 6 Colorful Accent 5" w:uiPriority="51"/>
+    <w:lsdException w:name="Grid Table 7 Colorful Accent 5" w:uiPriority="52"/>
+    <w:lsdException w:name="Grid Table 1 Light Accent 6" w:uiPriority="46"/>
+    <w:lsdException w:name="Grid Table 2 Accent 6" w:uiPriority="47"/>
+    <w:lsdException w:name="Grid Table 3 Accent 6" w:uiPriority="48"/>
+    <w:lsdException w:name="Grid Table 4 Accent 6" w:uiPriority="49"/>
+    <w:lsdException w:name="Grid Table 5 Dark Accent 6" w:uiPriority="50"/>
+    <w:lsdException w:name="Grid Table 6 Colorful Accent 6" w:uiPriority="51"/>
+    <w:lsdException w:name="Grid Table 7 Colorful Accent 6" w:uiPriority="52"/>
+    <w:lsdException w:name="List Table 1 Light" w:uiPriority="46"/>
+    <w:lsdException w:name="List Table 2" w:uiPriority="47"/>
+    <w:lsdException w:name="List Table 3" w:uiPriority="48"/>
+    <w:lsdException w:name="List Table 4" w:uiPriority="49"/>
+    <w:lsdException w:name="List Table 5 Dark" w:uiPriority="50"/>
+    <w:lsdException w:name="List Table 6 Colorful" w:uiPriority="51"/>
+    <w:lsdException w:name="List Table 7 Colorful" w:uiPriority="52"/>
+    <w:lsdException w:name="List Table 1 Light Accent 1" w:uiPriority="46"/>
+    <w:lsdException w:name="List Table 2 Accent 1" w:uiPriority="47"/>
+    <w:lsdException w:name="List Table 3 Accent 1" w:uiPriority="48"/>
+    <w:lsdException w:name="List Table 4 Accent 1" w:uiPriority="49"/>
+    <w:lsdException w:name="List Table 5 Dark Accent 1" w:uiPriority="50"/>
+    <w:lsdException w:name="List Table 6 Colorful Accent 1" w:uiPriority="51"/>
+    <w:lsdException w:name="List Table 7 Colorful Accent 1" w:uiPriority="52"/>
+    <w:lsdException w:name="List Table 1 Light Accent 2" w:uiPriority="46"/>
+    <w:lsdException w:name="List Table 2 Accent 2" w:uiPriority="47"/>
+    <w:lsdException w:name="List Table 3 Accent 2" w:uiPriority="48"/>
+    <w:lsdException w:name="List Table 4 Accent 2" w:uiPriority="49"/>
+    <w:lsdException w:name="List Table 5 Dark Accent 2" w:uiPriority="50"/>
+    <w:lsdException w:name="List Table 6 Colorful Accent 2" w:uiPriority="51"/>
+    <w:lsdException w:name="List Table 7 Colorful Accent 2" w:uiPriority="52"/>
+    <w:lsdException w:name="List Table 1 Light Accent 3" w:uiPriority="46"/>
+    <w:lsdException w:name="List Table 2 Accent 3" w:uiPriority="47"/>
+    <w:lsdException w:name="List Table 3 Accent 3" w:uiPriority="48"/>
+    <w:lsdException w:name="List Table 4 Accent 3" w:uiPriority="49"/>
+    <w:lsdException w:name="List Table 5 Dark Accent 3" w:uiPriority="50"/>
+    <w:lsdException w:name="List Table 6 Colorful Accent 3" w:uiPriority="51"/>
+    <w:lsdException w:name="List Table 7 Colorful Accent 3" w:uiPriority="52"/>
+    <w:lsdException w:name="List Table 1 Light Accent 4" w:uiPriority="46"/>
+    <w:lsdException w:name="List Table 2 Accent 4" w:uiPriority="47"/>
+    <w:lsdException w:name="List Table 3 Accent 4" w:uiPriority="48"/>
+    <w:lsdException w:name="List Table 4 Accent 4" w:uiPriority="49"/>
+    <w:lsdException w:name="List Table 5 Dark Accent 4" w:uiPriority="50"/>
+    <w:lsdException w:name="List Table 6 Colorful Accent 4" w:uiPriority="51"/>
+    <w:lsdException w:name="List Table 7 Colorful Accent 4" w:uiPriority="52"/>
+    <w:lsdException w:name="List Table 1 Light Accent 5" w:uiPriority="46"/>
+    <w:lsdException w:name="List Table 2 Accent 5" w:uiPriority="47"/>
+    <w:lsdException w:name="List Table 3 Accent 5" w:uiPriority="48"/>
+    <w:lsdException w:name="List Table 4 Accent 5" w:uiPriority="49"/>
+    <w:lsdException w:name="List Table 5 Dark Accent 5" w:uiPriority="50"/>
+    <w:lsdException w:name="List Table 6 Colorful Accent 5" w:uiPriority="51"/>
+    <w:lsdException w:name="List Table 7 Colorful Accent 5" w:uiPriority="52"/>
+    <w:lsdException w:name="List Table 1 Light Accent 6" w:uiPriority="46"/>
+    <w:lsdException w:name="List Table 2 Accent 6" w:uiPriority="47"/>
+    <w:lsdException w:name="List Table 3 Accent 6" w:uiPriority="48"/>
+    <w:lsdException w:name="List Table 4 Accent 6" w:uiPriority="49"/>
+    <w:lsdException w:name="List Table 5 Dark Accent 6" w:uiPriority="50"/>
+    <w:lsdException w:name="List Table 6 Colorful Accent 6" w:uiPriority="51"/>
+    <w:lsdException w:name="List Table 7 Colorful Accent 6" w:uiPriority="52"/>
+    <w:lsdException w:name="Mention" w:semiHidden="1" w:unhideWhenUsed="1"/>
+    <w:lsdException w:name="Smart Hyperlink" w:semiHidden="1" w:unhideWhenUsed="1"/>
+    <w:lsdException w:name="Hashtag" w:semiHidden="1" w:unhideWhenUsed="1"/>
+    <w:lsdException w:name="Unresolved Mention" w:semiHidden="1" w:unhideWhenUsed="1"/>
+    <w:lsdException w:name="Smart Link" w:semiHidden="1" w:unhideWhenUsed="1"/>
   </w:latentStyles>
   <w:style w:type="paragraph" w:default="1" w:styleId="Normal">
     <w:name w:val="Normal"/>
@@ -18373,7 +20454,6 @@
     <w:uiPriority w:val="99"/>
     <w:semiHidden/>
     <w:unhideWhenUsed/>
-    <w:qFormat/>
     <w:tblPr>
       <w:tblInd w:w="0" w:type="dxa"/>
       <w:tblCellMar>
@@ -18585,7 +20665,6 @@
     <w:uiPriority w:val="59"/>
     <w:rsid w:val="00085B87"/>
     <w:tblPr>
-      <w:tblInd w:w="0" w:type="dxa"/>
       <w:tblBorders>
         <w:top w:val="single" w:sz="4" w:space="0" w:color="000000" w:themeColor="text1"/>
         <w:left w:val="single" w:sz="4" w:space="0" w:color="000000" w:themeColor="text1"/>
@@ -18594,12 +20673,6 @@
         <w:insideH w:val="single" w:sz="4" w:space="0" w:color="000000" w:themeColor="text1"/>
         <w:insideV w:val="single" w:sz="4" w:space="0" w:color="000000" w:themeColor="text1"/>
       </w:tblBorders>
-      <w:tblCellMar>
-        <w:top w:w="0" w:type="dxa"/>
-        <w:left w:w="108" w:type="dxa"/>
-        <w:bottom w:w="0" w:type="dxa"/>
-        <w:right w:w="108" w:type="dxa"/>
-      </w:tblCellMar>
     </w:tblPr>
   </w:style>
   <w:style w:type="character" w:styleId="FollowedHyperlink">
@@ -19508,7 +21581,7 @@
 </file>
 
 <file path=customXml/itemProps1.xml><?xml version="1.0" encoding="utf-8"?>
-<ds:datastoreItem xmlns:ds="http://schemas.openxmlformats.org/officeDocument/2006/customXml" ds:itemID="{4C2EDC22-BD3F-47C0-91C1-1988758DD431}">
+<ds:datastoreItem xmlns:ds="http://schemas.openxmlformats.org/officeDocument/2006/customXml" ds:itemID="{05D7F7C0-0F7E-426C-9F48-1D486A572380}">
   <ds:schemaRefs>
     <ds:schemaRef ds:uri="http://schemas.openxmlformats.org/officeDocument/2006/bibliography"/>
   </ds:schemaRefs>

</xml_diff>